<commit_message>
Revise HSE Manual: add org-chart figures, strip ISO references, add HSE ratio tables
- Embedded two DAN-branded org charts: Figure 1 corporate organisation
  (CEO -> CDO [Chief Development Officer] -> Delivery Director -> HSSE Manager)
  and Figure 2 project structure (DAN [Employer/Client] -> PMC -> Contractor).
- Realigned Clause 5.3 role model to DAN(Employer) -> PMC -> Contractor to match the
  project structure, with DAN's corporate line led by the HSSE Manager.
- Removed explicit ISO 14001/45001 references throughout (clause substance retained,
  consistent with the HSE Policy treatment).
- Added the HSE-officer coverage/ratio table (1:50 with Saudi 30/50/70% phasing and
  professional/practitioner split) and the HSE personnel qualification/experience table.

Co-Authored-By: Claude Opus 4.8 <noreply@anthropic.com>
Claude-Session: https://claude.ai/code/session_01Gkd3K8tDngLcQLDrM4dcJc
</commit_message>
<xml_diff>
--- a/New HSSE Management System 2026/00-Governance/01-DAN-MAN-HSE-000001__Jun_2026_REV01_Construction_HSE_Management_System_Manual.docx
+++ b/New HSSE Management System 2026/00-Governance/01-DAN-MAN-HSE-000001__Jun_2026_REV01_Construction_HSE_Management_System_Manual.docx
@@ -976,7 +976,7 @@
           <w:sz w:val="20"/>
           <w:szCs w:val="20"/>
         </w:rPr>
-        <w:t xml:space="preserve">DAN Company is a Saudi construction contracting organisation delivering building and infrastructure projects across the Kingdom in support of Vision 2030. DAN executes projects through their full life cycle — from mobilisation and construction through to commissioning and handover — managing its own workforce together with its contractors, subcontractors, suppliers and service providers, and interfacing with its Clients, Consultants and the relevant authorities.</w:t>
+        <w:t xml:space="preserve">DAN Company delivers building and infrastructure projects across the Kingdom in support of Vision 2030. DAN manages the delivery of its projects through their full life cycle — from planning and procurement through construction to commissioning and handover — directing delivery through a Project Management Consultant (PMC) and its appointed contractors and subcontractors, and engaging suppliers, service providers and the relevant authorities.</w:t>
       </w:r>
     </w:p>
     <w:p>
@@ -1477,7 +1477,7 @@
           <w:sz w:val="20"/>
           <w:szCs w:val="20"/>
         </w:rPr>
-        <w:t xml:space="preserve">The HSE Management System and all related policies, procedures and plans have been developed in consideration of DAN's organisational context (Clause 4.1) and the needs and expectations of internal and external interested parties (Clause 4.2). The system is based on the framework of the international standards for occupational health and safety (ISO 45001:2018) and environmental management (ISO 14001:2015).</w:t>
+        <w:t xml:space="preserve">The HSE Management System and all related policies, procedures and plans have been developed in consideration of DAN's organisational context (Clause 4.1) and the needs and expectations of internal and external interested parties (Clause 4.2). The system follows the internationally recognised high-level management-system framework for occupational health and safety and environmental management, applying the structure of context, leadership, planning, support, operation, performance evaluation and improvement.</w:t>
       </w:r>
     </w:p>
     <w:p>
@@ -1872,6 +1872,126 @@
                 <w:sz w:val="18"/>
                 <w:szCs w:val="18"/>
               </w:rPr>
+              <w:t xml:space="preserve">CEO / CDO</w:t>
+            </w:r>
+          </w:p>
+        </w:tc>
+        <w:tc>
+          <w:tcPr>
+            <w:tcW w:type="dxa" w:w="7160"/>
+            <w:tcBorders>
+              <w:top w:val="single" w:color="BFB3AA" w:sz="4"/>
+              <w:left w:val="single" w:color="BFB3AA" w:sz="4"/>
+              <w:bottom w:val="single" w:color="BFB3AA" w:sz="4"/>
+              <w:right w:val="single" w:color="BFB3AA" w:sz="4"/>
+            </w:tcBorders>
+            <w:tcMar>
+              <w:top w:type="dxa" w:w="60"/>
+              <w:left w:type="dxa" w:w="120"/>
+              <w:bottom w:type="dxa" w:w="60"/>
+              <w:right w:type="dxa" w:w="120"/>
+            </w:tcMar>
+            <w:vAlign w:val="center"/>
+          </w:tcPr>
+          <w:p>
+            <w:r>
+              <w:rPr>
+                <w:rFonts w:ascii="Tahoma" w:cs="Tahoma" w:eastAsia="Tahoma" w:hAnsi="Tahoma"/>
+                <w:color w:val="222222"/>
+                <w:sz w:val="18"/>
+                <w:szCs w:val="18"/>
+              </w:rPr>
+              <w:t xml:space="preserve">Chief Executive Officer / Chief Development Officer</w:t>
+            </w:r>
+          </w:p>
+        </w:tc>
+      </w:tr>
+      <w:tr>
+        <w:tc>
+          <w:tcPr>
+            <w:tcW w:type="dxa" w:w="2200"/>
+            <w:tcBorders>
+              <w:top w:val="single" w:color="BFB3AA" w:sz="4"/>
+              <w:left w:val="single" w:color="BFB3AA" w:sz="4"/>
+              <w:bottom w:val="single" w:color="BFB3AA" w:sz="4"/>
+              <w:right w:val="single" w:color="BFB3AA" w:sz="4"/>
+            </w:tcBorders>
+            <w:tcMar>
+              <w:top w:type="dxa" w:w="60"/>
+              <w:left w:type="dxa" w:w="120"/>
+              <w:bottom w:type="dxa" w:w="60"/>
+              <w:right w:type="dxa" w:w="120"/>
+            </w:tcMar>
+            <w:vAlign w:val="center"/>
+          </w:tcPr>
+          <w:p>
+            <w:r>
+              <w:rPr>
+                <w:rFonts w:ascii="Tahoma" w:cs="Tahoma" w:eastAsia="Tahoma" w:hAnsi="Tahoma"/>
+                <w:color w:val="222222"/>
+                <w:sz w:val="18"/>
+                <w:szCs w:val="18"/>
+              </w:rPr>
+              <w:t xml:space="preserve">PMC</w:t>
+            </w:r>
+          </w:p>
+        </w:tc>
+        <w:tc>
+          <w:tcPr>
+            <w:tcW w:type="dxa" w:w="7160"/>
+            <w:tcBorders>
+              <w:top w:val="single" w:color="BFB3AA" w:sz="4"/>
+              <w:left w:val="single" w:color="BFB3AA" w:sz="4"/>
+              <w:bottom w:val="single" w:color="BFB3AA" w:sz="4"/>
+              <w:right w:val="single" w:color="BFB3AA" w:sz="4"/>
+            </w:tcBorders>
+            <w:tcMar>
+              <w:top w:type="dxa" w:w="60"/>
+              <w:left w:type="dxa" w:w="120"/>
+              <w:bottom w:type="dxa" w:w="60"/>
+              <w:right w:type="dxa" w:w="120"/>
+            </w:tcMar>
+            <w:vAlign w:val="center"/>
+          </w:tcPr>
+          <w:p>
+            <w:r>
+              <w:rPr>
+                <w:rFonts w:ascii="Tahoma" w:cs="Tahoma" w:eastAsia="Tahoma" w:hAnsi="Tahoma"/>
+                <w:color w:val="222222"/>
+                <w:sz w:val="18"/>
+                <w:szCs w:val="18"/>
+              </w:rPr>
+              <w:t xml:space="preserve">Project Management Consultant</w:t>
+            </w:r>
+          </w:p>
+        </w:tc>
+      </w:tr>
+      <w:tr>
+        <w:tc>
+          <w:tcPr>
+            <w:tcW w:type="dxa" w:w="2200"/>
+            <w:tcBorders>
+              <w:top w:val="single" w:color="BFB3AA" w:sz="4"/>
+              <w:left w:val="single" w:color="BFB3AA" w:sz="4"/>
+              <w:bottom w:val="single" w:color="BFB3AA" w:sz="4"/>
+              <w:right w:val="single" w:color="BFB3AA" w:sz="4"/>
+            </w:tcBorders>
+            <w:tcMar>
+              <w:top w:type="dxa" w:w="60"/>
+              <w:left w:type="dxa" w:w="120"/>
+              <w:bottom w:type="dxa" w:w="60"/>
+              <w:right w:type="dxa" w:w="120"/>
+            </w:tcMar>
+            <w:vAlign w:val="center"/>
+          </w:tcPr>
+          <w:p>
+            <w:r>
+              <w:rPr>
+                <w:rFonts w:ascii="Tahoma" w:cs="Tahoma" w:eastAsia="Tahoma" w:hAnsi="Tahoma"/>
+                <w:color w:val="222222"/>
+                <w:sz w:val="18"/>
+                <w:szCs w:val="18"/>
+              </w:rPr>
               <w:t xml:space="preserve">AHA</w:t>
             </w:r>
           </w:p>
@@ -3806,7 +3926,7 @@
           <w:sz w:val="20"/>
           <w:szCs w:val="20"/>
         </w:rPr>
-        <w:t xml:space="preserve">Client, community and societal expectations, and international good practice (ILO, OSHA, ISO).</w:t>
+        <w:t xml:space="preserve">Client, community and societal expectations, and international good practice.</w:t>
       </w:r>
     </w:p>
     <w:p>
@@ -4002,7 +4122,7 @@
                 <w:sz w:val="18"/>
                 <w:szCs w:val="18"/>
               </w:rPr>
-              <w:t xml:space="preserve">Client / Consultant</w:t>
+              <w:t xml:space="preserve">PMC / Consultant</w:t>
             </w:r>
           </w:p>
         </w:tc>
@@ -4553,7 +4673,211 @@
           <w:sz w:val="20"/>
           <w:szCs w:val="20"/>
         </w:rPr>
-        <w:t xml:space="preserve">5.3.1  DAN Top Management</w:t>
+        <w:t xml:space="preserve">5.3.1  DAN Corporate Organisation</w:t>
+      </w:r>
+    </w:p>
+    <w:p>
+      <w:pPr>
+        <w:spacing w:after="120" w:line="276"/>
+        <w:jc w:val="both"/>
+      </w:pPr>
+      <w:r>
+        <w:rPr>
+          <w:rFonts w:ascii="Tahoma" w:cs="Tahoma" w:eastAsia="Tahoma" w:hAnsi="Tahoma"/>
+          <w:sz w:val="20"/>
+          <w:szCs w:val="20"/>
+        </w:rPr>
+        <w:t xml:space="preserve">DAN's corporate HSE governance runs from the Chief Executive Officer (CEO) through the Chief Development Officer (CDO) and the Delivery Director to the HSSE Manager, who leads the DAN HSE function. This line ensures that HSE accountability and direction flow from the top of the organisation down to project delivery.</w:t>
+      </w:r>
+    </w:p>
+    <w:p>
+      <w:pPr>
+        <w:keepNext/>
+        <w:spacing w:after="40" w:before="140"/>
+        <w:jc w:val="center"/>
+      </w:pPr>
+      <w:r>
+        <w:drawing>
+          <wp:inline distT="0" distB="0" distL="0" distR="0">
+            <wp:extent cx="4095750" cy="3924300"/>
+            <wp:effectExtent t="0" r="0" b="0" l="0"/>
+            <wp:docPr id="1" name="Figure 1  DAN Corporate Organisation Chart" descr="Figure 1  DAN Corporate Organisation Chart" title="Figure 1  DAN Corporate Organisation Chart"/>
+            <wp:cNvGraphicFramePr>
+              <a:graphicFrameLocks xmlns:a="http://schemas.openxmlformats.org/drawingml/2006/main" noChangeAspect="1"/>
+            </wp:cNvGraphicFramePr>
+            <a:graphic xmlns:a="http://schemas.openxmlformats.org/drawingml/2006/main">
+              <a:graphicData uri="http://schemas.openxmlformats.org/drawingml/2006/picture">
+                <pic:pic xmlns:pic="http://schemas.openxmlformats.org/drawingml/2006/picture">
+                  <pic:nvPicPr>
+                    <pic:cNvPr id="0" name="" descr=""/>
+                    <pic:cNvPicPr>
+                      <a:picLocks noChangeAspect="1" noChangeArrowheads="1"/>
+                    </pic:cNvPicPr>
+                  </pic:nvPicPr>
+                  <pic:blipFill>
+                    <a:blip r:embed="rId10" cstate="none"/>
+                    <a:srcRect/>
+                    <a:stretch>
+                      <a:fillRect/>
+                    </a:stretch>
+                  </pic:blipFill>
+                  <pic:spPr bwMode="auto">
+                    <a:xfrm>
+                      <a:off x="0" y="0"/>
+                      <a:ext cx="4095750" cy="3924300"/>
+                    </a:xfrm>
+                    <a:prstGeom prst="rect">
+                      <a:avLst/>
+                    </a:prstGeom>
+                  </pic:spPr>
+                </pic:pic>
+              </a:graphicData>
+            </a:graphic>
+          </wp:inline>
+        </w:drawing>
+      </w:r>
+    </w:p>
+    <w:p>
+      <w:pPr>
+        <w:spacing w:after="180"/>
+        <w:jc w:val="center"/>
+      </w:pPr>
+      <w:r>
+        <w:rPr>
+          <w:rFonts w:ascii="Tahoma" w:cs="Tahoma" w:eastAsia="Tahoma" w:hAnsi="Tahoma"/>
+          <w:i/>
+          <w:iCs/>
+          <w:color w:val="542A12"/>
+          <w:sz w:val="16"/>
+          <w:szCs w:val="16"/>
+        </w:rPr>
+        <w:t xml:space="preserve">Figure 1  DAN Corporate Organisation Chart</w:t>
+      </w:r>
+    </w:p>
+    <w:p>
+      <w:pPr>
+        <w:keepNext/>
+        <w:spacing w:after="80" w:before="160"/>
+      </w:pPr>
+      <w:r>
+        <w:rPr>
+          <w:rFonts w:ascii="Tahoma" w:cs="Tahoma" w:eastAsia="Tahoma" w:hAnsi="Tahoma"/>
+          <w:b/>
+          <w:bCs/>
+          <w:color w:val="B5692B"/>
+          <w:sz w:val="20"/>
+          <w:szCs w:val="20"/>
+        </w:rPr>
+        <w:t xml:space="preserve">5.3.2  Project Structure</w:t>
+      </w:r>
+    </w:p>
+    <w:p>
+      <w:pPr>
+        <w:spacing w:after="120" w:line="276"/>
+        <w:jc w:val="both"/>
+      </w:pPr>
+      <w:r>
+        <w:rPr>
+          <w:rFonts w:ascii="Tahoma" w:cs="Tahoma" w:eastAsia="Tahoma" w:hAnsi="Tahoma"/>
+          <w:sz w:val="20"/>
+          <w:szCs w:val="20"/>
+        </w:rPr>
+        <w:t xml:space="preserve">On each project, DAN (as Employer / Client) directs delivery through a Project Management Consultant (PMC), who manages and supervises the Contractor — and its subcontractors — executing the works. Each tier implements and is accountable for the DAN HSE Management System within its scope.</w:t>
+      </w:r>
+    </w:p>
+    <w:p>
+      <w:pPr>
+        <w:keepNext/>
+        <w:spacing w:after="40" w:before="140"/>
+        <w:jc w:val="center"/>
+      </w:pPr>
+      <w:r>
+        <w:drawing>
+          <wp:inline distT="0" distB="0" distL="0" distR="0">
+            <wp:extent cx="4095750" cy="2943225"/>
+            <wp:effectExtent t="0" r="0" b="0" l="0"/>
+            <wp:docPr id="1" name="Figure 2  Project Structure" descr="Figure 2  Project Structure" title="Figure 2  Project Structure"/>
+            <wp:cNvGraphicFramePr>
+              <a:graphicFrameLocks xmlns:a="http://schemas.openxmlformats.org/drawingml/2006/main" noChangeAspect="1"/>
+            </wp:cNvGraphicFramePr>
+            <a:graphic xmlns:a="http://schemas.openxmlformats.org/drawingml/2006/main">
+              <a:graphicData uri="http://schemas.openxmlformats.org/drawingml/2006/picture">
+                <pic:pic xmlns:pic="http://schemas.openxmlformats.org/drawingml/2006/picture">
+                  <pic:nvPicPr>
+                    <pic:cNvPr id="0" name="" descr=""/>
+                    <pic:cNvPicPr>
+                      <a:picLocks noChangeAspect="1" noChangeArrowheads="1"/>
+                    </pic:cNvPicPr>
+                  </pic:nvPicPr>
+                  <pic:blipFill>
+                    <a:blip r:embed="rId11" cstate="none"/>
+                    <a:srcRect/>
+                    <a:stretch>
+                      <a:fillRect/>
+                    </a:stretch>
+                  </pic:blipFill>
+                  <pic:spPr bwMode="auto">
+                    <a:xfrm>
+                      <a:off x="0" y="0"/>
+                      <a:ext cx="4095750" cy="2943225"/>
+                    </a:xfrm>
+                    <a:prstGeom prst="rect">
+                      <a:avLst/>
+                    </a:prstGeom>
+                  </pic:spPr>
+                </pic:pic>
+              </a:graphicData>
+            </a:graphic>
+          </wp:inline>
+        </w:drawing>
+      </w:r>
+    </w:p>
+    <w:p>
+      <w:pPr>
+        <w:spacing w:after="180"/>
+        <w:jc w:val="center"/>
+      </w:pPr>
+      <w:r>
+        <w:rPr>
+          <w:rFonts w:ascii="Tahoma" w:cs="Tahoma" w:eastAsia="Tahoma" w:hAnsi="Tahoma"/>
+          <w:i/>
+          <w:iCs/>
+          <w:color w:val="542A12"/>
+          <w:sz w:val="16"/>
+          <w:szCs w:val="16"/>
+        </w:rPr>
+        <w:t xml:space="preserve">Figure 2  Project Structure</w:t>
+      </w:r>
+    </w:p>
+    <w:p>
+      <w:pPr>
+        <w:keepNext/>
+        <w:spacing w:after="80" w:before="160"/>
+      </w:pPr>
+      <w:r>
+        <w:rPr>
+          <w:rFonts w:ascii="Tahoma" w:cs="Tahoma" w:eastAsia="Tahoma" w:hAnsi="Tahoma"/>
+          <w:b/>
+          <w:bCs/>
+          <w:color w:val="B5692B"/>
+          <w:sz w:val="20"/>
+          <w:szCs w:val="20"/>
+        </w:rPr>
+        <w:t xml:space="preserve">5.3.3  DAN (Employer / Client)</w:t>
+      </w:r>
+    </w:p>
+    <w:p>
+      <w:pPr>
+        <w:spacing w:after="120" w:line="276"/>
+        <w:jc w:val="both"/>
+      </w:pPr>
+      <w:r>
+        <w:rPr>
+          <w:rFonts w:ascii="Tahoma" w:cs="Tahoma" w:eastAsia="Tahoma" w:hAnsi="Tahoma"/>
+          <w:sz w:val="20"/>
+          <w:szCs w:val="20"/>
+        </w:rPr>
+        <w:t xml:space="preserve">DAN, led by the HSSE Manager under the Delivery Director, holds overarching responsibility for HSE across its projects and shall:</w:t>
       </w:r>
     </w:p>
     <w:p>
@@ -4572,7 +4896,7 @@
           <w:sz w:val="20"/>
           <w:szCs w:val="20"/>
         </w:rPr>
-        <w:t xml:space="preserve">Set the programme-wide HSE Management System, Policy and procedures and provide leadership, direction and resources for their implementation.</w:t>
+        <w:t xml:space="preserve">Set the programme-wide HSE Management System, Policy, procedures and minimum requirements, and provide leadership, direction and resources for their implementation.</w:t>
       </w:r>
     </w:p>
     <w:p>
@@ -4591,7 +4915,7 @@
           <w:sz w:val="20"/>
           <w:szCs w:val="20"/>
         </w:rPr>
-        <w:t xml:space="preserve">Oversee full compliance with applicable national and international HSE legal requirements.</w:t>
+        <w:t xml:space="preserve">Oversee full compliance of all parties with applicable national and international HSE legal requirements.</w:t>
       </w:r>
     </w:p>
     <w:p>
@@ -4610,7 +4934,7 @@
           <w:sz w:val="20"/>
           <w:szCs w:val="20"/>
         </w:rPr>
-        <w:t xml:space="preserve">Ensure the provision of sufficient, competent and medically fit resources for safe delivery.</w:t>
+        <w:t xml:space="preserve">Ensure the provision of sufficient, competent and medically fit resources for safe delivery, and appoint a PMC, contractors, designers and suppliers with the capability to deliver safely.</w:t>
       </w:r>
     </w:p>
     <w:p>
@@ -4629,7 +4953,7 @@
           <w:sz w:val="20"/>
           <w:szCs w:val="20"/>
         </w:rPr>
-        <w:t xml:space="preserve">Appoint designers, consultants, contractors and suppliers with the skills and capability to deliver safely.</w:t>
+        <w:t xml:space="preserve">Maintain and assure the HSE Management System through monitoring, inspection and audit, and drive corrective action and continual improvement.</w:t>
       </w:r>
     </w:p>
     <w:p>
@@ -4648,24 +4972,7 @@
           <w:sz w:val="20"/>
           <w:szCs w:val="20"/>
         </w:rPr>
-        <w:t xml:space="preserve">Oversee and assure the proper reporting, investigation and close-out of incidents to prevent recurrence.</w:t>
-      </w:r>
-    </w:p>
-    <w:p>
-      <w:pPr>
-        <w:keepNext/>
-        <w:spacing w:after="80" w:before="160"/>
-      </w:pPr>
-      <w:r>
-        <w:rPr>
-          <w:rFonts w:ascii="Tahoma" w:cs="Tahoma" w:eastAsia="Tahoma" w:hAnsi="Tahoma"/>
-          <w:b/>
-          <w:bCs/>
-          <w:color w:val="B5692B"/>
-          <w:sz w:val="20"/>
-          <w:szCs w:val="20"/>
-        </w:rPr>
-        <w:t xml:space="preserve">5.3.2  DAN HSE Department (SH&amp;E Representatives)</w:t>
+        <w:t xml:space="preserve">Review and approve project HSE plans and key submissions, and oversee the proper reporting, investigation and close-out of incidents to prevent recurrence.</w:t>
       </w:r>
     </w:p>
     <w:p>
@@ -4684,7 +4991,38 @@
           <w:sz w:val="20"/>
           <w:szCs w:val="20"/>
         </w:rPr>
-        <w:t xml:space="preserve">Develop, maintain and assure the HSE Management System, procedures and minimum requirements, and advise the business and projects on their application.</w:t>
+        <w:t xml:space="preserve">Suspend or stop work, at its discretion, where there is a serious or imminent threat to people, property or the environment.</w:t>
+      </w:r>
+    </w:p>
+    <w:p>
+      <w:pPr>
+        <w:keepNext/>
+        <w:spacing w:after="80" w:before="160"/>
+      </w:pPr>
+      <w:r>
+        <w:rPr>
+          <w:rFonts w:ascii="Tahoma" w:cs="Tahoma" w:eastAsia="Tahoma" w:hAnsi="Tahoma"/>
+          <w:b/>
+          <w:bCs/>
+          <w:color w:val="B5692B"/>
+          <w:sz w:val="20"/>
+          <w:szCs w:val="20"/>
+        </w:rPr>
+        <w:t xml:space="preserve">5.3.4  Project Management Consultant (PMC)</w:t>
+      </w:r>
+    </w:p>
+    <w:p>
+      <w:pPr>
+        <w:spacing w:after="120" w:line="276"/>
+        <w:jc w:val="both"/>
+      </w:pPr>
+      <w:r>
+        <w:rPr>
+          <w:rFonts w:ascii="Tahoma" w:cs="Tahoma" w:eastAsia="Tahoma" w:hAnsi="Tahoma"/>
+          <w:sz w:val="20"/>
+          <w:szCs w:val="20"/>
+        </w:rPr>
+        <w:t xml:space="preserve">The PMC manages and supervises delivery on DAN's behalf, adopting a zero-harm philosophy and providing HSE coverage of site activities at all times (day/night shifts and holidays). The PMC shall:</w:t>
       </w:r>
     </w:p>
     <w:p>
@@ -4703,7 +5041,7 @@
           <w:sz w:val="20"/>
           <w:szCs w:val="20"/>
         </w:rPr>
-        <w:t xml:space="preserve">Lead hazard identification, risk assessment, environmental aspects/impacts and the determination of legal and other requirements.</w:t>
+        <w:t xml:space="preserve">Develop project/programme-specific HSE plans in line with the DAN HSE Management System and contractual obligations, subject to DAN approval.</w:t>
       </w:r>
     </w:p>
     <w:p>
@@ -4722,7 +5060,7 @@
           <w:sz w:val="20"/>
           <w:szCs w:val="20"/>
         </w:rPr>
-        <w:t xml:space="preserve">Provide at least one competent HSE representative per project, scaled to project size and risk (see Clause 7.2).</w:t>
+        <w:t xml:space="preserve">Ensure that the DAN HSE Management System — Manual, procedures and minimum requirements — and all applicable Saudi laws and regulations are followed by all parties on site.</w:t>
       </w:r>
     </w:p>
     <w:p>
@@ -4741,7 +5079,7 @@
           <w:sz w:val="20"/>
           <w:szCs w:val="20"/>
         </w:rPr>
-        <w:t xml:space="preserve">Monitor and measure HSE performance, conduct inspections and audits, and drive corrective action and continual improvement.</w:t>
+        <w:t xml:space="preserve">Review and approve the Contractor's RAMS, plans, permits, equipment certification and other HSE submissions, and ensure design risk information is communicated and managed.</w:t>
       </w:r>
     </w:p>
     <w:p>
@@ -4760,7 +5098,7 @@
           <w:sz w:val="20"/>
           <w:szCs w:val="20"/>
         </w:rPr>
-        <w:t xml:space="preserve">Review and approve project HSE plans, RAMS, permits, equipment certification and contractor HSE submissions.</w:t>
+        <w:t xml:space="preserve">Establish and verify contractor competence and the allocation of adequate, competent HSE resources through formal interviews in line with DAN competency requirements.</w:t>
       </w:r>
     </w:p>
     <w:p>
@@ -4779,24 +5117,7 @@
           <w:sz w:val="20"/>
           <w:szCs w:val="20"/>
         </w:rPr>
-        <w:t xml:space="preserve">Suspend or stop work where there is a serious or imminent threat to people, property or the environment.</w:t>
-      </w:r>
-    </w:p>
-    <w:p>
-      <w:pPr>
-        <w:keepNext/>
-        <w:spacing w:after="80" w:before="160"/>
-      </w:pPr>
-      <w:r>
-        <w:rPr>
-          <w:rFonts w:ascii="Tahoma" w:cs="Tahoma" w:eastAsia="Tahoma" w:hAnsi="Tahoma"/>
-          <w:b/>
-          <w:bCs/>
-          <w:color w:val="B5692B"/>
-          <w:sz w:val="20"/>
-          <w:szCs w:val="20"/>
-        </w:rPr>
-        <w:t xml:space="preserve">5.3.3  Project Manager and Project Team</w:t>
+        <w:t xml:space="preserve">Monitor, supervise and measure contractor HSE performance; conduct inspections, audits and meetings; and report performance, KPIs and statistics to DAN.</w:t>
       </w:r>
     </w:p>
     <w:p>
@@ -4815,7 +5136,7 @@
           <w:sz w:val="20"/>
           <w:szCs w:val="20"/>
         </w:rPr>
-        <w:t xml:space="preserve">Implement and comply with the HSE Management System on the project, allocate resources and hold the line organisation accountable for HSE.</w:t>
+        <w:t xml:space="preserve">Ensure all reportable incidents are reported, thoroughly investigated and closed out per the DAN procedure and KSA legal requirements, and share lessons learned.</w:t>
       </w:r>
     </w:p>
     <w:p>
@@ -4834,7 +5155,7 @@
           <w:sz w:val="20"/>
           <w:szCs w:val="20"/>
         </w:rPr>
-        <w:t xml:space="preserve">Develop and maintain the Project-specific HSE Plan, risk register and environmental aspects register, and ensure RAMS/AHAs are prepared, reviewed and approved before work starts.</w:t>
+        <w:t xml:space="preserve">Issue DAN-approved HSE enforcement notices and, in the event of a serious violation or imminent danger, suspend or stop the works until satisfactory corrective action is taken.</w:t>
       </w:r>
     </w:p>
     <w:p>
@@ -4853,7 +5174,38 @@
           <w:sz w:val="20"/>
           <w:szCs w:val="20"/>
         </w:rPr>
-        <w:t xml:space="preserve">Plan, coordinate and supervise construction so as to prevent or minimise risks to people and impacts to the environment.</w:t>
+        <w:t xml:space="preserve">Lead and record HSE campaigns and recognition, and ensure project HSE documentation is current.</w:t>
+      </w:r>
+    </w:p>
+    <w:p>
+      <w:pPr>
+        <w:keepNext/>
+        <w:spacing w:after="80" w:before="160"/>
+      </w:pPr>
+      <w:r>
+        <w:rPr>
+          <w:rFonts w:ascii="Tahoma" w:cs="Tahoma" w:eastAsia="Tahoma" w:hAnsi="Tahoma"/>
+          <w:b/>
+          <w:bCs/>
+          <w:color w:val="B5692B"/>
+          <w:sz w:val="20"/>
+          <w:szCs w:val="20"/>
+        </w:rPr>
+        <w:t xml:space="preserve">5.3.5  Contractor and Subcontractors</w:t>
+      </w:r>
+    </w:p>
+    <w:p>
+      <w:pPr>
+        <w:spacing w:after="120" w:line="276"/>
+        <w:jc w:val="both"/>
+      </w:pPr>
+      <w:r>
+        <w:rPr>
+          <w:rFonts w:ascii="Tahoma" w:cs="Tahoma" w:eastAsia="Tahoma" w:hAnsi="Tahoma"/>
+          <w:sz w:val="20"/>
+          <w:szCs w:val="20"/>
+        </w:rPr>
+        <w:t xml:space="preserve">The Contractor, acting as an employer, is fully liable and responsible for the areas under its work authority in accordance with the DAN HSE Management System, the DCSM procedures, the Saudi Labor Law and HSE legislation, and contract obligations. The Contractor shall:</w:t>
       </w:r>
     </w:p>
     <w:p>
@@ -4872,7 +5224,7 @@
           <w:sz w:val="20"/>
           <w:szCs w:val="20"/>
         </w:rPr>
-        <w:t xml:space="preserve">Conduct daily briefings/tool-box talks, ensure competent supervision of critical activities, and chair project HSE meetings.</w:t>
+        <w:t xml:space="preserve">Develop and implement the project HSE plan, proactive monitoring programme (inspections, audits, fire drills, meetings), risk register, environmental aspects register and training/competency matrix, submitted for approval.</w:t>
       </w:r>
     </w:p>
     <w:p>
@@ -4891,24 +5243,7 @@
           <w:sz w:val="20"/>
           <w:szCs w:val="20"/>
         </w:rPr>
-        <w:t xml:space="preserve">Ensure emergency arrangements, welfare facilities and site security are provided and maintained.</w:t>
-      </w:r>
-    </w:p>
-    <w:p>
-      <w:pPr>
-        <w:keepNext/>
-        <w:spacing w:after="80" w:before="160"/>
-      </w:pPr>
-      <w:r>
-        <w:rPr>
-          <w:rFonts w:ascii="Tahoma" w:cs="Tahoma" w:eastAsia="Tahoma" w:hAnsi="Tahoma"/>
-          <w:b/>
-          <w:bCs/>
-          <w:color w:val="B5692B"/>
-          <w:sz w:val="20"/>
-          <w:szCs w:val="20"/>
-        </w:rPr>
-        <w:t xml:space="preserve">5.3.4  Contractors and Subcontractors</w:t>
+        <w:t xml:space="preserve">Provide adequate numbers of competent, interviewed HSE staff in line with the required ratios (Clause 7.2), and competent supervisors for critical works (scaffolding/formwork, cranes and lifting, excavations, electrical, confined space, hot work).</w:t>
       </w:r>
     </w:p>
     <w:p>
@@ -4927,7 +5262,7 @@
           <w:sz w:val="20"/>
           <w:szCs w:val="20"/>
         </w:rPr>
-        <w:t xml:space="preserve">Comply with the DAN HSE Management System, the DCSM procedures and minimum requirements, and all applicable KSA legal requirements; a contractor acting as an employer remains fully liable for the areas under its work authority.</w:t>
+        <w:t xml:space="preserve">Ensure all persons are inducted and medically fit, and wear the minimum PPE (hard hat, safety footwear, eye protection, high-visibility clothing and, where required, face covering); PPE and health surveillance are determined by task-based risk assessment.</w:t>
       </w:r>
     </w:p>
     <w:p>
@@ -4946,7 +5281,7 @@
           <w:sz w:val="20"/>
           <w:szCs w:val="20"/>
         </w:rPr>
-        <w:t xml:space="preserve">Provide adequate numbers of competent, interviewed HSE staff in line with the required ratios (Clause 7.2), and competent supervisors for critical works (scaffolding/formwork, cranes and lifting, excavations, electrical, confined space, hot work).</w:t>
+        <w:t xml:space="preserve">Ensure all plant, lifting equipment and tackle are certified by a SASO-approved third party, maintained, and operated by competent persons.</w:t>
       </w:r>
     </w:p>
     <w:p>
@@ -4965,7 +5300,7 @@
           <w:sz w:val="20"/>
           <w:szCs w:val="20"/>
         </w:rPr>
-        <w:t xml:space="preserve">Develop and implement the project HSE plan, proactive monitoring programme (inspections, audits, drills), risk register, environmental aspects register and training matrix.</w:t>
+        <w:t xml:space="preserve">Report, investigate and record incidents per the DAN procedure and authorities' requirements; monitor and manage subcontractor compliance; and provide HSE reports and statistics.</w:t>
       </w:r>
     </w:p>
     <w:p>
@@ -4984,7 +5319,7 @@
           <w:sz w:val="20"/>
           <w:szCs w:val="20"/>
         </w:rPr>
-        <w:t xml:space="preserve">Ensure all persons are inducted and medically fit, wear the minimum PPE (hard hat, safety footwear, eye protection, high-visibility clothing and, where required, face covering), and that PPE and health surveillance are determined by task-based risk assessment.</w:t>
+        <w:t xml:space="preserve">Provide and maintain compliant worker welfare facilities and accommodation, promote worker well-being (including mental health), and maintain site security so that only authorised persons and vehicles enter.</w:t>
       </w:r>
     </w:p>
     <w:p>
@@ -5003,7 +5338,297 @@
           <w:sz w:val="20"/>
           <w:szCs w:val="20"/>
         </w:rPr>
-        <w:t xml:space="preserve">Ensure all plant, lifting equipment and tackle are certified by a SASO-approved third party, maintained and operated by competent persons.</w:t>
+        <w:t xml:space="preserve">Suspend work at its own discretion where there is a threat to HSE compliance or to the safety of persons, property or the environment.</w:t>
+      </w:r>
+    </w:p>
+    <w:p>
+      <w:pPr>
+        <w:spacing w:after="120" w:before="80"/>
+      </w:pPr>
+      <w:r>
+        <w:rPr>
+          <w:rFonts w:ascii="Tahoma" w:cs="Tahoma" w:eastAsia="Tahoma" w:hAnsi="Tahoma"/>
+          <w:b/>
+          <w:bCs/>
+          <w:color w:val="542A12"/>
+          <w:sz w:val="18"/>
+          <w:szCs w:val="18"/>
+        </w:rPr>
+        <w:t xml:space="preserve">Note:  </w:t>
+      </w:r>
+      <w:r>
+        <w:rPr>
+          <w:rFonts w:ascii="Tahoma" w:cs="Tahoma" w:eastAsia="Tahoma" w:hAnsi="Tahoma"/>
+          <w:color w:val="444444"/>
+          <w:sz w:val="18"/>
+          <w:szCs w:val="18"/>
+        </w:rPr>
+        <w:t xml:space="preserve">Where DAN delivers under an external Client/Consultant, or engages designers, DAN cooperates and coordinates so that design risk information, residual risks and the pre-construction information are communicated; designers apply the general principles of prevention and provide a Health and Safety File at handover.</w:t>
+      </w:r>
+    </w:p>
+    <w:p>
+      <w:pPr>
+        <w:pStyle w:val="Heading2"/>
+      </w:pPr>
+      <w:r>
+        <w:t xml:space="preserve">5.4  Consultation and Participation of Workers</w:t>
+      </w:r>
+    </w:p>
+    <w:p>
+      <w:pPr>
+        <w:spacing w:after="120" w:line="276"/>
+        <w:jc w:val="both"/>
+      </w:pPr>
+      <w:r>
+        <w:rPr>
+          <w:rFonts w:ascii="Tahoma" w:cs="Tahoma" w:eastAsia="Tahoma" w:hAnsi="Tahoma"/>
+          <w:sz w:val="20"/>
+          <w:szCs w:val="20"/>
+        </w:rPr>
+        <w:t xml:space="preserve">DAN consults and enables the participation of workers (and, where they exist, their representatives) at all applicable levels in the development, implementation, evaluation and improvement of the HSE Management System. Workers are involved in hazard identification, risk assessment, determining controls, incident investigation, and review of HSE performance. Consultation and participation are delivered through the HSE Committee, HSE meetings, tool-box talks, RAMS meetings and site briefings, and workers are given the time, training and information needed to participate without reprisal.</w:t>
+      </w:r>
+    </w:p>
+    <w:p>
+      <w:pPr>
+        <w:pStyle w:val="Heading2"/>
+      </w:pPr>
+      <w:r>
+        <w:t xml:space="preserve">5.5  Reward and Recognition</w:t>
+      </w:r>
+    </w:p>
+    <w:p>
+      <w:pPr>
+        <w:spacing w:after="120" w:line="276"/>
+        <w:jc w:val="both"/>
+      </w:pPr>
+      <w:r>
+        <w:rPr>
+          <w:rFonts w:ascii="Tahoma" w:cs="Tahoma" w:eastAsia="Tahoma" w:hAnsi="Tahoma"/>
+          <w:sz w:val="20"/>
+          <w:szCs w:val="20"/>
+        </w:rPr>
+        <w:t xml:space="preserve">Positive reinforcement motivates the workforce and drives a positive culture. DAN and its contractors operate a written HSE incentive/recognition scheme that recognises positive HSE behaviours at the individual and team level, focuses on leading indicators, and provides public recognition and awards for HSE excellence.</w:t>
+      </w:r>
+    </w:p>
+    <w:p>
+      <w:pPr>
+        <w:pStyle w:val="Heading1"/>
+      </w:pPr>
+      <w:r>
+        <w:t xml:space="preserve">6. Planning</w:t>
+      </w:r>
+    </w:p>
+    <w:p>
+      <w:pPr>
+        <w:pStyle w:val="Heading2"/>
+      </w:pPr>
+      <w:r>
+        <w:t xml:space="preserve">6.1  Actions to Address Risks and Opportunities</w:t>
+      </w:r>
+    </w:p>
+    <w:p>
+      <w:pPr>
+        <w:spacing w:after="120" w:line="276"/>
+        <w:jc w:val="both"/>
+      </w:pPr>
+      <w:r>
+        <w:rPr>
+          <w:rFonts w:ascii="Tahoma" w:cs="Tahoma" w:eastAsia="Tahoma" w:hAnsi="Tahoma"/>
+          <w:sz w:val="20"/>
+          <w:szCs w:val="20"/>
+        </w:rPr>
+        <w:t xml:space="preserve">In planning the HSE Management System, DAN determines the risks and opportunities arising from its context (4.1), interested parties (4.2) and scope, considering: hazards; HSE risks and other risks; HSE opportunities and other opportunities; and legal and other requirements. Risks, issues and controls are maintained in a Risk and Opportunities Register as documented information, and actions are integrated into the management system and monitored for effectiveness.</w:t>
+      </w:r>
+    </w:p>
+    <w:p>
+      <w:pPr>
+        <w:keepNext/>
+        <w:spacing w:after="80" w:before="160"/>
+      </w:pPr>
+      <w:r>
+        <w:rPr>
+          <w:rFonts w:ascii="Tahoma" w:cs="Tahoma" w:eastAsia="Tahoma" w:hAnsi="Tahoma"/>
+          <w:b/>
+          <w:bCs/>
+          <w:color w:val="B5692B"/>
+          <w:sz w:val="20"/>
+          <w:szCs w:val="20"/>
+        </w:rPr>
+        <w:t xml:space="preserve">6.1.1  Hazard Identification and Assessment of Risks</w:t>
+      </w:r>
+    </w:p>
+    <w:p>
+      <w:pPr>
+        <w:spacing w:after="120" w:line="276"/>
+        <w:jc w:val="both"/>
+      </w:pPr>
+      <w:r>
+        <w:rPr>
+          <w:rFonts w:ascii="Tahoma" w:cs="Tahoma" w:eastAsia="Tahoma" w:hAnsi="Tahoma"/>
+          <w:sz w:val="20"/>
+          <w:szCs w:val="20"/>
+        </w:rPr>
+        <w:t xml:space="preserve">DAN and its contractors establish, implement and maintain a process for the ongoing, proactive identification of hazards, taking account of: routine and non-routine activities; infrastructure, equipment, materials and substances; the physical conditions of the workplace; human factors and how work is done; design of work areas, processes and machinery; emergency situations; all people who may be affected (workers, contractors, visitors and the public); changes in the organisation, knowledge or information; past incidents; and how work is organised, including social and psychosocial factors such as workload, work hours, heat and leadership.</w:t>
+      </w:r>
+    </w:p>
+    <w:p>
+      <w:pPr>
+        <w:spacing w:after="120" w:line="276"/>
+        <w:jc w:val="both"/>
+      </w:pPr>
+      <w:r>
+        <w:rPr>
+          <w:rFonts w:ascii="Tahoma" w:cs="Tahoma" w:eastAsia="Tahoma" w:hAnsi="Tahoma"/>
+          <w:sz w:val="20"/>
+          <w:szCs w:val="20"/>
+        </w:rPr>
+        <w:t xml:space="preserve">HSE risks from the identified hazards are assessed against applicable legal and other requirements and the effectiveness of existing controls, using the methodology and criteria defined in the Risk Management and Activity Hazard Analysis procedures (DCSM — SH&amp;E Risk Management; Activity Hazard Analysis). The assessment is proactive, systematic and follows the hierarchy of controls, and the results are recorded in the project risk register and the RAMS.</w:t>
+      </w:r>
+    </w:p>
+    <w:p>
+      <w:pPr>
+        <w:keepNext/>
+        <w:spacing w:after="80" w:before="160"/>
+      </w:pPr>
+      <w:r>
+        <w:rPr>
+          <w:rFonts w:ascii="Tahoma" w:cs="Tahoma" w:eastAsia="Tahoma" w:hAnsi="Tahoma"/>
+          <w:b/>
+          <w:bCs/>
+          <w:color w:val="B5692B"/>
+          <w:sz w:val="20"/>
+          <w:szCs w:val="20"/>
+        </w:rPr>
+        <w:t xml:space="preserve">6.1.2  Psychosocial / Psychological Health and Safety</w:t>
+      </w:r>
+    </w:p>
+    <w:p>
+      <w:pPr>
+        <w:spacing w:after="120" w:line="276"/>
+        <w:jc w:val="both"/>
+      </w:pPr>
+      <w:r>
+        <w:rPr>
+          <w:rFonts w:ascii="Tahoma" w:cs="Tahoma" w:eastAsia="Tahoma" w:hAnsi="Tahoma"/>
+          <w:sz w:val="20"/>
+          <w:szCs w:val="20"/>
+        </w:rPr>
+        <w:t xml:space="preserve">DAN's responsibility for worker health includes protecting and promoting physical and psychological health and well-being. Psychosocial hazards — relating to how work is organised, social factors at work, and the work environment — are identified and managed consistently with other HSE risks, in line with recognised good practice on psychological health and safety at work, through the risk assessment process.</w:t>
+      </w:r>
+    </w:p>
+    <w:p>
+      <w:pPr>
+        <w:keepNext/>
+        <w:spacing w:after="80" w:before="160"/>
+      </w:pPr>
+      <w:r>
+        <w:rPr>
+          <w:rFonts w:ascii="Tahoma" w:cs="Tahoma" w:eastAsia="Tahoma" w:hAnsi="Tahoma"/>
+          <w:b/>
+          <w:bCs/>
+          <w:color w:val="B5692B"/>
+          <w:sz w:val="20"/>
+          <w:szCs w:val="20"/>
+        </w:rPr>
+        <w:t xml:space="preserve">6.1.3  Environmental Aspects and Impacts</w:t>
+      </w:r>
+    </w:p>
+    <w:p>
+      <w:pPr>
+        <w:spacing w:after="120" w:line="276"/>
+        <w:jc w:val="both"/>
+      </w:pPr>
+      <w:r>
+        <w:rPr>
+          <w:rFonts w:ascii="Tahoma" w:cs="Tahoma" w:eastAsia="Tahoma" w:hAnsi="Tahoma"/>
+          <w:sz w:val="20"/>
+          <w:szCs w:val="20"/>
+        </w:rPr>
+        <w:t xml:space="preserve">DAN and its contractors identify the environmental aspects of their activities, products and services that they can control or influence — including emissions to air, releases to land and water, energy and resource use, and waste — and assess their impacts to determine those that are significant. Significant aspects are controlled through the Construction Environmental Management Plan and the Waste Management procedure, and are recorded in an environmental aspects and impacts register.</w:t>
+      </w:r>
+    </w:p>
+    <w:p>
+      <w:pPr>
+        <w:keepNext/>
+        <w:spacing w:after="80" w:before="160"/>
+      </w:pPr>
+      <w:r>
+        <w:rPr>
+          <w:rFonts w:ascii="Tahoma" w:cs="Tahoma" w:eastAsia="Tahoma" w:hAnsi="Tahoma"/>
+          <w:b/>
+          <w:bCs/>
+          <w:color w:val="B5692B"/>
+          <w:sz w:val="20"/>
+          <w:szCs w:val="20"/>
+        </w:rPr>
+        <w:t xml:space="preserve">6.1.4  Determination of Legal and Other Requirements</w:t>
+      </w:r>
+    </w:p>
+    <w:p>
+      <w:pPr>
+        <w:spacing w:after="120" w:line="276"/>
+        <w:jc w:val="both"/>
+      </w:pPr>
+      <w:r>
+        <w:rPr>
+          <w:rFonts w:ascii="Tahoma" w:cs="Tahoma" w:eastAsia="Tahoma" w:hAnsi="Tahoma"/>
+          <w:sz w:val="20"/>
+          <w:szCs w:val="20"/>
+        </w:rPr>
+        <w:t xml:space="preserve">DAN establishes and maintains a process to identify, access, evaluate and maintain compliance with applicable HSE legal and other requirements. The principal KSA framework includes the Labor Law (Royal Decree M/51 and amendments) and the Occupational Health and Safety regulations issued by HRSD, the Civil Defence requirements for construction, the Saudi Building Code (SBC) and Saudi Fire Code (SBC 801), GOSI social-insurance obligations, and SASO standards, together with applicable environmental regulations.</w:t>
+      </w:r>
+    </w:p>
+    <w:p>
+      <w:pPr>
+        <w:spacing w:after="120" w:line="276"/>
+        <w:jc w:val="both"/>
+      </w:pPr>
+      <w:r>
+        <w:rPr>
+          <w:rFonts w:ascii="Tahoma" w:cs="Tahoma" w:eastAsia="Tahoma" w:hAnsi="Tahoma"/>
+          <w:sz w:val="20"/>
+          <w:szCs w:val="20"/>
+        </w:rPr>
+        <w:t xml:space="preserve">Under the Labor Law, the employer shall take the necessary precautions to protect workers against hazards and occupational disease at no cost to the worker, including (among others): maintaining a clean and hygienic worksite with adequate lighting, drinking and washing water and appropriate toilets; posting safety instructions in Arabic and other languages understood by the workforce; informing workers of the hazards of their jobs and providing and training them in PPE; providing fire-fighting means and safe exits; providing first-aid cabinets and, for larger sites, a paramedic, first-aid room and (where remote) an ambulance; and providing periodic medical check-ups and health surveillance. Construction companies fall within the higher-obligation employer group and shall provide HSE officers in line with the prescribed ratios (see Clause 7.2).</w:t>
+      </w:r>
+    </w:p>
+    <w:p>
+      <w:pPr>
+        <w:pStyle w:val="Heading2"/>
+      </w:pPr>
+      <w:r>
+        <w:t xml:space="preserve">6.2  HSE Objectives and Planning to Achieve Them</w:t>
+      </w:r>
+    </w:p>
+    <w:p>
+      <w:pPr>
+        <w:keepNext/>
+        <w:spacing w:after="80" w:before="160"/>
+      </w:pPr>
+      <w:r>
+        <w:rPr>
+          <w:rFonts w:ascii="Tahoma" w:cs="Tahoma" w:eastAsia="Tahoma" w:hAnsi="Tahoma"/>
+          <w:b/>
+          <w:bCs/>
+          <w:color w:val="B5692B"/>
+          <w:sz w:val="20"/>
+          <w:szCs w:val="20"/>
+        </w:rPr>
+        <w:t xml:space="preserve">6.2.1  Zero-Harm Philosophy and Objectives</w:t>
+      </w:r>
+    </w:p>
+    <w:p>
+      <w:pPr>
+        <w:spacing w:after="120" w:line="276"/>
+        <w:jc w:val="both"/>
+      </w:pPr>
+      <w:r>
+        <w:rPr>
+          <w:rFonts w:ascii="Tahoma" w:cs="Tahoma" w:eastAsia="Tahoma" w:hAnsi="Tahoma"/>
+          <w:sz w:val="20"/>
+          <w:szCs w:val="20"/>
+        </w:rPr>
+        <w:t xml:space="preserve">DAN's Zero-Harm philosophy commits everyone engaged on DAN projects to effectively reduce the risks from our activities so that all personnel return home safely. Our goal is that our activities result in:</w:t>
       </w:r>
     </w:p>
     <w:p>
@@ -5022,7 +5647,7 @@
           <w:sz w:val="20"/>
           <w:szCs w:val="20"/>
         </w:rPr>
-        <w:t xml:space="preserve">Report, investigate and record incidents per the DAN procedure and authorities' requirements; monitor and manage subcontractor compliance; provide HSE reports and statistics.</w:t>
+        <w:t xml:space="preserve">Zero fatalities.</w:t>
       </w:r>
     </w:p>
     <w:p>
@@ -5041,24 +5666,7 @@
           <w:sz w:val="20"/>
           <w:szCs w:val="20"/>
         </w:rPr>
-        <w:t xml:space="preserve">Provide and maintain compliant worker welfare facilities and accommodation, and promote worker well-being (including mental health).</w:t>
-      </w:r>
-    </w:p>
-    <w:p>
-      <w:pPr>
-        <w:keepNext/>
-        <w:spacing w:after="80" w:before="160"/>
-      </w:pPr>
-      <w:r>
-        <w:rPr>
-          <w:rFonts w:ascii="Tahoma" w:cs="Tahoma" w:eastAsia="Tahoma" w:hAnsi="Tahoma"/>
-          <w:b/>
-          <w:bCs/>
-          <w:color w:val="B5692B"/>
-          <w:sz w:val="20"/>
-          <w:szCs w:val="20"/>
-        </w:rPr>
-        <w:t xml:space="preserve">5.3.5  Client, Consultant and Designers (Interface)</w:t>
+        <w:t xml:space="preserve">Zero permanently disabling injuries.</w:t>
       </w:r>
     </w:p>
     <w:p>
@@ -5077,272 +5685,7 @@
           <w:sz w:val="20"/>
           <w:szCs w:val="20"/>
         </w:rPr>
-        <w:t xml:space="preserve">Where DAN delivers under a Client/Consultant, DAN cooperates and coordinates with them and with designers so that design risk information, residual risks and the pre-construction information are communicated and managed; designers apply the general principles of prevention and provide a Health and Safety File at handover.</w:t>
-      </w:r>
-    </w:p>
-    <w:p>
-      <w:pPr>
-        <w:pStyle w:val="Heading2"/>
-      </w:pPr>
-      <w:r>
-        <w:t xml:space="preserve">5.4  Consultation and Participation of Workers</w:t>
-      </w:r>
-    </w:p>
-    <w:p>
-      <w:pPr>
-        <w:spacing w:after="120" w:line="276"/>
-        <w:jc w:val="both"/>
-      </w:pPr>
-      <w:r>
-        <w:rPr>
-          <w:rFonts w:ascii="Tahoma" w:cs="Tahoma" w:eastAsia="Tahoma" w:hAnsi="Tahoma"/>
-          <w:sz w:val="20"/>
-          <w:szCs w:val="20"/>
-        </w:rPr>
-        <w:t xml:space="preserve">DAN consults and enables the participation of workers (and, where they exist, their representatives) at all applicable levels in the development, implementation, evaluation and improvement of the HSE Management System. Workers are involved in hazard identification, risk assessment, determining controls, incident investigation, and review of HSE performance. Consultation and participation are delivered through the HSE Committee, HSE meetings, tool-box talks, RAMS meetings and site briefings, and workers are given the time, training and information needed to participate without reprisal.</w:t>
-      </w:r>
-    </w:p>
-    <w:p>
-      <w:pPr>
-        <w:pStyle w:val="Heading2"/>
-      </w:pPr>
-      <w:r>
-        <w:t xml:space="preserve">5.5  Reward and Recognition</w:t>
-      </w:r>
-    </w:p>
-    <w:p>
-      <w:pPr>
-        <w:spacing w:after="120" w:line="276"/>
-        <w:jc w:val="both"/>
-      </w:pPr>
-      <w:r>
-        <w:rPr>
-          <w:rFonts w:ascii="Tahoma" w:cs="Tahoma" w:eastAsia="Tahoma" w:hAnsi="Tahoma"/>
-          <w:sz w:val="20"/>
-          <w:szCs w:val="20"/>
-        </w:rPr>
-        <w:t xml:space="preserve">Positive reinforcement motivates the workforce and drives a positive culture. DAN and its contractors operate a written HSE incentive/recognition scheme that recognises positive HSE behaviours at the individual and team level, focuses on leading indicators, and provides public recognition and awards for HSE excellence.</w:t>
-      </w:r>
-    </w:p>
-    <w:p>
-      <w:pPr>
-        <w:pStyle w:val="Heading1"/>
-      </w:pPr>
-      <w:r>
-        <w:t xml:space="preserve">6. Planning</w:t>
-      </w:r>
-    </w:p>
-    <w:p>
-      <w:pPr>
-        <w:pStyle w:val="Heading2"/>
-      </w:pPr>
-      <w:r>
-        <w:t xml:space="preserve">6.1  Actions to Address Risks and Opportunities</w:t>
-      </w:r>
-    </w:p>
-    <w:p>
-      <w:pPr>
-        <w:spacing w:after="120" w:line="276"/>
-        <w:jc w:val="both"/>
-      </w:pPr>
-      <w:r>
-        <w:rPr>
-          <w:rFonts w:ascii="Tahoma" w:cs="Tahoma" w:eastAsia="Tahoma" w:hAnsi="Tahoma"/>
-          <w:sz w:val="20"/>
-          <w:szCs w:val="20"/>
-        </w:rPr>
-        <w:t xml:space="preserve">In planning the HSE Management System, DAN determines the risks and opportunities arising from its context (4.1), interested parties (4.2) and scope, considering: hazards; HSE risks and other risks; HSE opportunities and other opportunities; and legal and other requirements. Risks, issues and controls are maintained in a Risk and Opportunities Register as documented information, and actions are integrated into the management system and monitored for effectiveness.</w:t>
-      </w:r>
-    </w:p>
-    <w:p>
-      <w:pPr>
-        <w:keepNext/>
-        <w:spacing w:after="80" w:before="160"/>
-      </w:pPr>
-      <w:r>
-        <w:rPr>
-          <w:rFonts w:ascii="Tahoma" w:cs="Tahoma" w:eastAsia="Tahoma" w:hAnsi="Tahoma"/>
-          <w:b/>
-          <w:bCs/>
-          <w:color w:val="B5692B"/>
-          <w:sz w:val="20"/>
-          <w:szCs w:val="20"/>
-        </w:rPr>
-        <w:t xml:space="preserve">6.1.1  Hazard Identification and Assessment of Risks</w:t>
-      </w:r>
-    </w:p>
-    <w:p>
-      <w:pPr>
-        <w:spacing w:after="120" w:line="276"/>
-        <w:jc w:val="both"/>
-      </w:pPr>
-      <w:r>
-        <w:rPr>
-          <w:rFonts w:ascii="Tahoma" w:cs="Tahoma" w:eastAsia="Tahoma" w:hAnsi="Tahoma"/>
-          <w:sz w:val="20"/>
-          <w:szCs w:val="20"/>
-        </w:rPr>
-        <w:t xml:space="preserve">DAN and its contractors establish, implement and maintain a process for the ongoing, proactive identification of hazards, taking account of: routine and non-routine activities; infrastructure, equipment, materials and substances; the physical conditions of the workplace; human factors and how work is done; design of work areas, processes and machinery; emergency situations; all people who may be affected (workers, contractors, visitors and the public); changes in the organisation, knowledge or information; past incidents; and how work is organised, including social and psychosocial factors such as workload, work hours, heat and leadership.</w:t>
-      </w:r>
-    </w:p>
-    <w:p>
-      <w:pPr>
-        <w:spacing w:after="120" w:line="276"/>
-        <w:jc w:val="both"/>
-      </w:pPr>
-      <w:r>
-        <w:rPr>
-          <w:rFonts w:ascii="Tahoma" w:cs="Tahoma" w:eastAsia="Tahoma" w:hAnsi="Tahoma"/>
-          <w:sz w:val="20"/>
-          <w:szCs w:val="20"/>
-        </w:rPr>
-        <w:t xml:space="preserve">HSE risks from the identified hazards are assessed against applicable legal and other requirements and the effectiveness of existing controls, using the methodology and criteria defined in the Activity Hazard Analysis and Risk Management procedures (DCSM — SH&amp;E Risk Management; Activity Hazard Analysis). The assessment is proactive, systematic and follows the hierarchy of controls, and the results are recorded in the project risk register and the RAMS.</w:t>
-      </w:r>
-    </w:p>
-    <w:p>
-      <w:pPr>
-        <w:keepNext/>
-        <w:spacing w:after="80" w:before="160"/>
-      </w:pPr>
-      <w:r>
-        <w:rPr>
-          <w:rFonts w:ascii="Tahoma" w:cs="Tahoma" w:eastAsia="Tahoma" w:hAnsi="Tahoma"/>
-          <w:b/>
-          <w:bCs/>
-          <w:color w:val="B5692B"/>
-          <w:sz w:val="20"/>
-          <w:szCs w:val="20"/>
-        </w:rPr>
-        <w:t xml:space="preserve">6.1.2  Psychosocial / Psychological Health and Safety</w:t>
-      </w:r>
-    </w:p>
-    <w:p>
-      <w:pPr>
-        <w:spacing w:after="120" w:line="276"/>
-        <w:jc w:val="both"/>
-      </w:pPr>
-      <w:r>
-        <w:rPr>
-          <w:rFonts w:ascii="Tahoma" w:cs="Tahoma" w:eastAsia="Tahoma" w:hAnsi="Tahoma"/>
-          <w:sz w:val="20"/>
-          <w:szCs w:val="20"/>
-        </w:rPr>
-        <w:t xml:space="preserve">DAN's responsibility for worker health includes protecting and promoting physical and psychological health and well-being. Psychosocial hazards — relating to how work is organised, social factors at work, and the work environment — are identified and managed consistently with other HSE risks, in line with recognised good practice on psychological health and safety at work, through the risk assessment process.</w:t>
-      </w:r>
-    </w:p>
-    <w:p>
-      <w:pPr>
-        <w:keepNext/>
-        <w:spacing w:after="80" w:before="160"/>
-      </w:pPr>
-      <w:r>
-        <w:rPr>
-          <w:rFonts w:ascii="Tahoma" w:cs="Tahoma" w:eastAsia="Tahoma" w:hAnsi="Tahoma"/>
-          <w:b/>
-          <w:bCs/>
-          <w:color w:val="B5692B"/>
-          <w:sz w:val="20"/>
-          <w:szCs w:val="20"/>
-        </w:rPr>
-        <w:t xml:space="preserve">6.1.3  Environmental Aspects and Impacts</w:t>
-      </w:r>
-    </w:p>
-    <w:p>
-      <w:pPr>
-        <w:spacing w:after="120" w:line="276"/>
-        <w:jc w:val="both"/>
-      </w:pPr>
-      <w:r>
-        <w:rPr>
-          <w:rFonts w:ascii="Tahoma" w:cs="Tahoma" w:eastAsia="Tahoma" w:hAnsi="Tahoma"/>
-          <w:sz w:val="20"/>
-          <w:szCs w:val="20"/>
-        </w:rPr>
-        <w:t xml:space="preserve">DAN and its contractors identify the environmental aspects of their activities, products and services that they can control or influence — including emissions to air, releases to land and water, energy and resource use, and waste — and assess their impacts to determine those that are significant. Significant aspects are controlled through the Construction Environmental Management Plan and the Waste Management procedure, and are recorded in an environmental aspects and impacts register.</w:t>
-      </w:r>
-    </w:p>
-    <w:p>
-      <w:pPr>
-        <w:keepNext/>
-        <w:spacing w:after="80" w:before="160"/>
-      </w:pPr>
-      <w:r>
-        <w:rPr>
-          <w:rFonts w:ascii="Tahoma" w:cs="Tahoma" w:eastAsia="Tahoma" w:hAnsi="Tahoma"/>
-          <w:b/>
-          <w:bCs/>
-          <w:color w:val="B5692B"/>
-          <w:sz w:val="20"/>
-          <w:szCs w:val="20"/>
-        </w:rPr>
-        <w:t xml:space="preserve">6.1.4  Determination of Legal and Other Requirements</w:t>
-      </w:r>
-    </w:p>
-    <w:p>
-      <w:pPr>
-        <w:spacing w:after="120" w:line="276"/>
-        <w:jc w:val="both"/>
-      </w:pPr>
-      <w:r>
-        <w:rPr>
-          <w:rFonts w:ascii="Tahoma" w:cs="Tahoma" w:eastAsia="Tahoma" w:hAnsi="Tahoma"/>
-          <w:sz w:val="20"/>
-          <w:szCs w:val="20"/>
-        </w:rPr>
-        <w:t xml:space="preserve">DAN establishes and maintains a process to identify, access, evaluate and maintain compliance with applicable HSE legal and other requirements. The principal KSA framework includes the Labor Law (Royal Decree M/51 and amendments) and the Occupational Health and Safety regulations issued by HRSD, the Civil Defence requirements for construction, the Saudi Building Code (SBC) and Saudi Fire Code (SBC 801), GOSI social-insurance obligations, and SASO standards, together with applicable environmental regulations.</w:t>
-      </w:r>
-    </w:p>
-    <w:p>
-      <w:pPr>
-        <w:spacing w:after="120" w:line="276"/>
-        <w:jc w:val="both"/>
-      </w:pPr>
-      <w:r>
-        <w:rPr>
-          <w:rFonts w:ascii="Tahoma" w:cs="Tahoma" w:eastAsia="Tahoma" w:hAnsi="Tahoma"/>
-          <w:sz w:val="20"/>
-          <w:szCs w:val="20"/>
-        </w:rPr>
-        <w:t xml:space="preserve">Under the Labor Law, the employer shall take the necessary precautions to protect workers against hazards and occupational disease at no cost to the worker, including (among others): maintaining a clean and hygienic worksite with adequate lighting, drinking and washing water and appropriate toilets; posting safety instructions in Arabic and other languages understood by the workforce; informing workers of the hazards of their jobs and providing and training them in PPE; providing fire-fighting means and safe exits; providing first-aid cabinets and, for larger sites, a paramedic, first-aid room and (where remote) an ambulance; and providing periodic medical check-ups and health surveillance. Construction companies fall within the higher-obligation employer group and shall provide HSE officers in line with the prescribed ratios (see Clause 7.2).</w:t>
-      </w:r>
-    </w:p>
-    <w:p>
-      <w:pPr>
-        <w:pStyle w:val="Heading2"/>
-      </w:pPr>
-      <w:r>
-        <w:t xml:space="preserve">6.2  HSE Objectives and Planning to Achieve Them</w:t>
-      </w:r>
-    </w:p>
-    <w:p>
-      <w:pPr>
-        <w:keepNext/>
-        <w:spacing w:after="80" w:before="160"/>
-      </w:pPr>
-      <w:r>
-        <w:rPr>
-          <w:rFonts w:ascii="Tahoma" w:cs="Tahoma" w:eastAsia="Tahoma" w:hAnsi="Tahoma"/>
-          <w:b/>
-          <w:bCs/>
-          <w:color w:val="B5692B"/>
-          <w:sz w:val="20"/>
-          <w:szCs w:val="20"/>
-        </w:rPr>
-        <w:t xml:space="preserve">6.2.1  Zero-Harm Philosophy and Objectives</w:t>
-      </w:r>
-    </w:p>
-    <w:p>
-      <w:pPr>
-        <w:spacing w:after="120" w:line="276"/>
-        <w:jc w:val="both"/>
-      </w:pPr>
-      <w:r>
-        <w:rPr>
-          <w:rFonts w:ascii="Tahoma" w:cs="Tahoma" w:eastAsia="Tahoma" w:hAnsi="Tahoma"/>
-          <w:sz w:val="20"/>
-          <w:szCs w:val="20"/>
-        </w:rPr>
-        <w:t xml:space="preserve">DAN's Zero-Harm philosophy commits everyone engaged on DAN projects to effectively reduce the risks from our activities so that all personnel return home safely. Our goal is that our activities result in:</w:t>
+        <w:t xml:space="preserve">Zero injuries to members of the public.</w:t>
       </w:r>
     </w:p>
     <w:p>
@@ -5361,7 +5704,7 @@
           <w:sz w:val="20"/>
           <w:szCs w:val="20"/>
         </w:rPr>
-        <w:t xml:space="preserve">Zero fatalities.</w:t>
+        <w:t xml:space="preserve">Zero long-term harm to health.</w:t>
       </w:r>
     </w:p>
     <w:p>
@@ -5380,63 +5723,6 @@
           <w:sz w:val="20"/>
           <w:szCs w:val="20"/>
         </w:rPr>
-        <w:t xml:space="preserve">Zero permanently disabling injuries.</w:t>
-      </w:r>
-    </w:p>
-    <w:p>
-      <w:pPr>
-        <w:pStyle w:val="ListParagraph"/>
-        <w:numPr>
-          <w:ilvl w:val="0"/>
-          <w:numId w:val="2"/>
-        </w:numPr>
-        <w:spacing w:after="60" w:line="268"/>
-        <w:jc w:val="both"/>
-      </w:pPr>
-      <w:r>
-        <w:rPr>
-          <w:rFonts w:ascii="Tahoma" w:cs="Tahoma" w:eastAsia="Tahoma" w:hAnsi="Tahoma"/>
-          <w:sz w:val="20"/>
-          <w:szCs w:val="20"/>
-        </w:rPr>
-        <w:t xml:space="preserve">Zero injuries to members of the public.</w:t>
-      </w:r>
-    </w:p>
-    <w:p>
-      <w:pPr>
-        <w:pStyle w:val="ListParagraph"/>
-        <w:numPr>
-          <w:ilvl w:val="0"/>
-          <w:numId w:val="2"/>
-        </w:numPr>
-        <w:spacing w:after="60" w:line="268"/>
-        <w:jc w:val="both"/>
-      </w:pPr>
-      <w:r>
-        <w:rPr>
-          <w:rFonts w:ascii="Tahoma" w:cs="Tahoma" w:eastAsia="Tahoma" w:hAnsi="Tahoma"/>
-          <w:sz w:val="20"/>
-          <w:szCs w:val="20"/>
-        </w:rPr>
-        <w:t xml:space="preserve">Zero long-term harm to health.</w:t>
-      </w:r>
-    </w:p>
-    <w:p>
-      <w:pPr>
-        <w:pStyle w:val="ListParagraph"/>
-        <w:numPr>
-          <w:ilvl w:val="0"/>
-          <w:numId w:val="2"/>
-        </w:numPr>
-        <w:spacing w:after="60" w:line="268"/>
-        <w:jc w:val="both"/>
-      </w:pPr>
-      <w:r>
-        <w:rPr>
-          <w:rFonts w:ascii="Tahoma" w:cs="Tahoma" w:eastAsia="Tahoma" w:hAnsi="Tahoma"/>
-          <w:sz w:val="20"/>
-          <w:szCs w:val="20"/>
-        </w:rPr>
         <w:t xml:space="preserve">Zero significant environmental incidents.</w:t>
       </w:r>
     </w:p>
@@ -5512,7 +5798,7 @@
           <w:sz w:val="20"/>
           <w:szCs w:val="20"/>
         </w:rPr>
-        <w:t xml:space="preserve">DAN determines and provides the resources needed to establish, implement, maintain and continually improve the HSE Management System, including people, infrastructure, the work environment, and monitoring and measuring resources. Resource needs are determined by the HSE Department and approved by senior management.</w:t>
+        <w:t xml:space="preserve">DAN determines and provides the resources needed to establish, implement, maintain and continually improve the HSE Management System, including people, infrastructure, the work environment, and monitoring and measuring resources. Resource needs are determined by the HSE function (HSSE Manager) and approved by senior management.</w:t>
       </w:r>
     </w:p>
     <w:p>
@@ -5550,8 +5836,8 @@
         </w:tblBorders>
       </w:tblPr>
       <w:tblGrid>
-        <w:gridCol w:w="3120"/>
-        <w:gridCol w:w="6240"/>
+        <w:gridCol w:w="2600"/>
+        <w:gridCol w:w="6760"/>
       </w:tblGrid>
       <w:tr>
         <w:trPr>
@@ -5559,7 +5845,7 @@
         </w:trPr>
         <w:tc>
           <w:tcPr>
-            <w:tcW w:type="dxa" w:w="3120"/>
+            <w:tcW w:type="dxa" w:w="2600"/>
             <w:tcBorders>
               <w:top w:val="single" w:color="BFB3AA" w:sz="4"/>
               <w:left w:val="single" w:color="BFB3AA" w:sz="4"/>
@@ -5585,13 +5871,13 @@
                 <w:sz w:val="18"/>
                 <w:szCs w:val="18"/>
               </w:rPr>
-              <w:t xml:space="preserve">Role</w:t>
-            </w:r>
-          </w:p>
-        </w:tc>
-        <w:tc>
-          <w:tcPr>
-            <w:tcW w:type="dxa" w:w="6240"/>
+              <w:t xml:space="preserve">Tier</w:t>
+            </w:r>
+          </w:p>
+        </w:tc>
+        <w:tc>
+          <w:tcPr>
+            <w:tcW w:type="dxa" w:w="6760"/>
             <w:tcBorders>
               <w:top w:val="single" w:color="BFB3AA" w:sz="4"/>
               <w:left w:val="single" w:color="BFB3AA" w:sz="4"/>
@@ -5625,7 +5911,7 @@
       <w:tr>
         <w:tc>
           <w:tcPr>
-            <w:tcW w:type="dxa" w:w="3120"/>
+            <w:tcW w:type="dxa" w:w="2600"/>
             <w:tcBorders>
               <w:top w:val="single" w:color="BFB3AA" w:sz="4"/>
               <w:left w:val="single" w:color="BFB3AA" w:sz="4"/>
@@ -5654,7 +5940,7 @@
         </w:tc>
         <w:tc>
           <w:tcPr>
-            <w:tcW w:type="dxa" w:w="6240"/>
+            <w:tcW w:type="dxa" w:w="6760"/>
             <w:tcBorders>
               <w:top w:val="single" w:color="BFB3AA" w:sz="4"/>
               <w:left w:val="single" w:color="BFB3AA" w:sz="4"/>
@@ -5685,59 +5971,59 @@
       <w:tr>
         <w:tc>
           <w:tcPr>
-            <w:tcW w:type="dxa" w:w="3120"/>
-            <w:tcBorders>
-              <w:top w:val="single" w:color="BFB3AA" w:sz="4"/>
-              <w:left w:val="single" w:color="BFB3AA" w:sz="4"/>
-              <w:bottom w:val="single" w:color="BFB3AA" w:sz="4"/>
-              <w:right w:val="single" w:color="BFB3AA" w:sz="4"/>
-            </w:tcBorders>
-            <w:tcMar>
-              <w:top w:type="dxa" w:w="60"/>
-              <w:left w:type="dxa" w:w="120"/>
-              <w:bottom w:type="dxa" w:w="60"/>
-              <w:right w:type="dxa" w:w="120"/>
-            </w:tcMar>
-            <w:vAlign w:val="center"/>
-          </w:tcPr>
-          <w:p>
-            <w:r>
-              <w:rPr>
-                <w:rFonts w:ascii="Tahoma" w:cs="Tahoma" w:eastAsia="Tahoma" w:hAnsi="Tahoma"/>
-                <w:color w:val="222222"/>
-                <w:sz w:val="18"/>
-                <w:szCs w:val="18"/>
-              </w:rPr>
-              <w:t xml:space="preserve">Contractor</w:t>
-            </w:r>
-          </w:p>
-        </w:tc>
-        <w:tc>
-          <w:tcPr>
-            <w:tcW w:type="dxa" w:w="6240"/>
-            <w:tcBorders>
-              <w:top w:val="single" w:color="BFB3AA" w:sz="4"/>
-              <w:left w:val="single" w:color="BFB3AA" w:sz="4"/>
-              <w:bottom w:val="single" w:color="BFB3AA" w:sz="4"/>
-              <w:right w:val="single" w:color="BFB3AA" w:sz="4"/>
-            </w:tcBorders>
-            <w:tcMar>
-              <w:top w:type="dxa" w:w="60"/>
-              <w:left w:type="dxa" w:w="120"/>
-              <w:bottom w:type="dxa" w:w="60"/>
-              <w:right w:type="dxa" w:w="120"/>
-            </w:tcMar>
-            <w:vAlign w:val="center"/>
-          </w:tcPr>
-          <w:p>
-            <w:r>
-              <w:rPr>
-                <w:rFonts w:ascii="Tahoma" w:cs="Tahoma" w:eastAsia="Tahoma" w:hAnsi="Tahoma"/>
-                <w:color w:val="222222"/>
-                <w:sz w:val="18"/>
-                <w:szCs w:val="18"/>
-              </w:rPr>
-              <w:t xml:space="preserve">At least one HSE Officer per 50 workers; every 10 officers led by an HSE Supervisor; a qualified HSE Manager appointed for each contract.</w:t>
+            <w:tcW w:type="dxa" w:w="2600"/>
+            <w:tcBorders>
+              <w:top w:val="single" w:color="BFB3AA" w:sz="4"/>
+              <w:left w:val="single" w:color="BFB3AA" w:sz="4"/>
+              <w:bottom w:val="single" w:color="BFB3AA" w:sz="4"/>
+              <w:right w:val="single" w:color="BFB3AA" w:sz="4"/>
+            </w:tcBorders>
+            <w:tcMar>
+              <w:top w:type="dxa" w:w="60"/>
+              <w:left w:type="dxa" w:w="120"/>
+              <w:bottom w:type="dxa" w:w="60"/>
+              <w:right w:type="dxa" w:w="120"/>
+            </w:tcMar>
+            <w:vAlign w:val="center"/>
+          </w:tcPr>
+          <w:p>
+            <w:r>
+              <w:rPr>
+                <w:rFonts w:ascii="Tahoma" w:cs="Tahoma" w:eastAsia="Tahoma" w:hAnsi="Tahoma"/>
+                <w:color w:val="222222"/>
+                <w:sz w:val="18"/>
+                <w:szCs w:val="18"/>
+              </w:rPr>
+              <w:t xml:space="preserve">PMC</w:t>
+            </w:r>
+          </w:p>
+        </w:tc>
+        <w:tc>
+          <w:tcPr>
+            <w:tcW w:type="dxa" w:w="6760"/>
+            <w:tcBorders>
+              <w:top w:val="single" w:color="BFB3AA" w:sz="4"/>
+              <w:left w:val="single" w:color="BFB3AA" w:sz="4"/>
+              <w:bottom w:val="single" w:color="BFB3AA" w:sz="4"/>
+              <w:right w:val="single" w:color="BFB3AA" w:sz="4"/>
+            </w:tcBorders>
+            <w:tcMar>
+              <w:top w:type="dxa" w:w="60"/>
+              <w:left w:type="dxa" w:w="120"/>
+              <w:bottom w:type="dxa" w:w="60"/>
+              <w:right w:type="dxa" w:w="120"/>
+            </w:tcMar>
+            <w:vAlign w:val="center"/>
+          </w:tcPr>
+          <w:p>
+            <w:r>
+              <w:rPr>
+                <w:rFonts w:ascii="Tahoma" w:cs="Tahoma" w:eastAsia="Tahoma" w:hAnsi="Tahoma"/>
+                <w:color w:val="222222"/>
+                <w:sz w:val="18"/>
+                <w:szCs w:val="18"/>
+              </w:rPr>
+              <w:t xml:space="preserve">At least one HSE Manager per project, supported by HSE professionals at a minimum ratio of one per 200 workforce.</w:t>
             </w:r>
           </w:p>
         </w:tc>
@@ -5745,7 +6031,67 @@
       <w:tr>
         <w:tc>
           <w:tcPr>
-            <w:tcW w:type="dxa" w:w="3120"/>
+            <w:tcW w:type="dxa" w:w="2600"/>
+            <w:tcBorders>
+              <w:top w:val="single" w:color="BFB3AA" w:sz="4"/>
+              <w:left w:val="single" w:color="BFB3AA" w:sz="4"/>
+              <w:bottom w:val="single" w:color="BFB3AA" w:sz="4"/>
+              <w:right w:val="single" w:color="BFB3AA" w:sz="4"/>
+            </w:tcBorders>
+            <w:tcMar>
+              <w:top w:type="dxa" w:w="60"/>
+              <w:left w:type="dxa" w:w="120"/>
+              <w:bottom w:type="dxa" w:w="60"/>
+              <w:right w:type="dxa" w:w="120"/>
+            </w:tcMar>
+            <w:vAlign w:val="center"/>
+          </w:tcPr>
+          <w:p>
+            <w:r>
+              <w:rPr>
+                <w:rFonts w:ascii="Tahoma" w:cs="Tahoma" w:eastAsia="Tahoma" w:hAnsi="Tahoma"/>
+                <w:color w:val="222222"/>
+                <w:sz w:val="18"/>
+                <w:szCs w:val="18"/>
+              </w:rPr>
+              <w:t xml:space="preserve">Contractor</w:t>
+            </w:r>
+          </w:p>
+        </w:tc>
+        <w:tc>
+          <w:tcPr>
+            <w:tcW w:type="dxa" w:w="6760"/>
+            <w:tcBorders>
+              <w:top w:val="single" w:color="BFB3AA" w:sz="4"/>
+              <w:left w:val="single" w:color="BFB3AA" w:sz="4"/>
+              <w:bottom w:val="single" w:color="BFB3AA" w:sz="4"/>
+              <w:right w:val="single" w:color="BFB3AA" w:sz="4"/>
+            </w:tcBorders>
+            <w:tcMar>
+              <w:top w:type="dxa" w:w="60"/>
+              <w:left w:type="dxa" w:w="120"/>
+              <w:bottom w:type="dxa" w:w="60"/>
+              <w:right w:type="dxa" w:w="120"/>
+            </w:tcMar>
+            <w:vAlign w:val="center"/>
+          </w:tcPr>
+          <w:p>
+            <w:r>
+              <w:rPr>
+                <w:rFonts w:ascii="Tahoma" w:cs="Tahoma" w:eastAsia="Tahoma" w:hAnsi="Tahoma"/>
+                <w:color w:val="222222"/>
+                <w:sz w:val="18"/>
+                <w:szCs w:val="18"/>
+              </w:rPr>
+              <w:t xml:space="preserve">At least one HSE Officer per 50 workers; every 10 officers led by an HSE Supervisor; a qualified HSE Manager appointed for each contract.</w:t>
+            </w:r>
+          </w:p>
+        </w:tc>
+      </w:tr>
+      <w:tr>
+        <w:tc>
+          <w:tcPr>
+            <w:tcW w:type="dxa" w:w="2600"/>
             <w:tcBorders>
               <w:top w:val="single" w:color="BFB3AA" w:sz="4"/>
               <w:left w:val="single" w:color="BFB3AA" w:sz="4"/>
@@ -5774,7 +6120,7 @@
         </w:tc>
         <w:tc>
           <w:tcPr>
-            <w:tcW w:type="dxa" w:w="6240"/>
+            <w:tcW w:type="dxa" w:w="6760"/>
             <w:tcBorders>
               <w:top w:val="single" w:color="BFB3AA" w:sz="4"/>
               <w:left w:val="single" w:color="BFB3AA" w:sz="4"/>
@@ -5814,7 +6160,3103 @@
           <w:sz w:val="20"/>
           <w:szCs w:val="20"/>
         </w:rPr>
-        <w:t xml:space="preserve">HSE personnel hold qualifications and professional membership appropriate to their level (e.g. NEBOSH IGC/Diploma, IOSH/IIRSM membership and relevant experience for managers and above). Changes to HSE key personnel are notified in writing to DAN/the Consultant within 48 hours.</w:t>
+        <w:t xml:space="preserve">In line with the KSA Saudization framework, construction employers (the higher-obligation group) appoint HSE officers at a ratio of one per 50 workers, up to an equivalent of 2% of the total workforce, with a phased Saudi-national requirement. The following table sets out the minimum HSE-officer establishment by workforce band (1:50 basis) and the indicative Saudi-national requirement at the 30%, 50% and 70% phasing levels, together with the professional/practitioner split:</w:t>
+      </w:r>
+    </w:p>
+    <w:tbl>
+      <w:tblPr>
+        <w:tblW w:type="dxa" w:w="9360"/>
+        <w:tblBorders>
+          <w:top w:val="single" w:color="auto" w:sz="4"/>
+          <w:left w:val="single" w:color="auto" w:sz="4"/>
+          <w:bottom w:val="single" w:color="auto" w:sz="4"/>
+          <w:right w:val="single" w:color="auto" w:sz="4"/>
+          <w:insideH w:val="single" w:color="auto" w:sz="4"/>
+          <w:insideV w:val="single" w:color="auto" w:sz="4"/>
+        </w:tblBorders>
+      </w:tblPr>
+      <w:tblGrid>
+        <w:gridCol w:w="2040"/>
+        <w:gridCol w:w="1520"/>
+        <w:gridCol w:w="1120"/>
+        <w:gridCol w:w="1120"/>
+        <w:gridCol w:w="1120"/>
+        <w:gridCol w:w="1220"/>
+        <w:gridCol w:w="1220"/>
+      </w:tblGrid>
+      <w:tr>
+        <w:trPr>
+          <w:tblHeader/>
+        </w:trPr>
+        <w:tc>
+          <w:tcPr>
+            <w:tcW w:type="dxa" w:w="2040"/>
+            <w:tcBorders>
+              <w:top w:val="single" w:color="BFB3AA" w:sz="4"/>
+              <w:left w:val="single" w:color="BFB3AA" w:sz="4"/>
+              <w:bottom w:val="single" w:color="BFB3AA" w:sz="4"/>
+              <w:right w:val="single" w:color="BFB3AA" w:sz="4"/>
+            </w:tcBorders>
+            <w:shd w:fill="542A12" w:color="auto" w:val="clear"/>
+            <w:tcMar>
+              <w:top w:type="dxa" w:w="60"/>
+              <w:left w:type="dxa" w:w="120"/>
+              <w:bottom w:type="dxa" w:w="60"/>
+              <w:right w:type="dxa" w:w="120"/>
+            </w:tcMar>
+            <w:vAlign w:val="center"/>
+          </w:tcPr>
+          <w:p>
+            <w:r>
+              <w:rPr>
+                <w:rFonts w:ascii="Tahoma" w:cs="Tahoma" w:eastAsia="Tahoma" w:hAnsi="Tahoma"/>
+                <w:b/>
+                <w:bCs/>
+                <w:color w:val="FFFFFF"/>
+                <w:sz w:val="18"/>
+                <w:szCs w:val="18"/>
+              </w:rPr>
+              <w:t xml:space="preserve">Total workforce</w:t>
+            </w:r>
+          </w:p>
+        </w:tc>
+        <w:tc>
+          <w:tcPr>
+            <w:tcW w:type="dxa" w:w="1520"/>
+            <w:tcBorders>
+              <w:top w:val="single" w:color="BFB3AA" w:sz="4"/>
+              <w:left w:val="single" w:color="BFB3AA" w:sz="4"/>
+              <w:bottom w:val="single" w:color="BFB3AA" w:sz="4"/>
+              <w:right w:val="single" w:color="BFB3AA" w:sz="4"/>
+            </w:tcBorders>
+            <w:shd w:fill="542A12" w:color="auto" w:val="clear"/>
+            <w:tcMar>
+              <w:top w:type="dxa" w:w="60"/>
+              <w:left w:type="dxa" w:w="120"/>
+              <w:bottom w:type="dxa" w:w="60"/>
+              <w:right w:type="dxa" w:w="120"/>
+            </w:tcMar>
+            <w:vAlign w:val="center"/>
+          </w:tcPr>
+          <w:p>
+            <w:r>
+              <w:rPr>
+                <w:rFonts w:ascii="Tahoma" w:cs="Tahoma" w:eastAsia="Tahoma" w:hAnsi="Tahoma"/>
+                <w:b/>
+                <w:bCs/>
+                <w:color w:val="FFFFFF"/>
+                <w:sz w:val="18"/>
+                <w:szCs w:val="18"/>
+              </w:rPr>
+              <w:t xml:space="preserve">HSE Officers (1:50)</w:t>
+            </w:r>
+          </w:p>
+        </w:tc>
+        <w:tc>
+          <w:tcPr>
+            <w:tcW w:type="dxa" w:w="1120"/>
+            <w:tcBorders>
+              <w:top w:val="single" w:color="BFB3AA" w:sz="4"/>
+              <w:left w:val="single" w:color="BFB3AA" w:sz="4"/>
+              <w:bottom w:val="single" w:color="BFB3AA" w:sz="4"/>
+              <w:right w:val="single" w:color="BFB3AA" w:sz="4"/>
+            </w:tcBorders>
+            <w:shd w:fill="542A12" w:color="auto" w:val="clear"/>
+            <w:tcMar>
+              <w:top w:type="dxa" w:w="60"/>
+              <w:left w:type="dxa" w:w="120"/>
+              <w:bottom w:type="dxa" w:w="60"/>
+              <w:right w:type="dxa" w:w="120"/>
+            </w:tcMar>
+            <w:vAlign w:val="center"/>
+          </w:tcPr>
+          <w:p>
+            <w:r>
+              <w:rPr>
+                <w:rFonts w:ascii="Tahoma" w:cs="Tahoma" w:eastAsia="Tahoma" w:hAnsi="Tahoma"/>
+                <w:b/>
+                <w:bCs/>
+                <w:color w:val="FFFFFF"/>
+                <w:sz w:val="18"/>
+                <w:szCs w:val="18"/>
+              </w:rPr>
+              <w:t xml:space="preserve">Saudi @30%</w:t>
+            </w:r>
+          </w:p>
+        </w:tc>
+        <w:tc>
+          <w:tcPr>
+            <w:tcW w:type="dxa" w:w="1120"/>
+            <w:tcBorders>
+              <w:top w:val="single" w:color="BFB3AA" w:sz="4"/>
+              <w:left w:val="single" w:color="BFB3AA" w:sz="4"/>
+              <w:bottom w:val="single" w:color="BFB3AA" w:sz="4"/>
+              <w:right w:val="single" w:color="BFB3AA" w:sz="4"/>
+            </w:tcBorders>
+            <w:shd w:fill="542A12" w:color="auto" w:val="clear"/>
+            <w:tcMar>
+              <w:top w:type="dxa" w:w="60"/>
+              <w:left w:type="dxa" w:w="120"/>
+              <w:bottom w:type="dxa" w:w="60"/>
+              <w:right w:type="dxa" w:w="120"/>
+            </w:tcMar>
+            <w:vAlign w:val="center"/>
+          </w:tcPr>
+          <w:p>
+            <w:r>
+              <w:rPr>
+                <w:rFonts w:ascii="Tahoma" w:cs="Tahoma" w:eastAsia="Tahoma" w:hAnsi="Tahoma"/>
+                <w:b/>
+                <w:bCs/>
+                <w:color w:val="FFFFFF"/>
+                <w:sz w:val="18"/>
+                <w:szCs w:val="18"/>
+              </w:rPr>
+              <w:t xml:space="preserve">Saudi @50%</w:t>
+            </w:r>
+          </w:p>
+        </w:tc>
+        <w:tc>
+          <w:tcPr>
+            <w:tcW w:type="dxa" w:w="1120"/>
+            <w:tcBorders>
+              <w:top w:val="single" w:color="BFB3AA" w:sz="4"/>
+              <w:left w:val="single" w:color="BFB3AA" w:sz="4"/>
+              <w:bottom w:val="single" w:color="BFB3AA" w:sz="4"/>
+              <w:right w:val="single" w:color="BFB3AA" w:sz="4"/>
+            </w:tcBorders>
+            <w:shd w:fill="542A12" w:color="auto" w:val="clear"/>
+            <w:tcMar>
+              <w:top w:type="dxa" w:w="60"/>
+              <w:left w:type="dxa" w:w="120"/>
+              <w:bottom w:type="dxa" w:w="60"/>
+              <w:right w:type="dxa" w:w="120"/>
+            </w:tcMar>
+            <w:vAlign w:val="center"/>
+          </w:tcPr>
+          <w:p>
+            <w:r>
+              <w:rPr>
+                <w:rFonts w:ascii="Tahoma" w:cs="Tahoma" w:eastAsia="Tahoma" w:hAnsi="Tahoma"/>
+                <w:b/>
+                <w:bCs/>
+                <w:color w:val="FFFFFF"/>
+                <w:sz w:val="18"/>
+                <w:szCs w:val="18"/>
+              </w:rPr>
+              <w:t xml:space="preserve">Saudi @70%</w:t>
+            </w:r>
+          </w:p>
+        </w:tc>
+        <w:tc>
+          <w:tcPr>
+            <w:tcW w:type="dxa" w:w="1220"/>
+            <w:tcBorders>
+              <w:top w:val="single" w:color="BFB3AA" w:sz="4"/>
+              <w:left w:val="single" w:color="BFB3AA" w:sz="4"/>
+              <w:bottom w:val="single" w:color="BFB3AA" w:sz="4"/>
+              <w:right w:val="single" w:color="BFB3AA" w:sz="4"/>
+            </w:tcBorders>
+            <w:shd w:fill="542A12" w:color="auto" w:val="clear"/>
+            <w:tcMar>
+              <w:top w:type="dxa" w:w="60"/>
+              <w:left w:type="dxa" w:w="120"/>
+              <w:bottom w:type="dxa" w:w="60"/>
+              <w:right w:type="dxa" w:w="120"/>
+            </w:tcMar>
+            <w:vAlign w:val="center"/>
+          </w:tcPr>
+          <w:p>
+            <w:r>
+              <w:rPr>
+                <w:rFonts w:ascii="Tahoma" w:cs="Tahoma" w:eastAsia="Tahoma" w:hAnsi="Tahoma"/>
+                <w:b/>
+                <w:bCs/>
+                <w:color w:val="FFFFFF"/>
+                <w:sz w:val="18"/>
+                <w:szCs w:val="18"/>
+              </w:rPr>
+              <w:t xml:space="preserve">Professionals (30–40%)</w:t>
+            </w:r>
+          </w:p>
+        </w:tc>
+        <w:tc>
+          <w:tcPr>
+            <w:tcW w:type="dxa" w:w="1220"/>
+            <w:tcBorders>
+              <w:top w:val="single" w:color="BFB3AA" w:sz="4"/>
+              <w:left w:val="single" w:color="BFB3AA" w:sz="4"/>
+              <w:bottom w:val="single" w:color="BFB3AA" w:sz="4"/>
+              <w:right w:val="single" w:color="BFB3AA" w:sz="4"/>
+            </w:tcBorders>
+            <w:shd w:fill="542A12" w:color="auto" w:val="clear"/>
+            <w:tcMar>
+              <w:top w:type="dxa" w:w="60"/>
+              <w:left w:type="dxa" w:w="120"/>
+              <w:bottom w:type="dxa" w:w="60"/>
+              <w:right w:type="dxa" w:w="120"/>
+            </w:tcMar>
+            <w:vAlign w:val="center"/>
+          </w:tcPr>
+          <w:p>
+            <w:r>
+              <w:rPr>
+                <w:rFonts w:ascii="Tahoma" w:cs="Tahoma" w:eastAsia="Tahoma" w:hAnsi="Tahoma"/>
+                <w:b/>
+                <w:bCs/>
+                <w:color w:val="FFFFFF"/>
+                <w:sz w:val="18"/>
+                <w:szCs w:val="18"/>
+              </w:rPr>
+              <w:t xml:space="preserve">Practitioners (60–70%)</w:t>
+            </w:r>
+          </w:p>
+        </w:tc>
+      </w:tr>
+      <w:tr>
+        <w:tc>
+          <w:tcPr>
+            <w:tcW w:type="dxa" w:w="2040"/>
+            <w:tcBorders>
+              <w:top w:val="single" w:color="BFB3AA" w:sz="4"/>
+              <w:left w:val="single" w:color="BFB3AA" w:sz="4"/>
+              <w:bottom w:val="single" w:color="BFB3AA" w:sz="4"/>
+              <w:right w:val="single" w:color="BFB3AA" w:sz="4"/>
+            </w:tcBorders>
+            <w:tcMar>
+              <w:top w:type="dxa" w:w="60"/>
+              <w:left w:type="dxa" w:w="120"/>
+              <w:bottom w:type="dxa" w:w="60"/>
+              <w:right w:type="dxa" w:w="120"/>
+            </w:tcMar>
+            <w:vAlign w:val="center"/>
+          </w:tcPr>
+          <w:p>
+            <w:r>
+              <w:rPr>
+                <w:rFonts w:ascii="Tahoma" w:cs="Tahoma" w:eastAsia="Tahoma" w:hAnsi="Tahoma"/>
+                <w:color w:val="222222"/>
+                <w:sz w:val="18"/>
+                <w:szCs w:val="18"/>
+              </w:rPr>
+              <w:t xml:space="preserve">50–100</w:t>
+            </w:r>
+          </w:p>
+        </w:tc>
+        <w:tc>
+          <w:tcPr>
+            <w:tcW w:type="dxa" w:w="1520"/>
+            <w:tcBorders>
+              <w:top w:val="single" w:color="BFB3AA" w:sz="4"/>
+              <w:left w:val="single" w:color="BFB3AA" w:sz="4"/>
+              <w:bottom w:val="single" w:color="BFB3AA" w:sz="4"/>
+              <w:right w:val="single" w:color="BFB3AA" w:sz="4"/>
+            </w:tcBorders>
+            <w:tcMar>
+              <w:top w:type="dxa" w:w="60"/>
+              <w:left w:type="dxa" w:w="120"/>
+              <w:bottom w:type="dxa" w:w="60"/>
+              <w:right w:type="dxa" w:w="120"/>
+            </w:tcMar>
+            <w:vAlign w:val="center"/>
+          </w:tcPr>
+          <w:p>
+            <w:r>
+              <w:rPr>
+                <w:rFonts w:ascii="Tahoma" w:cs="Tahoma" w:eastAsia="Tahoma" w:hAnsi="Tahoma"/>
+                <w:color w:val="222222"/>
+                <w:sz w:val="18"/>
+                <w:szCs w:val="18"/>
+              </w:rPr>
+              <w:t xml:space="preserve">2</w:t>
+            </w:r>
+          </w:p>
+        </w:tc>
+        <w:tc>
+          <w:tcPr>
+            <w:tcW w:type="dxa" w:w="1120"/>
+            <w:tcBorders>
+              <w:top w:val="single" w:color="BFB3AA" w:sz="4"/>
+              <w:left w:val="single" w:color="BFB3AA" w:sz="4"/>
+              <w:bottom w:val="single" w:color="BFB3AA" w:sz="4"/>
+              <w:right w:val="single" w:color="BFB3AA" w:sz="4"/>
+            </w:tcBorders>
+            <w:tcMar>
+              <w:top w:type="dxa" w:w="60"/>
+              <w:left w:type="dxa" w:w="120"/>
+              <w:bottom w:type="dxa" w:w="60"/>
+              <w:right w:type="dxa" w:w="120"/>
+            </w:tcMar>
+            <w:vAlign w:val="center"/>
+          </w:tcPr>
+          <w:p>
+            <w:r>
+              <w:rPr>
+                <w:rFonts w:ascii="Tahoma" w:cs="Tahoma" w:eastAsia="Tahoma" w:hAnsi="Tahoma"/>
+                <w:color w:val="222222"/>
+                <w:sz w:val="18"/>
+                <w:szCs w:val="18"/>
+              </w:rPr>
+              <w:t xml:space="preserve">1</w:t>
+            </w:r>
+          </w:p>
+        </w:tc>
+        <w:tc>
+          <w:tcPr>
+            <w:tcW w:type="dxa" w:w="1120"/>
+            <w:tcBorders>
+              <w:top w:val="single" w:color="BFB3AA" w:sz="4"/>
+              <w:left w:val="single" w:color="BFB3AA" w:sz="4"/>
+              <w:bottom w:val="single" w:color="BFB3AA" w:sz="4"/>
+              <w:right w:val="single" w:color="BFB3AA" w:sz="4"/>
+            </w:tcBorders>
+            <w:tcMar>
+              <w:top w:type="dxa" w:w="60"/>
+              <w:left w:type="dxa" w:w="120"/>
+              <w:bottom w:type="dxa" w:w="60"/>
+              <w:right w:type="dxa" w:w="120"/>
+            </w:tcMar>
+            <w:vAlign w:val="center"/>
+          </w:tcPr>
+          <w:p>
+            <w:r>
+              <w:rPr>
+                <w:rFonts w:ascii="Tahoma" w:cs="Tahoma" w:eastAsia="Tahoma" w:hAnsi="Tahoma"/>
+                <w:color w:val="222222"/>
+                <w:sz w:val="18"/>
+                <w:szCs w:val="18"/>
+              </w:rPr>
+              <w:t xml:space="preserve">1</w:t>
+            </w:r>
+          </w:p>
+        </w:tc>
+        <w:tc>
+          <w:tcPr>
+            <w:tcW w:type="dxa" w:w="1120"/>
+            <w:tcBorders>
+              <w:top w:val="single" w:color="BFB3AA" w:sz="4"/>
+              <w:left w:val="single" w:color="BFB3AA" w:sz="4"/>
+              <w:bottom w:val="single" w:color="BFB3AA" w:sz="4"/>
+              <w:right w:val="single" w:color="BFB3AA" w:sz="4"/>
+            </w:tcBorders>
+            <w:tcMar>
+              <w:top w:type="dxa" w:w="60"/>
+              <w:left w:type="dxa" w:w="120"/>
+              <w:bottom w:type="dxa" w:w="60"/>
+              <w:right w:type="dxa" w:w="120"/>
+            </w:tcMar>
+            <w:vAlign w:val="center"/>
+          </w:tcPr>
+          <w:p>
+            <w:r>
+              <w:rPr>
+                <w:rFonts w:ascii="Tahoma" w:cs="Tahoma" w:eastAsia="Tahoma" w:hAnsi="Tahoma"/>
+                <w:color w:val="222222"/>
+                <w:sz w:val="18"/>
+                <w:szCs w:val="18"/>
+              </w:rPr>
+              <w:t xml:space="preserve">1</w:t>
+            </w:r>
+          </w:p>
+        </w:tc>
+        <w:tc>
+          <w:tcPr>
+            <w:tcW w:type="dxa" w:w="1220"/>
+            <w:tcBorders>
+              <w:top w:val="single" w:color="BFB3AA" w:sz="4"/>
+              <w:left w:val="single" w:color="BFB3AA" w:sz="4"/>
+              <w:bottom w:val="single" w:color="BFB3AA" w:sz="4"/>
+              <w:right w:val="single" w:color="BFB3AA" w:sz="4"/>
+            </w:tcBorders>
+            <w:tcMar>
+              <w:top w:type="dxa" w:w="60"/>
+              <w:left w:type="dxa" w:w="120"/>
+              <w:bottom w:type="dxa" w:w="60"/>
+              <w:right w:type="dxa" w:w="120"/>
+            </w:tcMar>
+            <w:vAlign w:val="center"/>
+          </w:tcPr>
+          <w:p>
+            <w:r>
+              <w:rPr>
+                <w:rFonts w:ascii="Tahoma" w:cs="Tahoma" w:eastAsia="Tahoma" w:hAnsi="Tahoma"/>
+                <w:color w:val="222222"/>
+                <w:sz w:val="18"/>
+                <w:szCs w:val="18"/>
+              </w:rPr>
+              <w:t xml:space="preserve">1</w:t>
+            </w:r>
+          </w:p>
+        </w:tc>
+        <w:tc>
+          <w:tcPr>
+            <w:tcW w:type="dxa" w:w="1220"/>
+            <w:tcBorders>
+              <w:top w:val="single" w:color="BFB3AA" w:sz="4"/>
+              <w:left w:val="single" w:color="BFB3AA" w:sz="4"/>
+              <w:bottom w:val="single" w:color="BFB3AA" w:sz="4"/>
+              <w:right w:val="single" w:color="BFB3AA" w:sz="4"/>
+            </w:tcBorders>
+            <w:tcMar>
+              <w:top w:type="dxa" w:w="60"/>
+              <w:left w:type="dxa" w:w="120"/>
+              <w:bottom w:type="dxa" w:w="60"/>
+              <w:right w:type="dxa" w:w="120"/>
+            </w:tcMar>
+            <w:vAlign w:val="center"/>
+          </w:tcPr>
+          <w:p>
+            <w:r>
+              <w:rPr>
+                <w:rFonts w:ascii="Tahoma" w:cs="Tahoma" w:eastAsia="Tahoma" w:hAnsi="Tahoma"/>
+                <w:color w:val="222222"/>
+                <w:sz w:val="18"/>
+                <w:szCs w:val="18"/>
+              </w:rPr>
+              <w:t xml:space="preserve">1</w:t>
+            </w:r>
+          </w:p>
+        </w:tc>
+      </w:tr>
+      <w:tr>
+        <w:tc>
+          <w:tcPr>
+            <w:tcW w:type="dxa" w:w="2040"/>
+            <w:tcBorders>
+              <w:top w:val="single" w:color="BFB3AA" w:sz="4"/>
+              <w:left w:val="single" w:color="BFB3AA" w:sz="4"/>
+              <w:bottom w:val="single" w:color="BFB3AA" w:sz="4"/>
+              <w:right w:val="single" w:color="BFB3AA" w:sz="4"/>
+            </w:tcBorders>
+            <w:tcMar>
+              <w:top w:type="dxa" w:w="60"/>
+              <w:left w:type="dxa" w:w="120"/>
+              <w:bottom w:type="dxa" w:w="60"/>
+              <w:right w:type="dxa" w:w="120"/>
+            </w:tcMar>
+            <w:vAlign w:val="center"/>
+          </w:tcPr>
+          <w:p>
+            <w:r>
+              <w:rPr>
+                <w:rFonts w:ascii="Tahoma" w:cs="Tahoma" w:eastAsia="Tahoma" w:hAnsi="Tahoma"/>
+                <w:color w:val="222222"/>
+                <w:sz w:val="18"/>
+                <w:szCs w:val="18"/>
+              </w:rPr>
+              <w:t xml:space="preserve">101–200</w:t>
+            </w:r>
+          </w:p>
+        </w:tc>
+        <w:tc>
+          <w:tcPr>
+            <w:tcW w:type="dxa" w:w="1520"/>
+            <w:tcBorders>
+              <w:top w:val="single" w:color="BFB3AA" w:sz="4"/>
+              <w:left w:val="single" w:color="BFB3AA" w:sz="4"/>
+              <w:bottom w:val="single" w:color="BFB3AA" w:sz="4"/>
+              <w:right w:val="single" w:color="BFB3AA" w:sz="4"/>
+            </w:tcBorders>
+            <w:tcMar>
+              <w:top w:type="dxa" w:w="60"/>
+              <w:left w:type="dxa" w:w="120"/>
+              <w:bottom w:type="dxa" w:w="60"/>
+              <w:right w:type="dxa" w:w="120"/>
+            </w:tcMar>
+            <w:vAlign w:val="center"/>
+          </w:tcPr>
+          <w:p>
+            <w:r>
+              <w:rPr>
+                <w:rFonts w:ascii="Tahoma" w:cs="Tahoma" w:eastAsia="Tahoma" w:hAnsi="Tahoma"/>
+                <w:color w:val="222222"/>
+                <w:sz w:val="18"/>
+                <w:szCs w:val="18"/>
+              </w:rPr>
+              <w:t xml:space="preserve">3</w:t>
+            </w:r>
+          </w:p>
+        </w:tc>
+        <w:tc>
+          <w:tcPr>
+            <w:tcW w:type="dxa" w:w="1120"/>
+            <w:tcBorders>
+              <w:top w:val="single" w:color="BFB3AA" w:sz="4"/>
+              <w:left w:val="single" w:color="BFB3AA" w:sz="4"/>
+              <w:bottom w:val="single" w:color="BFB3AA" w:sz="4"/>
+              <w:right w:val="single" w:color="BFB3AA" w:sz="4"/>
+            </w:tcBorders>
+            <w:tcMar>
+              <w:top w:type="dxa" w:w="60"/>
+              <w:left w:type="dxa" w:w="120"/>
+              <w:bottom w:type="dxa" w:w="60"/>
+              <w:right w:type="dxa" w:w="120"/>
+            </w:tcMar>
+            <w:vAlign w:val="center"/>
+          </w:tcPr>
+          <w:p>
+            <w:r>
+              <w:rPr>
+                <w:rFonts w:ascii="Tahoma" w:cs="Tahoma" w:eastAsia="Tahoma" w:hAnsi="Tahoma"/>
+                <w:color w:val="222222"/>
+                <w:sz w:val="18"/>
+                <w:szCs w:val="18"/>
+              </w:rPr>
+              <w:t xml:space="preserve">1</w:t>
+            </w:r>
+          </w:p>
+        </w:tc>
+        <w:tc>
+          <w:tcPr>
+            <w:tcW w:type="dxa" w:w="1120"/>
+            <w:tcBorders>
+              <w:top w:val="single" w:color="BFB3AA" w:sz="4"/>
+              <w:left w:val="single" w:color="BFB3AA" w:sz="4"/>
+              <w:bottom w:val="single" w:color="BFB3AA" w:sz="4"/>
+              <w:right w:val="single" w:color="BFB3AA" w:sz="4"/>
+            </w:tcBorders>
+            <w:tcMar>
+              <w:top w:type="dxa" w:w="60"/>
+              <w:left w:type="dxa" w:w="120"/>
+              <w:bottom w:type="dxa" w:w="60"/>
+              <w:right w:type="dxa" w:w="120"/>
+            </w:tcMar>
+            <w:vAlign w:val="center"/>
+          </w:tcPr>
+          <w:p>
+            <w:r>
+              <w:rPr>
+                <w:rFonts w:ascii="Tahoma" w:cs="Tahoma" w:eastAsia="Tahoma" w:hAnsi="Tahoma"/>
+                <w:color w:val="222222"/>
+                <w:sz w:val="18"/>
+                <w:szCs w:val="18"/>
+              </w:rPr>
+              <w:t xml:space="preserve">2</w:t>
+            </w:r>
+          </w:p>
+        </w:tc>
+        <w:tc>
+          <w:tcPr>
+            <w:tcW w:type="dxa" w:w="1120"/>
+            <w:tcBorders>
+              <w:top w:val="single" w:color="BFB3AA" w:sz="4"/>
+              <w:left w:val="single" w:color="BFB3AA" w:sz="4"/>
+              <w:bottom w:val="single" w:color="BFB3AA" w:sz="4"/>
+              <w:right w:val="single" w:color="BFB3AA" w:sz="4"/>
+            </w:tcBorders>
+            <w:tcMar>
+              <w:top w:type="dxa" w:w="60"/>
+              <w:left w:type="dxa" w:w="120"/>
+              <w:bottom w:type="dxa" w:w="60"/>
+              <w:right w:type="dxa" w:w="120"/>
+            </w:tcMar>
+            <w:vAlign w:val="center"/>
+          </w:tcPr>
+          <w:p>
+            <w:r>
+              <w:rPr>
+                <w:rFonts w:ascii="Tahoma" w:cs="Tahoma" w:eastAsia="Tahoma" w:hAnsi="Tahoma"/>
+                <w:color w:val="222222"/>
+                <w:sz w:val="18"/>
+                <w:szCs w:val="18"/>
+              </w:rPr>
+              <w:t xml:space="preserve">2</w:t>
+            </w:r>
+          </w:p>
+        </w:tc>
+        <w:tc>
+          <w:tcPr>
+            <w:tcW w:type="dxa" w:w="1220"/>
+            <w:tcBorders>
+              <w:top w:val="single" w:color="BFB3AA" w:sz="4"/>
+              <w:left w:val="single" w:color="BFB3AA" w:sz="4"/>
+              <w:bottom w:val="single" w:color="BFB3AA" w:sz="4"/>
+              <w:right w:val="single" w:color="BFB3AA" w:sz="4"/>
+            </w:tcBorders>
+            <w:tcMar>
+              <w:top w:type="dxa" w:w="60"/>
+              <w:left w:type="dxa" w:w="120"/>
+              <w:bottom w:type="dxa" w:w="60"/>
+              <w:right w:type="dxa" w:w="120"/>
+            </w:tcMar>
+            <w:vAlign w:val="center"/>
+          </w:tcPr>
+          <w:p>
+            <w:r>
+              <w:rPr>
+                <w:rFonts w:ascii="Tahoma" w:cs="Tahoma" w:eastAsia="Tahoma" w:hAnsi="Tahoma"/>
+                <w:color w:val="222222"/>
+                <w:sz w:val="18"/>
+                <w:szCs w:val="18"/>
+              </w:rPr>
+              <w:t xml:space="preserve">1</w:t>
+            </w:r>
+          </w:p>
+        </w:tc>
+        <w:tc>
+          <w:tcPr>
+            <w:tcW w:type="dxa" w:w="1220"/>
+            <w:tcBorders>
+              <w:top w:val="single" w:color="BFB3AA" w:sz="4"/>
+              <w:left w:val="single" w:color="BFB3AA" w:sz="4"/>
+              <w:bottom w:val="single" w:color="BFB3AA" w:sz="4"/>
+              <w:right w:val="single" w:color="BFB3AA" w:sz="4"/>
+            </w:tcBorders>
+            <w:tcMar>
+              <w:top w:type="dxa" w:w="60"/>
+              <w:left w:type="dxa" w:w="120"/>
+              <w:bottom w:type="dxa" w:w="60"/>
+              <w:right w:type="dxa" w:w="120"/>
+            </w:tcMar>
+            <w:vAlign w:val="center"/>
+          </w:tcPr>
+          <w:p>
+            <w:r>
+              <w:rPr>
+                <w:rFonts w:ascii="Tahoma" w:cs="Tahoma" w:eastAsia="Tahoma" w:hAnsi="Tahoma"/>
+                <w:color w:val="222222"/>
+                <w:sz w:val="18"/>
+                <w:szCs w:val="18"/>
+              </w:rPr>
+              <w:t xml:space="preserve">2</w:t>
+            </w:r>
+          </w:p>
+        </w:tc>
+      </w:tr>
+      <w:tr>
+        <w:tc>
+          <w:tcPr>
+            <w:tcW w:type="dxa" w:w="2040"/>
+            <w:tcBorders>
+              <w:top w:val="single" w:color="BFB3AA" w:sz="4"/>
+              <w:left w:val="single" w:color="BFB3AA" w:sz="4"/>
+              <w:bottom w:val="single" w:color="BFB3AA" w:sz="4"/>
+              <w:right w:val="single" w:color="BFB3AA" w:sz="4"/>
+            </w:tcBorders>
+            <w:tcMar>
+              <w:top w:type="dxa" w:w="60"/>
+              <w:left w:type="dxa" w:w="120"/>
+              <w:bottom w:type="dxa" w:w="60"/>
+              <w:right w:type="dxa" w:w="120"/>
+            </w:tcMar>
+            <w:vAlign w:val="center"/>
+          </w:tcPr>
+          <w:p>
+            <w:r>
+              <w:rPr>
+                <w:rFonts w:ascii="Tahoma" w:cs="Tahoma" w:eastAsia="Tahoma" w:hAnsi="Tahoma"/>
+                <w:color w:val="222222"/>
+                <w:sz w:val="18"/>
+                <w:szCs w:val="18"/>
+              </w:rPr>
+              <w:t xml:space="preserve">201–300</w:t>
+            </w:r>
+          </w:p>
+        </w:tc>
+        <w:tc>
+          <w:tcPr>
+            <w:tcW w:type="dxa" w:w="1520"/>
+            <w:tcBorders>
+              <w:top w:val="single" w:color="BFB3AA" w:sz="4"/>
+              <w:left w:val="single" w:color="BFB3AA" w:sz="4"/>
+              <w:bottom w:val="single" w:color="BFB3AA" w:sz="4"/>
+              <w:right w:val="single" w:color="BFB3AA" w:sz="4"/>
+            </w:tcBorders>
+            <w:tcMar>
+              <w:top w:type="dxa" w:w="60"/>
+              <w:left w:type="dxa" w:w="120"/>
+              <w:bottom w:type="dxa" w:w="60"/>
+              <w:right w:type="dxa" w:w="120"/>
+            </w:tcMar>
+            <w:vAlign w:val="center"/>
+          </w:tcPr>
+          <w:p>
+            <w:r>
+              <w:rPr>
+                <w:rFonts w:ascii="Tahoma" w:cs="Tahoma" w:eastAsia="Tahoma" w:hAnsi="Tahoma"/>
+                <w:color w:val="222222"/>
+                <w:sz w:val="18"/>
+                <w:szCs w:val="18"/>
+              </w:rPr>
+              <w:t xml:space="preserve">4</w:t>
+            </w:r>
+          </w:p>
+        </w:tc>
+        <w:tc>
+          <w:tcPr>
+            <w:tcW w:type="dxa" w:w="1120"/>
+            <w:tcBorders>
+              <w:top w:val="single" w:color="BFB3AA" w:sz="4"/>
+              <w:left w:val="single" w:color="BFB3AA" w:sz="4"/>
+              <w:bottom w:val="single" w:color="BFB3AA" w:sz="4"/>
+              <w:right w:val="single" w:color="BFB3AA" w:sz="4"/>
+            </w:tcBorders>
+            <w:tcMar>
+              <w:top w:type="dxa" w:w="60"/>
+              <w:left w:type="dxa" w:w="120"/>
+              <w:bottom w:type="dxa" w:w="60"/>
+              <w:right w:type="dxa" w:w="120"/>
+            </w:tcMar>
+            <w:vAlign w:val="center"/>
+          </w:tcPr>
+          <w:p>
+            <w:r>
+              <w:rPr>
+                <w:rFonts w:ascii="Tahoma" w:cs="Tahoma" w:eastAsia="Tahoma" w:hAnsi="Tahoma"/>
+                <w:color w:val="222222"/>
+                <w:sz w:val="18"/>
+                <w:szCs w:val="18"/>
+              </w:rPr>
+              <w:t xml:space="preserve">1</w:t>
+            </w:r>
+          </w:p>
+        </w:tc>
+        <w:tc>
+          <w:tcPr>
+            <w:tcW w:type="dxa" w:w="1120"/>
+            <w:tcBorders>
+              <w:top w:val="single" w:color="BFB3AA" w:sz="4"/>
+              <w:left w:val="single" w:color="BFB3AA" w:sz="4"/>
+              <w:bottom w:val="single" w:color="BFB3AA" w:sz="4"/>
+              <w:right w:val="single" w:color="BFB3AA" w:sz="4"/>
+            </w:tcBorders>
+            <w:tcMar>
+              <w:top w:type="dxa" w:w="60"/>
+              <w:left w:type="dxa" w:w="120"/>
+              <w:bottom w:type="dxa" w:w="60"/>
+              <w:right w:type="dxa" w:w="120"/>
+            </w:tcMar>
+            <w:vAlign w:val="center"/>
+          </w:tcPr>
+          <w:p>
+            <w:r>
+              <w:rPr>
+                <w:rFonts w:ascii="Tahoma" w:cs="Tahoma" w:eastAsia="Tahoma" w:hAnsi="Tahoma"/>
+                <w:color w:val="222222"/>
+                <w:sz w:val="18"/>
+                <w:szCs w:val="18"/>
+              </w:rPr>
+              <w:t xml:space="preserve">2</w:t>
+            </w:r>
+          </w:p>
+        </w:tc>
+        <w:tc>
+          <w:tcPr>
+            <w:tcW w:type="dxa" w:w="1120"/>
+            <w:tcBorders>
+              <w:top w:val="single" w:color="BFB3AA" w:sz="4"/>
+              <w:left w:val="single" w:color="BFB3AA" w:sz="4"/>
+              <w:bottom w:val="single" w:color="BFB3AA" w:sz="4"/>
+              <w:right w:val="single" w:color="BFB3AA" w:sz="4"/>
+            </w:tcBorders>
+            <w:tcMar>
+              <w:top w:type="dxa" w:w="60"/>
+              <w:left w:type="dxa" w:w="120"/>
+              <w:bottom w:type="dxa" w:w="60"/>
+              <w:right w:type="dxa" w:w="120"/>
+            </w:tcMar>
+            <w:vAlign w:val="center"/>
+          </w:tcPr>
+          <w:p>
+            <w:r>
+              <w:rPr>
+                <w:rFonts w:ascii="Tahoma" w:cs="Tahoma" w:eastAsia="Tahoma" w:hAnsi="Tahoma"/>
+                <w:color w:val="222222"/>
+                <w:sz w:val="18"/>
+                <w:szCs w:val="18"/>
+              </w:rPr>
+              <w:t xml:space="preserve">3</w:t>
+            </w:r>
+          </w:p>
+        </w:tc>
+        <w:tc>
+          <w:tcPr>
+            <w:tcW w:type="dxa" w:w="1220"/>
+            <w:tcBorders>
+              <w:top w:val="single" w:color="BFB3AA" w:sz="4"/>
+              <w:left w:val="single" w:color="BFB3AA" w:sz="4"/>
+              <w:bottom w:val="single" w:color="BFB3AA" w:sz="4"/>
+              <w:right w:val="single" w:color="BFB3AA" w:sz="4"/>
+            </w:tcBorders>
+            <w:tcMar>
+              <w:top w:type="dxa" w:w="60"/>
+              <w:left w:type="dxa" w:w="120"/>
+              <w:bottom w:type="dxa" w:w="60"/>
+              <w:right w:type="dxa" w:w="120"/>
+            </w:tcMar>
+            <w:vAlign w:val="center"/>
+          </w:tcPr>
+          <w:p>
+            <w:r>
+              <w:rPr>
+                <w:rFonts w:ascii="Tahoma" w:cs="Tahoma" w:eastAsia="Tahoma" w:hAnsi="Tahoma"/>
+                <w:color w:val="222222"/>
+                <w:sz w:val="18"/>
+                <w:szCs w:val="18"/>
+              </w:rPr>
+              <w:t xml:space="preserve">2</w:t>
+            </w:r>
+          </w:p>
+        </w:tc>
+        <w:tc>
+          <w:tcPr>
+            <w:tcW w:type="dxa" w:w="1220"/>
+            <w:tcBorders>
+              <w:top w:val="single" w:color="BFB3AA" w:sz="4"/>
+              <w:left w:val="single" w:color="BFB3AA" w:sz="4"/>
+              <w:bottom w:val="single" w:color="BFB3AA" w:sz="4"/>
+              <w:right w:val="single" w:color="BFB3AA" w:sz="4"/>
+            </w:tcBorders>
+            <w:tcMar>
+              <w:top w:type="dxa" w:w="60"/>
+              <w:left w:type="dxa" w:w="120"/>
+              <w:bottom w:type="dxa" w:w="60"/>
+              <w:right w:type="dxa" w:w="120"/>
+            </w:tcMar>
+            <w:vAlign w:val="center"/>
+          </w:tcPr>
+          <w:p>
+            <w:r>
+              <w:rPr>
+                <w:rFonts w:ascii="Tahoma" w:cs="Tahoma" w:eastAsia="Tahoma" w:hAnsi="Tahoma"/>
+                <w:color w:val="222222"/>
+                <w:sz w:val="18"/>
+                <w:szCs w:val="18"/>
+              </w:rPr>
+              <w:t xml:space="preserve">2</w:t>
+            </w:r>
+          </w:p>
+        </w:tc>
+      </w:tr>
+      <w:tr>
+        <w:tc>
+          <w:tcPr>
+            <w:tcW w:type="dxa" w:w="2040"/>
+            <w:tcBorders>
+              <w:top w:val="single" w:color="BFB3AA" w:sz="4"/>
+              <w:left w:val="single" w:color="BFB3AA" w:sz="4"/>
+              <w:bottom w:val="single" w:color="BFB3AA" w:sz="4"/>
+              <w:right w:val="single" w:color="BFB3AA" w:sz="4"/>
+            </w:tcBorders>
+            <w:tcMar>
+              <w:top w:type="dxa" w:w="60"/>
+              <w:left w:type="dxa" w:w="120"/>
+              <w:bottom w:type="dxa" w:w="60"/>
+              <w:right w:type="dxa" w:w="120"/>
+            </w:tcMar>
+            <w:vAlign w:val="center"/>
+          </w:tcPr>
+          <w:p>
+            <w:r>
+              <w:rPr>
+                <w:rFonts w:ascii="Tahoma" w:cs="Tahoma" w:eastAsia="Tahoma" w:hAnsi="Tahoma"/>
+                <w:color w:val="222222"/>
+                <w:sz w:val="18"/>
+                <w:szCs w:val="18"/>
+              </w:rPr>
+              <w:t xml:space="preserve">301–400</w:t>
+            </w:r>
+          </w:p>
+        </w:tc>
+        <w:tc>
+          <w:tcPr>
+            <w:tcW w:type="dxa" w:w="1520"/>
+            <w:tcBorders>
+              <w:top w:val="single" w:color="BFB3AA" w:sz="4"/>
+              <w:left w:val="single" w:color="BFB3AA" w:sz="4"/>
+              <w:bottom w:val="single" w:color="BFB3AA" w:sz="4"/>
+              <w:right w:val="single" w:color="BFB3AA" w:sz="4"/>
+            </w:tcBorders>
+            <w:tcMar>
+              <w:top w:type="dxa" w:w="60"/>
+              <w:left w:type="dxa" w:w="120"/>
+              <w:bottom w:type="dxa" w:w="60"/>
+              <w:right w:type="dxa" w:w="120"/>
+            </w:tcMar>
+            <w:vAlign w:val="center"/>
+          </w:tcPr>
+          <w:p>
+            <w:r>
+              <w:rPr>
+                <w:rFonts w:ascii="Tahoma" w:cs="Tahoma" w:eastAsia="Tahoma" w:hAnsi="Tahoma"/>
+                <w:color w:val="222222"/>
+                <w:sz w:val="18"/>
+                <w:szCs w:val="18"/>
+              </w:rPr>
+              <w:t xml:space="preserve">5</w:t>
+            </w:r>
+          </w:p>
+        </w:tc>
+        <w:tc>
+          <w:tcPr>
+            <w:tcW w:type="dxa" w:w="1120"/>
+            <w:tcBorders>
+              <w:top w:val="single" w:color="BFB3AA" w:sz="4"/>
+              <w:left w:val="single" w:color="BFB3AA" w:sz="4"/>
+              <w:bottom w:val="single" w:color="BFB3AA" w:sz="4"/>
+              <w:right w:val="single" w:color="BFB3AA" w:sz="4"/>
+            </w:tcBorders>
+            <w:tcMar>
+              <w:top w:type="dxa" w:w="60"/>
+              <w:left w:type="dxa" w:w="120"/>
+              <w:bottom w:type="dxa" w:w="60"/>
+              <w:right w:type="dxa" w:w="120"/>
+            </w:tcMar>
+            <w:vAlign w:val="center"/>
+          </w:tcPr>
+          <w:p>
+            <w:r>
+              <w:rPr>
+                <w:rFonts w:ascii="Tahoma" w:cs="Tahoma" w:eastAsia="Tahoma" w:hAnsi="Tahoma"/>
+                <w:color w:val="222222"/>
+                <w:sz w:val="18"/>
+                <w:szCs w:val="18"/>
+              </w:rPr>
+              <w:t xml:space="preserve">2</w:t>
+            </w:r>
+          </w:p>
+        </w:tc>
+        <w:tc>
+          <w:tcPr>
+            <w:tcW w:type="dxa" w:w="1120"/>
+            <w:tcBorders>
+              <w:top w:val="single" w:color="BFB3AA" w:sz="4"/>
+              <w:left w:val="single" w:color="BFB3AA" w:sz="4"/>
+              <w:bottom w:val="single" w:color="BFB3AA" w:sz="4"/>
+              <w:right w:val="single" w:color="BFB3AA" w:sz="4"/>
+            </w:tcBorders>
+            <w:tcMar>
+              <w:top w:type="dxa" w:w="60"/>
+              <w:left w:type="dxa" w:w="120"/>
+              <w:bottom w:type="dxa" w:w="60"/>
+              <w:right w:type="dxa" w:w="120"/>
+            </w:tcMar>
+            <w:vAlign w:val="center"/>
+          </w:tcPr>
+          <w:p>
+            <w:r>
+              <w:rPr>
+                <w:rFonts w:ascii="Tahoma" w:cs="Tahoma" w:eastAsia="Tahoma" w:hAnsi="Tahoma"/>
+                <w:color w:val="222222"/>
+                <w:sz w:val="18"/>
+                <w:szCs w:val="18"/>
+              </w:rPr>
+              <w:t xml:space="preserve">3</w:t>
+            </w:r>
+          </w:p>
+        </w:tc>
+        <w:tc>
+          <w:tcPr>
+            <w:tcW w:type="dxa" w:w="1120"/>
+            <w:tcBorders>
+              <w:top w:val="single" w:color="BFB3AA" w:sz="4"/>
+              <w:left w:val="single" w:color="BFB3AA" w:sz="4"/>
+              <w:bottom w:val="single" w:color="BFB3AA" w:sz="4"/>
+              <w:right w:val="single" w:color="BFB3AA" w:sz="4"/>
+            </w:tcBorders>
+            <w:tcMar>
+              <w:top w:type="dxa" w:w="60"/>
+              <w:left w:type="dxa" w:w="120"/>
+              <w:bottom w:type="dxa" w:w="60"/>
+              <w:right w:type="dxa" w:w="120"/>
+            </w:tcMar>
+            <w:vAlign w:val="center"/>
+          </w:tcPr>
+          <w:p>
+            <w:r>
+              <w:rPr>
+                <w:rFonts w:ascii="Tahoma" w:cs="Tahoma" w:eastAsia="Tahoma" w:hAnsi="Tahoma"/>
+                <w:color w:val="222222"/>
+                <w:sz w:val="18"/>
+                <w:szCs w:val="18"/>
+              </w:rPr>
+              <w:t xml:space="preserve">4</w:t>
+            </w:r>
+          </w:p>
+        </w:tc>
+        <w:tc>
+          <w:tcPr>
+            <w:tcW w:type="dxa" w:w="1220"/>
+            <w:tcBorders>
+              <w:top w:val="single" w:color="BFB3AA" w:sz="4"/>
+              <w:left w:val="single" w:color="BFB3AA" w:sz="4"/>
+              <w:bottom w:val="single" w:color="BFB3AA" w:sz="4"/>
+              <w:right w:val="single" w:color="BFB3AA" w:sz="4"/>
+            </w:tcBorders>
+            <w:tcMar>
+              <w:top w:type="dxa" w:w="60"/>
+              <w:left w:type="dxa" w:w="120"/>
+              <w:bottom w:type="dxa" w:w="60"/>
+              <w:right w:type="dxa" w:w="120"/>
+            </w:tcMar>
+            <w:vAlign w:val="center"/>
+          </w:tcPr>
+          <w:p>
+            <w:r>
+              <w:rPr>
+                <w:rFonts w:ascii="Tahoma" w:cs="Tahoma" w:eastAsia="Tahoma" w:hAnsi="Tahoma"/>
+                <w:color w:val="222222"/>
+                <w:sz w:val="18"/>
+                <w:szCs w:val="18"/>
+              </w:rPr>
+              <w:t xml:space="preserve">2</w:t>
+            </w:r>
+          </w:p>
+        </w:tc>
+        <w:tc>
+          <w:tcPr>
+            <w:tcW w:type="dxa" w:w="1220"/>
+            <w:tcBorders>
+              <w:top w:val="single" w:color="BFB3AA" w:sz="4"/>
+              <w:left w:val="single" w:color="BFB3AA" w:sz="4"/>
+              <w:bottom w:val="single" w:color="BFB3AA" w:sz="4"/>
+              <w:right w:val="single" w:color="BFB3AA" w:sz="4"/>
+            </w:tcBorders>
+            <w:tcMar>
+              <w:top w:type="dxa" w:w="60"/>
+              <w:left w:type="dxa" w:w="120"/>
+              <w:bottom w:type="dxa" w:w="60"/>
+              <w:right w:type="dxa" w:w="120"/>
+            </w:tcMar>
+            <w:vAlign w:val="center"/>
+          </w:tcPr>
+          <w:p>
+            <w:r>
+              <w:rPr>
+                <w:rFonts w:ascii="Tahoma" w:cs="Tahoma" w:eastAsia="Tahoma" w:hAnsi="Tahoma"/>
+                <w:color w:val="222222"/>
+                <w:sz w:val="18"/>
+                <w:szCs w:val="18"/>
+              </w:rPr>
+              <w:t xml:space="preserve">3</w:t>
+            </w:r>
+          </w:p>
+        </w:tc>
+      </w:tr>
+      <w:tr>
+        <w:tc>
+          <w:tcPr>
+            <w:tcW w:type="dxa" w:w="2040"/>
+            <w:tcBorders>
+              <w:top w:val="single" w:color="BFB3AA" w:sz="4"/>
+              <w:left w:val="single" w:color="BFB3AA" w:sz="4"/>
+              <w:bottom w:val="single" w:color="BFB3AA" w:sz="4"/>
+              <w:right w:val="single" w:color="BFB3AA" w:sz="4"/>
+            </w:tcBorders>
+            <w:tcMar>
+              <w:top w:type="dxa" w:w="60"/>
+              <w:left w:type="dxa" w:w="120"/>
+              <w:bottom w:type="dxa" w:w="60"/>
+              <w:right w:type="dxa" w:w="120"/>
+            </w:tcMar>
+            <w:vAlign w:val="center"/>
+          </w:tcPr>
+          <w:p>
+            <w:r>
+              <w:rPr>
+                <w:rFonts w:ascii="Tahoma" w:cs="Tahoma" w:eastAsia="Tahoma" w:hAnsi="Tahoma"/>
+                <w:color w:val="222222"/>
+                <w:sz w:val="18"/>
+                <w:szCs w:val="18"/>
+              </w:rPr>
+              <w:t xml:space="preserve">401–500</w:t>
+            </w:r>
+          </w:p>
+        </w:tc>
+        <w:tc>
+          <w:tcPr>
+            <w:tcW w:type="dxa" w:w="1520"/>
+            <w:tcBorders>
+              <w:top w:val="single" w:color="BFB3AA" w:sz="4"/>
+              <w:left w:val="single" w:color="BFB3AA" w:sz="4"/>
+              <w:bottom w:val="single" w:color="BFB3AA" w:sz="4"/>
+              <w:right w:val="single" w:color="BFB3AA" w:sz="4"/>
+            </w:tcBorders>
+            <w:tcMar>
+              <w:top w:type="dxa" w:w="60"/>
+              <w:left w:type="dxa" w:w="120"/>
+              <w:bottom w:type="dxa" w:w="60"/>
+              <w:right w:type="dxa" w:w="120"/>
+            </w:tcMar>
+            <w:vAlign w:val="center"/>
+          </w:tcPr>
+          <w:p>
+            <w:r>
+              <w:rPr>
+                <w:rFonts w:ascii="Tahoma" w:cs="Tahoma" w:eastAsia="Tahoma" w:hAnsi="Tahoma"/>
+                <w:color w:val="222222"/>
+                <w:sz w:val="18"/>
+                <w:szCs w:val="18"/>
+              </w:rPr>
+              <w:t xml:space="preserve">6</w:t>
+            </w:r>
+          </w:p>
+        </w:tc>
+        <w:tc>
+          <w:tcPr>
+            <w:tcW w:type="dxa" w:w="1120"/>
+            <w:tcBorders>
+              <w:top w:val="single" w:color="BFB3AA" w:sz="4"/>
+              <w:left w:val="single" w:color="BFB3AA" w:sz="4"/>
+              <w:bottom w:val="single" w:color="BFB3AA" w:sz="4"/>
+              <w:right w:val="single" w:color="BFB3AA" w:sz="4"/>
+            </w:tcBorders>
+            <w:tcMar>
+              <w:top w:type="dxa" w:w="60"/>
+              <w:left w:type="dxa" w:w="120"/>
+              <w:bottom w:type="dxa" w:w="60"/>
+              <w:right w:type="dxa" w:w="120"/>
+            </w:tcMar>
+            <w:vAlign w:val="center"/>
+          </w:tcPr>
+          <w:p>
+            <w:r>
+              <w:rPr>
+                <w:rFonts w:ascii="Tahoma" w:cs="Tahoma" w:eastAsia="Tahoma" w:hAnsi="Tahoma"/>
+                <w:color w:val="222222"/>
+                <w:sz w:val="18"/>
+                <w:szCs w:val="18"/>
+              </w:rPr>
+              <w:t xml:space="preserve">2</w:t>
+            </w:r>
+          </w:p>
+        </w:tc>
+        <w:tc>
+          <w:tcPr>
+            <w:tcW w:type="dxa" w:w="1120"/>
+            <w:tcBorders>
+              <w:top w:val="single" w:color="BFB3AA" w:sz="4"/>
+              <w:left w:val="single" w:color="BFB3AA" w:sz="4"/>
+              <w:bottom w:val="single" w:color="BFB3AA" w:sz="4"/>
+              <w:right w:val="single" w:color="BFB3AA" w:sz="4"/>
+            </w:tcBorders>
+            <w:tcMar>
+              <w:top w:type="dxa" w:w="60"/>
+              <w:left w:type="dxa" w:w="120"/>
+              <w:bottom w:type="dxa" w:w="60"/>
+              <w:right w:type="dxa" w:w="120"/>
+            </w:tcMar>
+            <w:vAlign w:val="center"/>
+          </w:tcPr>
+          <w:p>
+            <w:r>
+              <w:rPr>
+                <w:rFonts w:ascii="Tahoma" w:cs="Tahoma" w:eastAsia="Tahoma" w:hAnsi="Tahoma"/>
+                <w:color w:val="222222"/>
+                <w:sz w:val="18"/>
+                <w:szCs w:val="18"/>
+              </w:rPr>
+              <w:t xml:space="preserve">3</w:t>
+            </w:r>
+          </w:p>
+        </w:tc>
+        <w:tc>
+          <w:tcPr>
+            <w:tcW w:type="dxa" w:w="1120"/>
+            <w:tcBorders>
+              <w:top w:val="single" w:color="BFB3AA" w:sz="4"/>
+              <w:left w:val="single" w:color="BFB3AA" w:sz="4"/>
+              <w:bottom w:val="single" w:color="BFB3AA" w:sz="4"/>
+              <w:right w:val="single" w:color="BFB3AA" w:sz="4"/>
+            </w:tcBorders>
+            <w:tcMar>
+              <w:top w:type="dxa" w:w="60"/>
+              <w:left w:type="dxa" w:w="120"/>
+              <w:bottom w:type="dxa" w:w="60"/>
+              <w:right w:type="dxa" w:w="120"/>
+            </w:tcMar>
+            <w:vAlign w:val="center"/>
+          </w:tcPr>
+          <w:p>
+            <w:r>
+              <w:rPr>
+                <w:rFonts w:ascii="Tahoma" w:cs="Tahoma" w:eastAsia="Tahoma" w:hAnsi="Tahoma"/>
+                <w:color w:val="222222"/>
+                <w:sz w:val="18"/>
+                <w:szCs w:val="18"/>
+              </w:rPr>
+              <w:t xml:space="preserve">4</w:t>
+            </w:r>
+          </w:p>
+        </w:tc>
+        <w:tc>
+          <w:tcPr>
+            <w:tcW w:type="dxa" w:w="1220"/>
+            <w:tcBorders>
+              <w:top w:val="single" w:color="BFB3AA" w:sz="4"/>
+              <w:left w:val="single" w:color="BFB3AA" w:sz="4"/>
+              <w:bottom w:val="single" w:color="BFB3AA" w:sz="4"/>
+              <w:right w:val="single" w:color="BFB3AA" w:sz="4"/>
+            </w:tcBorders>
+            <w:tcMar>
+              <w:top w:type="dxa" w:w="60"/>
+              <w:left w:type="dxa" w:w="120"/>
+              <w:bottom w:type="dxa" w:w="60"/>
+              <w:right w:type="dxa" w:w="120"/>
+            </w:tcMar>
+            <w:vAlign w:val="center"/>
+          </w:tcPr>
+          <w:p>
+            <w:r>
+              <w:rPr>
+                <w:rFonts w:ascii="Tahoma" w:cs="Tahoma" w:eastAsia="Tahoma" w:hAnsi="Tahoma"/>
+                <w:color w:val="222222"/>
+                <w:sz w:val="18"/>
+                <w:szCs w:val="18"/>
+              </w:rPr>
+              <w:t xml:space="preserve">2</w:t>
+            </w:r>
+          </w:p>
+        </w:tc>
+        <w:tc>
+          <w:tcPr>
+            <w:tcW w:type="dxa" w:w="1220"/>
+            <w:tcBorders>
+              <w:top w:val="single" w:color="BFB3AA" w:sz="4"/>
+              <w:left w:val="single" w:color="BFB3AA" w:sz="4"/>
+              <w:bottom w:val="single" w:color="BFB3AA" w:sz="4"/>
+              <w:right w:val="single" w:color="BFB3AA" w:sz="4"/>
+            </w:tcBorders>
+            <w:tcMar>
+              <w:top w:type="dxa" w:w="60"/>
+              <w:left w:type="dxa" w:w="120"/>
+              <w:bottom w:type="dxa" w:w="60"/>
+              <w:right w:type="dxa" w:w="120"/>
+            </w:tcMar>
+            <w:vAlign w:val="center"/>
+          </w:tcPr>
+          <w:p>
+            <w:r>
+              <w:rPr>
+                <w:rFonts w:ascii="Tahoma" w:cs="Tahoma" w:eastAsia="Tahoma" w:hAnsi="Tahoma"/>
+                <w:color w:val="222222"/>
+                <w:sz w:val="18"/>
+                <w:szCs w:val="18"/>
+              </w:rPr>
+              <w:t xml:space="preserve">4</w:t>
+            </w:r>
+          </w:p>
+        </w:tc>
+      </w:tr>
+      <w:tr>
+        <w:tc>
+          <w:tcPr>
+            <w:tcW w:type="dxa" w:w="2040"/>
+            <w:tcBorders>
+              <w:top w:val="single" w:color="BFB3AA" w:sz="4"/>
+              <w:left w:val="single" w:color="BFB3AA" w:sz="4"/>
+              <w:bottom w:val="single" w:color="BFB3AA" w:sz="4"/>
+              <w:right w:val="single" w:color="BFB3AA" w:sz="4"/>
+            </w:tcBorders>
+            <w:tcMar>
+              <w:top w:type="dxa" w:w="60"/>
+              <w:left w:type="dxa" w:w="120"/>
+              <w:bottom w:type="dxa" w:w="60"/>
+              <w:right w:type="dxa" w:w="120"/>
+            </w:tcMar>
+            <w:vAlign w:val="center"/>
+          </w:tcPr>
+          <w:p>
+            <w:r>
+              <w:rPr>
+                <w:rFonts w:ascii="Tahoma" w:cs="Tahoma" w:eastAsia="Tahoma" w:hAnsi="Tahoma"/>
+                <w:color w:val="222222"/>
+                <w:sz w:val="18"/>
+                <w:szCs w:val="18"/>
+              </w:rPr>
+              <w:t xml:space="preserve">501–600</w:t>
+            </w:r>
+          </w:p>
+        </w:tc>
+        <w:tc>
+          <w:tcPr>
+            <w:tcW w:type="dxa" w:w="1520"/>
+            <w:tcBorders>
+              <w:top w:val="single" w:color="BFB3AA" w:sz="4"/>
+              <w:left w:val="single" w:color="BFB3AA" w:sz="4"/>
+              <w:bottom w:val="single" w:color="BFB3AA" w:sz="4"/>
+              <w:right w:val="single" w:color="BFB3AA" w:sz="4"/>
+            </w:tcBorders>
+            <w:tcMar>
+              <w:top w:type="dxa" w:w="60"/>
+              <w:left w:type="dxa" w:w="120"/>
+              <w:bottom w:type="dxa" w:w="60"/>
+              <w:right w:type="dxa" w:w="120"/>
+            </w:tcMar>
+            <w:vAlign w:val="center"/>
+          </w:tcPr>
+          <w:p>
+            <w:r>
+              <w:rPr>
+                <w:rFonts w:ascii="Tahoma" w:cs="Tahoma" w:eastAsia="Tahoma" w:hAnsi="Tahoma"/>
+                <w:color w:val="222222"/>
+                <w:sz w:val="18"/>
+                <w:szCs w:val="18"/>
+              </w:rPr>
+              <w:t xml:space="preserve">7</w:t>
+            </w:r>
+          </w:p>
+        </w:tc>
+        <w:tc>
+          <w:tcPr>
+            <w:tcW w:type="dxa" w:w="1120"/>
+            <w:tcBorders>
+              <w:top w:val="single" w:color="BFB3AA" w:sz="4"/>
+              <w:left w:val="single" w:color="BFB3AA" w:sz="4"/>
+              <w:bottom w:val="single" w:color="BFB3AA" w:sz="4"/>
+              <w:right w:val="single" w:color="BFB3AA" w:sz="4"/>
+            </w:tcBorders>
+            <w:tcMar>
+              <w:top w:type="dxa" w:w="60"/>
+              <w:left w:type="dxa" w:w="120"/>
+              <w:bottom w:type="dxa" w:w="60"/>
+              <w:right w:type="dxa" w:w="120"/>
+            </w:tcMar>
+            <w:vAlign w:val="center"/>
+          </w:tcPr>
+          <w:p>
+            <w:r>
+              <w:rPr>
+                <w:rFonts w:ascii="Tahoma" w:cs="Tahoma" w:eastAsia="Tahoma" w:hAnsi="Tahoma"/>
+                <w:color w:val="222222"/>
+                <w:sz w:val="18"/>
+                <w:szCs w:val="18"/>
+              </w:rPr>
+              <w:t xml:space="preserve">2</w:t>
+            </w:r>
+          </w:p>
+        </w:tc>
+        <w:tc>
+          <w:tcPr>
+            <w:tcW w:type="dxa" w:w="1120"/>
+            <w:tcBorders>
+              <w:top w:val="single" w:color="BFB3AA" w:sz="4"/>
+              <w:left w:val="single" w:color="BFB3AA" w:sz="4"/>
+              <w:bottom w:val="single" w:color="BFB3AA" w:sz="4"/>
+              <w:right w:val="single" w:color="BFB3AA" w:sz="4"/>
+            </w:tcBorders>
+            <w:tcMar>
+              <w:top w:type="dxa" w:w="60"/>
+              <w:left w:type="dxa" w:w="120"/>
+              <w:bottom w:type="dxa" w:w="60"/>
+              <w:right w:type="dxa" w:w="120"/>
+            </w:tcMar>
+            <w:vAlign w:val="center"/>
+          </w:tcPr>
+          <w:p>
+            <w:r>
+              <w:rPr>
+                <w:rFonts w:ascii="Tahoma" w:cs="Tahoma" w:eastAsia="Tahoma" w:hAnsi="Tahoma"/>
+                <w:color w:val="222222"/>
+                <w:sz w:val="18"/>
+                <w:szCs w:val="18"/>
+              </w:rPr>
+              <w:t xml:space="preserve">4</w:t>
+            </w:r>
+          </w:p>
+        </w:tc>
+        <w:tc>
+          <w:tcPr>
+            <w:tcW w:type="dxa" w:w="1120"/>
+            <w:tcBorders>
+              <w:top w:val="single" w:color="BFB3AA" w:sz="4"/>
+              <w:left w:val="single" w:color="BFB3AA" w:sz="4"/>
+              <w:bottom w:val="single" w:color="BFB3AA" w:sz="4"/>
+              <w:right w:val="single" w:color="BFB3AA" w:sz="4"/>
+            </w:tcBorders>
+            <w:tcMar>
+              <w:top w:type="dxa" w:w="60"/>
+              <w:left w:type="dxa" w:w="120"/>
+              <w:bottom w:type="dxa" w:w="60"/>
+              <w:right w:type="dxa" w:w="120"/>
+            </w:tcMar>
+            <w:vAlign w:val="center"/>
+          </w:tcPr>
+          <w:p>
+            <w:r>
+              <w:rPr>
+                <w:rFonts w:ascii="Tahoma" w:cs="Tahoma" w:eastAsia="Tahoma" w:hAnsi="Tahoma"/>
+                <w:color w:val="222222"/>
+                <w:sz w:val="18"/>
+                <w:szCs w:val="18"/>
+              </w:rPr>
+              <w:t xml:space="preserve">5</w:t>
+            </w:r>
+          </w:p>
+        </w:tc>
+        <w:tc>
+          <w:tcPr>
+            <w:tcW w:type="dxa" w:w="1220"/>
+            <w:tcBorders>
+              <w:top w:val="single" w:color="BFB3AA" w:sz="4"/>
+              <w:left w:val="single" w:color="BFB3AA" w:sz="4"/>
+              <w:bottom w:val="single" w:color="BFB3AA" w:sz="4"/>
+              <w:right w:val="single" w:color="BFB3AA" w:sz="4"/>
+            </w:tcBorders>
+            <w:tcMar>
+              <w:top w:type="dxa" w:w="60"/>
+              <w:left w:type="dxa" w:w="120"/>
+              <w:bottom w:type="dxa" w:w="60"/>
+              <w:right w:type="dxa" w:w="120"/>
+            </w:tcMar>
+            <w:vAlign w:val="center"/>
+          </w:tcPr>
+          <w:p>
+            <w:r>
+              <w:rPr>
+                <w:rFonts w:ascii="Tahoma" w:cs="Tahoma" w:eastAsia="Tahoma" w:hAnsi="Tahoma"/>
+                <w:color w:val="222222"/>
+                <w:sz w:val="18"/>
+                <w:szCs w:val="18"/>
+              </w:rPr>
+              <w:t xml:space="preserve">3</w:t>
+            </w:r>
+          </w:p>
+        </w:tc>
+        <w:tc>
+          <w:tcPr>
+            <w:tcW w:type="dxa" w:w="1220"/>
+            <w:tcBorders>
+              <w:top w:val="single" w:color="BFB3AA" w:sz="4"/>
+              <w:left w:val="single" w:color="BFB3AA" w:sz="4"/>
+              <w:bottom w:val="single" w:color="BFB3AA" w:sz="4"/>
+              <w:right w:val="single" w:color="BFB3AA" w:sz="4"/>
+            </w:tcBorders>
+            <w:tcMar>
+              <w:top w:type="dxa" w:w="60"/>
+              <w:left w:type="dxa" w:w="120"/>
+              <w:bottom w:type="dxa" w:w="60"/>
+              <w:right w:type="dxa" w:w="120"/>
+            </w:tcMar>
+            <w:vAlign w:val="center"/>
+          </w:tcPr>
+          <w:p>
+            <w:r>
+              <w:rPr>
+                <w:rFonts w:ascii="Tahoma" w:cs="Tahoma" w:eastAsia="Tahoma" w:hAnsi="Tahoma"/>
+                <w:color w:val="222222"/>
+                <w:sz w:val="18"/>
+                <w:szCs w:val="18"/>
+              </w:rPr>
+              <w:t xml:space="preserve">4</w:t>
+            </w:r>
+          </w:p>
+        </w:tc>
+      </w:tr>
+      <w:tr>
+        <w:tc>
+          <w:tcPr>
+            <w:tcW w:type="dxa" w:w="2040"/>
+            <w:tcBorders>
+              <w:top w:val="single" w:color="BFB3AA" w:sz="4"/>
+              <w:left w:val="single" w:color="BFB3AA" w:sz="4"/>
+              <w:bottom w:val="single" w:color="BFB3AA" w:sz="4"/>
+              <w:right w:val="single" w:color="BFB3AA" w:sz="4"/>
+            </w:tcBorders>
+            <w:tcMar>
+              <w:top w:type="dxa" w:w="60"/>
+              <w:left w:type="dxa" w:w="120"/>
+              <w:bottom w:type="dxa" w:w="60"/>
+              <w:right w:type="dxa" w:w="120"/>
+            </w:tcMar>
+            <w:vAlign w:val="center"/>
+          </w:tcPr>
+          <w:p>
+            <w:r>
+              <w:rPr>
+                <w:rFonts w:ascii="Tahoma" w:cs="Tahoma" w:eastAsia="Tahoma" w:hAnsi="Tahoma"/>
+                <w:color w:val="222222"/>
+                <w:sz w:val="18"/>
+                <w:szCs w:val="18"/>
+              </w:rPr>
+              <w:t xml:space="preserve">601–700</w:t>
+            </w:r>
+          </w:p>
+        </w:tc>
+        <w:tc>
+          <w:tcPr>
+            <w:tcW w:type="dxa" w:w="1520"/>
+            <w:tcBorders>
+              <w:top w:val="single" w:color="BFB3AA" w:sz="4"/>
+              <w:left w:val="single" w:color="BFB3AA" w:sz="4"/>
+              <w:bottom w:val="single" w:color="BFB3AA" w:sz="4"/>
+              <w:right w:val="single" w:color="BFB3AA" w:sz="4"/>
+            </w:tcBorders>
+            <w:tcMar>
+              <w:top w:type="dxa" w:w="60"/>
+              <w:left w:type="dxa" w:w="120"/>
+              <w:bottom w:type="dxa" w:w="60"/>
+              <w:right w:type="dxa" w:w="120"/>
+            </w:tcMar>
+            <w:vAlign w:val="center"/>
+          </w:tcPr>
+          <w:p>
+            <w:r>
+              <w:rPr>
+                <w:rFonts w:ascii="Tahoma" w:cs="Tahoma" w:eastAsia="Tahoma" w:hAnsi="Tahoma"/>
+                <w:color w:val="222222"/>
+                <w:sz w:val="18"/>
+                <w:szCs w:val="18"/>
+              </w:rPr>
+              <w:t xml:space="preserve">8</w:t>
+            </w:r>
+          </w:p>
+        </w:tc>
+        <w:tc>
+          <w:tcPr>
+            <w:tcW w:type="dxa" w:w="1120"/>
+            <w:tcBorders>
+              <w:top w:val="single" w:color="BFB3AA" w:sz="4"/>
+              <w:left w:val="single" w:color="BFB3AA" w:sz="4"/>
+              <w:bottom w:val="single" w:color="BFB3AA" w:sz="4"/>
+              <w:right w:val="single" w:color="BFB3AA" w:sz="4"/>
+            </w:tcBorders>
+            <w:tcMar>
+              <w:top w:type="dxa" w:w="60"/>
+              <w:left w:type="dxa" w:w="120"/>
+              <w:bottom w:type="dxa" w:w="60"/>
+              <w:right w:type="dxa" w:w="120"/>
+            </w:tcMar>
+            <w:vAlign w:val="center"/>
+          </w:tcPr>
+          <w:p>
+            <w:r>
+              <w:rPr>
+                <w:rFonts w:ascii="Tahoma" w:cs="Tahoma" w:eastAsia="Tahoma" w:hAnsi="Tahoma"/>
+                <w:color w:val="222222"/>
+                <w:sz w:val="18"/>
+                <w:szCs w:val="18"/>
+              </w:rPr>
+              <w:t xml:space="preserve">2</w:t>
+            </w:r>
+          </w:p>
+        </w:tc>
+        <w:tc>
+          <w:tcPr>
+            <w:tcW w:type="dxa" w:w="1120"/>
+            <w:tcBorders>
+              <w:top w:val="single" w:color="BFB3AA" w:sz="4"/>
+              <w:left w:val="single" w:color="BFB3AA" w:sz="4"/>
+              <w:bottom w:val="single" w:color="BFB3AA" w:sz="4"/>
+              <w:right w:val="single" w:color="BFB3AA" w:sz="4"/>
+            </w:tcBorders>
+            <w:tcMar>
+              <w:top w:type="dxa" w:w="60"/>
+              <w:left w:type="dxa" w:w="120"/>
+              <w:bottom w:type="dxa" w:w="60"/>
+              <w:right w:type="dxa" w:w="120"/>
+            </w:tcMar>
+            <w:vAlign w:val="center"/>
+          </w:tcPr>
+          <w:p>
+            <w:r>
+              <w:rPr>
+                <w:rFonts w:ascii="Tahoma" w:cs="Tahoma" w:eastAsia="Tahoma" w:hAnsi="Tahoma"/>
+                <w:color w:val="222222"/>
+                <w:sz w:val="18"/>
+                <w:szCs w:val="18"/>
+              </w:rPr>
+              <w:t xml:space="preserve">4</w:t>
+            </w:r>
+          </w:p>
+        </w:tc>
+        <w:tc>
+          <w:tcPr>
+            <w:tcW w:type="dxa" w:w="1120"/>
+            <w:tcBorders>
+              <w:top w:val="single" w:color="BFB3AA" w:sz="4"/>
+              <w:left w:val="single" w:color="BFB3AA" w:sz="4"/>
+              <w:bottom w:val="single" w:color="BFB3AA" w:sz="4"/>
+              <w:right w:val="single" w:color="BFB3AA" w:sz="4"/>
+            </w:tcBorders>
+            <w:tcMar>
+              <w:top w:type="dxa" w:w="60"/>
+              <w:left w:type="dxa" w:w="120"/>
+              <w:bottom w:type="dxa" w:w="60"/>
+              <w:right w:type="dxa" w:w="120"/>
+            </w:tcMar>
+            <w:vAlign w:val="center"/>
+          </w:tcPr>
+          <w:p>
+            <w:r>
+              <w:rPr>
+                <w:rFonts w:ascii="Tahoma" w:cs="Tahoma" w:eastAsia="Tahoma" w:hAnsi="Tahoma"/>
+                <w:color w:val="222222"/>
+                <w:sz w:val="18"/>
+                <w:szCs w:val="18"/>
+              </w:rPr>
+              <w:t xml:space="preserve">6</w:t>
+            </w:r>
+          </w:p>
+        </w:tc>
+        <w:tc>
+          <w:tcPr>
+            <w:tcW w:type="dxa" w:w="1220"/>
+            <w:tcBorders>
+              <w:top w:val="single" w:color="BFB3AA" w:sz="4"/>
+              <w:left w:val="single" w:color="BFB3AA" w:sz="4"/>
+              <w:bottom w:val="single" w:color="BFB3AA" w:sz="4"/>
+              <w:right w:val="single" w:color="BFB3AA" w:sz="4"/>
+            </w:tcBorders>
+            <w:tcMar>
+              <w:top w:type="dxa" w:w="60"/>
+              <w:left w:type="dxa" w:w="120"/>
+              <w:bottom w:type="dxa" w:w="60"/>
+              <w:right w:type="dxa" w:w="120"/>
+            </w:tcMar>
+            <w:vAlign w:val="center"/>
+          </w:tcPr>
+          <w:p>
+            <w:r>
+              <w:rPr>
+                <w:rFonts w:ascii="Tahoma" w:cs="Tahoma" w:eastAsia="Tahoma" w:hAnsi="Tahoma"/>
+                <w:color w:val="222222"/>
+                <w:sz w:val="18"/>
+                <w:szCs w:val="18"/>
+              </w:rPr>
+              <w:t xml:space="preserve">3</w:t>
+            </w:r>
+          </w:p>
+        </w:tc>
+        <w:tc>
+          <w:tcPr>
+            <w:tcW w:type="dxa" w:w="1220"/>
+            <w:tcBorders>
+              <w:top w:val="single" w:color="BFB3AA" w:sz="4"/>
+              <w:left w:val="single" w:color="BFB3AA" w:sz="4"/>
+              <w:bottom w:val="single" w:color="BFB3AA" w:sz="4"/>
+              <w:right w:val="single" w:color="BFB3AA" w:sz="4"/>
+            </w:tcBorders>
+            <w:tcMar>
+              <w:top w:type="dxa" w:w="60"/>
+              <w:left w:type="dxa" w:w="120"/>
+              <w:bottom w:type="dxa" w:w="60"/>
+              <w:right w:type="dxa" w:w="120"/>
+            </w:tcMar>
+            <w:vAlign w:val="center"/>
+          </w:tcPr>
+          <w:p>
+            <w:r>
+              <w:rPr>
+                <w:rFonts w:ascii="Tahoma" w:cs="Tahoma" w:eastAsia="Tahoma" w:hAnsi="Tahoma"/>
+                <w:color w:val="222222"/>
+                <w:sz w:val="18"/>
+                <w:szCs w:val="18"/>
+              </w:rPr>
+              <w:t xml:space="preserve">5</w:t>
+            </w:r>
+          </w:p>
+        </w:tc>
+      </w:tr>
+      <w:tr>
+        <w:tc>
+          <w:tcPr>
+            <w:tcW w:type="dxa" w:w="2040"/>
+            <w:tcBorders>
+              <w:top w:val="single" w:color="BFB3AA" w:sz="4"/>
+              <w:left w:val="single" w:color="BFB3AA" w:sz="4"/>
+              <w:bottom w:val="single" w:color="BFB3AA" w:sz="4"/>
+              <w:right w:val="single" w:color="BFB3AA" w:sz="4"/>
+            </w:tcBorders>
+            <w:tcMar>
+              <w:top w:type="dxa" w:w="60"/>
+              <w:left w:type="dxa" w:w="120"/>
+              <w:bottom w:type="dxa" w:w="60"/>
+              <w:right w:type="dxa" w:w="120"/>
+            </w:tcMar>
+            <w:vAlign w:val="center"/>
+          </w:tcPr>
+          <w:p>
+            <w:r>
+              <w:rPr>
+                <w:rFonts w:ascii="Tahoma" w:cs="Tahoma" w:eastAsia="Tahoma" w:hAnsi="Tahoma"/>
+                <w:color w:val="222222"/>
+                <w:sz w:val="18"/>
+                <w:szCs w:val="18"/>
+              </w:rPr>
+              <w:t xml:space="preserve">701–800</w:t>
+            </w:r>
+          </w:p>
+        </w:tc>
+        <w:tc>
+          <w:tcPr>
+            <w:tcW w:type="dxa" w:w="1520"/>
+            <w:tcBorders>
+              <w:top w:val="single" w:color="BFB3AA" w:sz="4"/>
+              <w:left w:val="single" w:color="BFB3AA" w:sz="4"/>
+              <w:bottom w:val="single" w:color="BFB3AA" w:sz="4"/>
+              <w:right w:val="single" w:color="BFB3AA" w:sz="4"/>
+            </w:tcBorders>
+            <w:tcMar>
+              <w:top w:type="dxa" w:w="60"/>
+              <w:left w:type="dxa" w:w="120"/>
+              <w:bottom w:type="dxa" w:w="60"/>
+              <w:right w:type="dxa" w:w="120"/>
+            </w:tcMar>
+            <w:vAlign w:val="center"/>
+          </w:tcPr>
+          <w:p>
+            <w:r>
+              <w:rPr>
+                <w:rFonts w:ascii="Tahoma" w:cs="Tahoma" w:eastAsia="Tahoma" w:hAnsi="Tahoma"/>
+                <w:color w:val="222222"/>
+                <w:sz w:val="18"/>
+                <w:szCs w:val="18"/>
+              </w:rPr>
+              <w:t xml:space="preserve">9</w:t>
+            </w:r>
+          </w:p>
+        </w:tc>
+        <w:tc>
+          <w:tcPr>
+            <w:tcW w:type="dxa" w:w="1120"/>
+            <w:tcBorders>
+              <w:top w:val="single" w:color="BFB3AA" w:sz="4"/>
+              <w:left w:val="single" w:color="BFB3AA" w:sz="4"/>
+              <w:bottom w:val="single" w:color="BFB3AA" w:sz="4"/>
+              <w:right w:val="single" w:color="BFB3AA" w:sz="4"/>
+            </w:tcBorders>
+            <w:tcMar>
+              <w:top w:type="dxa" w:w="60"/>
+              <w:left w:type="dxa" w:w="120"/>
+              <w:bottom w:type="dxa" w:w="60"/>
+              <w:right w:type="dxa" w:w="120"/>
+            </w:tcMar>
+            <w:vAlign w:val="center"/>
+          </w:tcPr>
+          <w:p>
+            <w:r>
+              <w:rPr>
+                <w:rFonts w:ascii="Tahoma" w:cs="Tahoma" w:eastAsia="Tahoma" w:hAnsi="Tahoma"/>
+                <w:color w:val="222222"/>
+                <w:sz w:val="18"/>
+                <w:szCs w:val="18"/>
+              </w:rPr>
+              <w:t xml:space="preserve">3</w:t>
+            </w:r>
+          </w:p>
+        </w:tc>
+        <w:tc>
+          <w:tcPr>
+            <w:tcW w:type="dxa" w:w="1120"/>
+            <w:tcBorders>
+              <w:top w:val="single" w:color="BFB3AA" w:sz="4"/>
+              <w:left w:val="single" w:color="BFB3AA" w:sz="4"/>
+              <w:bottom w:val="single" w:color="BFB3AA" w:sz="4"/>
+              <w:right w:val="single" w:color="BFB3AA" w:sz="4"/>
+            </w:tcBorders>
+            <w:tcMar>
+              <w:top w:type="dxa" w:w="60"/>
+              <w:left w:type="dxa" w:w="120"/>
+              <w:bottom w:type="dxa" w:w="60"/>
+              <w:right w:type="dxa" w:w="120"/>
+            </w:tcMar>
+            <w:vAlign w:val="center"/>
+          </w:tcPr>
+          <w:p>
+            <w:r>
+              <w:rPr>
+                <w:rFonts w:ascii="Tahoma" w:cs="Tahoma" w:eastAsia="Tahoma" w:hAnsi="Tahoma"/>
+                <w:color w:val="222222"/>
+                <w:sz w:val="18"/>
+                <w:szCs w:val="18"/>
+              </w:rPr>
+              <w:t xml:space="preserve">5</w:t>
+            </w:r>
+          </w:p>
+        </w:tc>
+        <w:tc>
+          <w:tcPr>
+            <w:tcW w:type="dxa" w:w="1120"/>
+            <w:tcBorders>
+              <w:top w:val="single" w:color="BFB3AA" w:sz="4"/>
+              <w:left w:val="single" w:color="BFB3AA" w:sz="4"/>
+              <w:bottom w:val="single" w:color="BFB3AA" w:sz="4"/>
+              <w:right w:val="single" w:color="BFB3AA" w:sz="4"/>
+            </w:tcBorders>
+            <w:tcMar>
+              <w:top w:type="dxa" w:w="60"/>
+              <w:left w:type="dxa" w:w="120"/>
+              <w:bottom w:type="dxa" w:w="60"/>
+              <w:right w:type="dxa" w:w="120"/>
+            </w:tcMar>
+            <w:vAlign w:val="center"/>
+          </w:tcPr>
+          <w:p>
+            <w:r>
+              <w:rPr>
+                <w:rFonts w:ascii="Tahoma" w:cs="Tahoma" w:eastAsia="Tahoma" w:hAnsi="Tahoma"/>
+                <w:color w:val="222222"/>
+                <w:sz w:val="18"/>
+                <w:szCs w:val="18"/>
+              </w:rPr>
+              <w:t xml:space="preserve">6</w:t>
+            </w:r>
+          </w:p>
+        </w:tc>
+        <w:tc>
+          <w:tcPr>
+            <w:tcW w:type="dxa" w:w="1220"/>
+            <w:tcBorders>
+              <w:top w:val="single" w:color="BFB3AA" w:sz="4"/>
+              <w:left w:val="single" w:color="BFB3AA" w:sz="4"/>
+              <w:bottom w:val="single" w:color="BFB3AA" w:sz="4"/>
+              <w:right w:val="single" w:color="BFB3AA" w:sz="4"/>
+            </w:tcBorders>
+            <w:tcMar>
+              <w:top w:type="dxa" w:w="60"/>
+              <w:left w:type="dxa" w:w="120"/>
+              <w:bottom w:type="dxa" w:w="60"/>
+              <w:right w:type="dxa" w:w="120"/>
+            </w:tcMar>
+            <w:vAlign w:val="center"/>
+          </w:tcPr>
+          <w:p>
+            <w:r>
+              <w:rPr>
+                <w:rFonts w:ascii="Tahoma" w:cs="Tahoma" w:eastAsia="Tahoma" w:hAnsi="Tahoma"/>
+                <w:color w:val="222222"/>
+                <w:sz w:val="18"/>
+                <w:szCs w:val="18"/>
+              </w:rPr>
+              <w:t xml:space="preserve">4</w:t>
+            </w:r>
+          </w:p>
+        </w:tc>
+        <w:tc>
+          <w:tcPr>
+            <w:tcW w:type="dxa" w:w="1220"/>
+            <w:tcBorders>
+              <w:top w:val="single" w:color="BFB3AA" w:sz="4"/>
+              <w:left w:val="single" w:color="BFB3AA" w:sz="4"/>
+              <w:bottom w:val="single" w:color="BFB3AA" w:sz="4"/>
+              <w:right w:val="single" w:color="BFB3AA" w:sz="4"/>
+            </w:tcBorders>
+            <w:tcMar>
+              <w:top w:type="dxa" w:w="60"/>
+              <w:left w:type="dxa" w:w="120"/>
+              <w:bottom w:type="dxa" w:w="60"/>
+              <w:right w:type="dxa" w:w="120"/>
+            </w:tcMar>
+            <w:vAlign w:val="center"/>
+          </w:tcPr>
+          <w:p>
+            <w:r>
+              <w:rPr>
+                <w:rFonts w:ascii="Tahoma" w:cs="Tahoma" w:eastAsia="Tahoma" w:hAnsi="Tahoma"/>
+                <w:color w:val="222222"/>
+                <w:sz w:val="18"/>
+                <w:szCs w:val="18"/>
+              </w:rPr>
+              <w:t xml:space="preserve">5</w:t>
+            </w:r>
+          </w:p>
+        </w:tc>
+      </w:tr>
+      <w:tr>
+        <w:tc>
+          <w:tcPr>
+            <w:tcW w:type="dxa" w:w="2040"/>
+            <w:tcBorders>
+              <w:top w:val="single" w:color="BFB3AA" w:sz="4"/>
+              <w:left w:val="single" w:color="BFB3AA" w:sz="4"/>
+              <w:bottom w:val="single" w:color="BFB3AA" w:sz="4"/>
+              <w:right w:val="single" w:color="BFB3AA" w:sz="4"/>
+            </w:tcBorders>
+            <w:tcMar>
+              <w:top w:type="dxa" w:w="60"/>
+              <w:left w:type="dxa" w:w="120"/>
+              <w:bottom w:type="dxa" w:w="60"/>
+              <w:right w:type="dxa" w:w="120"/>
+            </w:tcMar>
+            <w:vAlign w:val="center"/>
+          </w:tcPr>
+          <w:p>
+            <w:r>
+              <w:rPr>
+                <w:rFonts w:ascii="Tahoma" w:cs="Tahoma" w:eastAsia="Tahoma" w:hAnsi="Tahoma"/>
+                <w:color w:val="222222"/>
+                <w:sz w:val="18"/>
+                <w:szCs w:val="18"/>
+              </w:rPr>
+              <w:t xml:space="preserve">801–900</w:t>
+            </w:r>
+          </w:p>
+        </w:tc>
+        <w:tc>
+          <w:tcPr>
+            <w:tcW w:type="dxa" w:w="1520"/>
+            <w:tcBorders>
+              <w:top w:val="single" w:color="BFB3AA" w:sz="4"/>
+              <w:left w:val="single" w:color="BFB3AA" w:sz="4"/>
+              <w:bottom w:val="single" w:color="BFB3AA" w:sz="4"/>
+              <w:right w:val="single" w:color="BFB3AA" w:sz="4"/>
+            </w:tcBorders>
+            <w:tcMar>
+              <w:top w:type="dxa" w:w="60"/>
+              <w:left w:type="dxa" w:w="120"/>
+              <w:bottom w:type="dxa" w:w="60"/>
+              <w:right w:type="dxa" w:w="120"/>
+            </w:tcMar>
+            <w:vAlign w:val="center"/>
+          </w:tcPr>
+          <w:p>
+            <w:r>
+              <w:rPr>
+                <w:rFonts w:ascii="Tahoma" w:cs="Tahoma" w:eastAsia="Tahoma" w:hAnsi="Tahoma"/>
+                <w:color w:val="222222"/>
+                <w:sz w:val="18"/>
+                <w:szCs w:val="18"/>
+              </w:rPr>
+              <w:t xml:space="preserve">10</w:t>
+            </w:r>
+          </w:p>
+        </w:tc>
+        <w:tc>
+          <w:tcPr>
+            <w:tcW w:type="dxa" w:w="1120"/>
+            <w:tcBorders>
+              <w:top w:val="single" w:color="BFB3AA" w:sz="4"/>
+              <w:left w:val="single" w:color="BFB3AA" w:sz="4"/>
+              <w:bottom w:val="single" w:color="BFB3AA" w:sz="4"/>
+              <w:right w:val="single" w:color="BFB3AA" w:sz="4"/>
+            </w:tcBorders>
+            <w:tcMar>
+              <w:top w:type="dxa" w:w="60"/>
+              <w:left w:type="dxa" w:w="120"/>
+              <w:bottom w:type="dxa" w:w="60"/>
+              <w:right w:type="dxa" w:w="120"/>
+            </w:tcMar>
+            <w:vAlign w:val="center"/>
+          </w:tcPr>
+          <w:p>
+            <w:r>
+              <w:rPr>
+                <w:rFonts w:ascii="Tahoma" w:cs="Tahoma" w:eastAsia="Tahoma" w:hAnsi="Tahoma"/>
+                <w:color w:val="222222"/>
+                <w:sz w:val="18"/>
+                <w:szCs w:val="18"/>
+              </w:rPr>
+              <w:t xml:space="preserve">3</w:t>
+            </w:r>
+          </w:p>
+        </w:tc>
+        <w:tc>
+          <w:tcPr>
+            <w:tcW w:type="dxa" w:w="1120"/>
+            <w:tcBorders>
+              <w:top w:val="single" w:color="BFB3AA" w:sz="4"/>
+              <w:left w:val="single" w:color="BFB3AA" w:sz="4"/>
+              <w:bottom w:val="single" w:color="BFB3AA" w:sz="4"/>
+              <w:right w:val="single" w:color="BFB3AA" w:sz="4"/>
+            </w:tcBorders>
+            <w:tcMar>
+              <w:top w:type="dxa" w:w="60"/>
+              <w:left w:type="dxa" w:w="120"/>
+              <w:bottom w:type="dxa" w:w="60"/>
+              <w:right w:type="dxa" w:w="120"/>
+            </w:tcMar>
+            <w:vAlign w:val="center"/>
+          </w:tcPr>
+          <w:p>
+            <w:r>
+              <w:rPr>
+                <w:rFonts w:ascii="Tahoma" w:cs="Tahoma" w:eastAsia="Tahoma" w:hAnsi="Tahoma"/>
+                <w:color w:val="222222"/>
+                <w:sz w:val="18"/>
+                <w:szCs w:val="18"/>
+              </w:rPr>
+              <w:t xml:space="preserve">5</w:t>
+            </w:r>
+          </w:p>
+        </w:tc>
+        <w:tc>
+          <w:tcPr>
+            <w:tcW w:type="dxa" w:w="1120"/>
+            <w:tcBorders>
+              <w:top w:val="single" w:color="BFB3AA" w:sz="4"/>
+              <w:left w:val="single" w:color="BFB3AA" w:sz="4"/>
+              <w:bottom w:val="single" w:color="BFB3AA" w:sz="4"/>
+              <w:right w:val="single" w:color="BFB3AA" w:sz="4"/>
+            </w:tcBorders>
+            <w:tcMar>
+              <w:top w:type="dxa" w:w="60"/>
+              <w:left w:type="dxa" w:w="120"/>
+              <w:bottom w:type="dxa" w:w="60"/>
+              <w:right w:type="dxa" w:w="120"/>
+            </w:tcMar>
+            <w:vAlign w:val="center"/>
+          </w:tcPr>
+          <w:p>
+            <w:r>
+              <w:rPr>
+                <w:rFonts w:ascii="Tahoma" w:cs="Tahoma" w:eastAsia="Tahoma" w:hAnsi="Tahoma"/>
+                <w:color w:val="222222"/>
+                <w:sz w:val="18"/>
+                <w:szCs w:val="18"/>
+              </w:rPr>
+              <w:t xml:space="preserve">7</w:t>
+            </w:r>
+          </w:p>
+        </w:tc>
+        <w:tc>
+          <w:tcPr>
+            <w:tcW w:type="dxa" w:w="1220"/>
+            <w:tcBorders>
+              <w:top w:val="single" w:color="BFB3AA" w:sz="4"/>
+              <w:left w:val="single" w:color="BFB3AA" w:sz="4"/>
+              <w:bottom w:val="single" w:color="BFB3AA" w:sz="4"/>
+              <w:right w:val="single" w:color="BFB3AA" w:sz="4"/>
+            </w:tcBorders>
+            <w:tcMar>
+              <w:top w:type="dxa" w:w="60"/>
+              <w:left w:type="dxa" w:w="120"/>
+              <w:bottom w:type="dxa" w:w="60"/>
+              <w:right w:type="dxa" w:w="120"/>
+            </w:tcMar>
+            <w:vAlign w:val="center"/>
+          </w:tcPr>
+          <w:p>
+            <w:r>
+              <w:rPr>
+                <w:rFonts w:ascii="Tahoma" w:cs="Tahoma" w:eastAsia="Tahoma" w:hAnsi="Tahoma"/>
+                <w:color w:val="222222"/>
+                <w:sz w:val="18"/>
+                <w:szCs w:val="18"/>
+              </w:rPr>
+              <w:t xml:space="preserve">4</w:t>
+            </w:r>
+          </w:p>
+        </w:tc>
+        <w:tc>
+          <w:tcPr>
+            <w:tcW w:type="dxa" w:w="1220"/>
+            <w:tcBorders>
+              <w:top w:val="single" w:color="BFB3AA" w:sz="4"/>
+              <w:left w:val="single" w:color="BFB3AA" w:sz="4"/>
+              <w:bottom w:val="single" w:color="BFB3AA" w:sz="4"/>
+              <w:right w:val="single" w:color="BFB3AA" w:sz="4"/>
+            </w:tcBorders>
+            <w:tcMar>
+              <w:top w:type="dxa" w:w="60"/>
+              <w:left w:type="dxa" w:w="120"/>
+              <w:bottom w:type="dxa" w:w="60"/>
+              <w:right w:type="dxa" w:w="120"/>
+            </w:tcMar>
+            <w:vAlign w:val="center"/>
+          </w:tcPr>
+          <w:p>
+            <w:r>
+              <w:rPr>
+                <w:rFonts w:ascii="Tahoma" w:cs="Tahoma" w:eastAsia="Tahoma" w:hAnsi="Tahoma"/>
+                <w:color w:val="222222"/>
+                <w:sz w:val="18"/>
+                <w:szCs w:val="18"/>
+              </w:rPr>
+              <w:t xml:space="preserve">6</w:t>
+            </w:r>
+          </w:p>
+        </w:tc>
+      </w:tr>
+      <w:tr>
+        <w:tc>
+          <w:tcPr>
+            <w:tcW w:type="dxa" w:w="2040"/>
+            <w:tcBorders>
+              <w:top w:val="single" w:color="BFB3AA" w:sz="4"/>
+              <w:left w:val="single" w:color="BFB3AA" w:sz="4"/>
+              <w:bottom w:val="single" w:color="BFB3AA" w:sz="4"/>
+              <w:right w:val="single" w:color="BFB3AA" w:sz="4"/>
+            </w:tcBorders>
+            <w:tcMar>
+              <w:top w:type="dxa" w:w="60"/>
+              <w:left w:type="dxa" w:w="120"/>
+              <w:bottom w:type="dxa" w:w="60"/>
+              <w:right w:type="dxa" w:w="120"/>
+            </w:tcMar>
+            <w:vAlign w:val="center"/>
+          </w:tcPr>
+          <w:p>
+            <w:r>
+              <w:rPr>
+                <w:rFonts w:ascii="Tahoma" w:cs="Tahoma" w:eastAsia="Tahoma" w:hAnsi="Tahoma"/>
+                <w:color w:val="222222"/>
+                <w:sz w:val="18"/>
+                <w:szCs w:val="18"/>
+              </w:rPr>
+              <w:t xml:space="preserve">901–1,000</w:t>
+            </w:r>
+          </w:p>
+        </w:tc>
+        <w:tc>
+          <w:tcPr>
+            <w:tcW w:type="dxa" w:w="1520"/>
+            <w:tcBorders>
+              <w:top w:val="single" w:color="BFB3AA" w:sz="4"/>
+              <w:left w:val="single" w:color="BFB3AA" w:sz="4"/>
+              <w:bottom w:val="single" w:color="BFB3AA" w:sz="4"/>
+              <w:right w:val="single" w:color="BFB3AA" w:sz="4"/>
+            </w:tcBorders>
+            <w:tcMar>
+              <w:top w:type="dxa" w:w="60"/>
+              <w:left w:type="dxa" w:w="120"/>
+              <w:bottom w:type="dxa" w:w="60"/>
+              <w:right w:type="dxa" w:w="120"/>
+            </w:tcMar>
+            <w:vAlign w:val="center"/>
+          </w:tcPr>
+          <w:p>
+            <w:r>
+              <w:rPr>
+                <w:rFonts w:ascii="Tahoma" w:cs="Tahoma" w:eastAsia="Tahoma" w:hAnsi="Tahoma"/>
+                <w:color w:val="222222"/>
+                <w:sz w:val="18"/>
+                <w:szCs w:val="18"/>
+              </w:rPr>
+              <w:t xml:space="preserve">11</w:t>
+            </w:r>
+          </w:p>
+        </w:tc>
+        <w:tc>
+          <w:tcPr>
+            <w:tcW w:type="dxa" w:w="1120"/>
+            <w:tcBorders>
+              <w:top w:val="single" w:color="BFB3AA" w:sz="4"/>
+              <w:left w:val="single" w:color="BFB3AA" w:sz="4"/>
+              <w:bottom w:val="single" w:color="BFB3AA" w:sz="4"/>
+              <w:right w:val="single" w:color="BFB3AA" w:sz="4"/>
+            </w:tcBorders>
+            <w:tcMar>
+              <w:top w:type="dxa" w:w="60"/>
+              <w:left w:type="dxa" w:w="120"/>
+              <w:bottom w:type="dxa" w:w="60"/>
+              <w:right w:type="dxa" w:w="120"/>
+            </w:tcMar>
+            <w:vAlign w:val="center"/>
+          </w:tcPr>
+          <w:p>
+            <w:r>
+              <w:rPr>
+                <w:rFonts w:ascii="Tahoma" w:cs="Tahoma" w:eastAsia="Tahoma" w:hAnsi="Tahoma"/>
+                <w:color w:val="222222"/>
+                <w:sz w:val="18"/>
+                <w:szCs w:val="18"/>
+              </w:rPr>
+              <w:t xml:space="preserve">3</w:t>
+            </w:r>
+          </w:p>
+        </w:tc>
+        <w:tc>
+          <w:tcPr>
+            <w:tcW w:type="dxa" w:w="1120"/>
+            <w:tcBorders>
+              <w:top w:val="single" w:color="BFB3AA" w:sz="4"/>
+              <w:left w:val="single" w:color="BFB3AA" w:sz="4"/>
+              <w:bottom w:val="single" w:color="BFB3AA" w:sz="4"/>
+              <w:right w:val="single" w:color="BFB3AA" w:sz="4"/>
+            </w:tcBorders>
+            <w:tcMar>
+              <w:top w:type="dxa" w:w="60"/>
+              <w:left w:type="dxa" w:w="120"/>
+              <w:bottom w:type="dxa" w:w="60"/>
+              <w:right w:type="dxa" w:w="120"/>
+            </w:tcMar>
+            <w:vAlign w:val="center"/>
+          </w:tcPr>
+          <w:p>
+            <w:r>
+              <w:rPr>
+                <w:rFonts w:ascii="Tahoma" w:cs="Tahoma" w:eastAsia="Tahoma" w:hAnsi="Tahoma"/>
+                <w:color w:val="222222"/>
+                <w:sz w:val="18"/>
+                <w:szCs w:val="18"/>
+              </w:rPr>
+              <w:t xml:space="preserve">6</w:t>
+            </w:r>
+          </w:p>
+        </w:tc>
+        <w:tc>
+          <w:tcPr>
+            <w:tcW w:type="dxa" w:w="1120"/>
+            <w:tcBorders>
+              <w:top w:val="single" w:color="BFB3AA" w:sz="4"/>
+              <w:left w:val="single" w:color="BFB3AA" w:sz="4"/>
+              <w:bottom w:val="single" w:color="BFB3AA" w:sz="4"/>
+              <w:right w:val="single" w:color="BFB3AA" w:sz="4"/>
+            </w:tcBorders>
+            <w:tcMar>
+              <w:top w:type="dxa" w:w="60"/>
+              <w:left w:type="dxa" w:w="120"/>
+              <w:bottom w:type="dxa" w:w="60"/>
+              <w:right w:type="dxa" w:w="120"/>
+            </w:tcMar>
+            <w:vAlign w:val="center"/>
+          </w:tcPr>
+          <w:p>
+            <w:r>
+              <w:rPr>
+                <w:rFonts w:ascii="Tahoma" w:cs="Tahoma" w:eastAsia="Tahoma" w:hAnsi="Tahoma"/>
+                <w:color w:val="222222"/>
+                <w:sz w:val="18"/>
+                <w:szCs w:val="18"/>
+              </w:rPr>
+              <w:t xml:space="preserve">8</w:t>
+            </w:r>
+          </w:p>
+        </w:tc>
+        <w:tc>
+          <w:tcPr>
+            <w:tcW w:type="dxa" w:w="1220"/>
+            <w:tcBorders>
+              <w:top w:val="single" w:color="BFB3AA" w:sz="4"/>
+              <w:left w:val="single" w:color="BFB3AA" w:sz="4"/>
+              <w:bottom w:val="single" w:color="BFB3AA" w:sz="4"/>
+              <w:right w:val="single" w:color="BFB3AA" w:sz="4"/>
+            </w:tcBorders>
+            <w:tcMar>
+              <w:top w:type="dxa" w:w="60"/>
+              <w:left w:type="dxa" w:w="120"/>
+              <w:bottom w:type="dxa" w:w="60"/>
+              <w:right w:type="dxa" w:w="120"/>
+            </w:tcMar>
+            <w:vAlign w:val="center"/>
+          </w:tcPr>
+          <w:p>
+            <w:r>
+              <w:rPr>
+                <w:rFonts w:ascii="Tahoma" w:cs="Tahoma" w:eastAsia="Tahoma" w:hAnsi="Tahoma"/>
+                <w:color w:val="222222"/>
+                <w:sz w:val="18"/>
+                <w:szCs w:val="18"/>
+              </w:rPr>
+              <w:t xml:space="preserve">4</w:t>
+            </w:r>
+          </w:p>
+        </w:tc>
+        <w:tc>
+          <w:tcPr>
+            <w:tcW w:type="dxa" w:w="1220"/>
+            <w:tcBorders>
+              <w:top w:val="single" w:color="BFB3AA" w:sz="4"/>
+              <w:left w:val="single" w:color="BFB3AA" w:sz="4"/>
+              <w:bottom w:val="single" w:color="BFB3AA" w:sz="4"/>
+              <w:right w:val="single" w:color="BFB3AA" w:sz="4"/>
+            </w:tcBorders>
+            <w:tcMar>
+              <w:top w:type="dxa" w:w="60"/>
+              <w:left w:type="dxa" w:w="120"/>
+              <w:bottom w:type="dxa" w:w="60"/>
+              <w:right w:type="dxa" w:w="120"/>
+            </w:tcMar>
+            <w:vAlign w:val="center"/>
+          </w:tcPr>
+          <w:p>
+            <w:r>
+              <w:rPr>
+                <w:rFonts w:ascii="Tahoma" w:cs="Tahoma" w:eastAsia="Tahoma" w:hAnsi="Tahoma"/>
+                <w:color w:val="222222"/>
+                <w:sz w:val="18"/>
+                <w:szCs w:val="18"/>
+              </w:rPr>
+              <w:t xml:space="preserve">7</w:t>
+            </w:r>
+          </w:p>
+        </w:tc>
+      </w:tr>
+    </w:tbl>
+    <w:p>
+      <w:pPr>
+        <w:spacing w:after="120" w:before="80"/>
+      </w:pPr>
+      <w:r>
+        <w:rPr>
+          <w:rFonts w:ascii="Tahoma" w:cs="Tahoma" w:eastAsia="Tahoma" w:hAnsi="Tahoma"/>
+          <w:b/>
+          <w:bCs/>
+          <w:color w:val="542A12"/>
+          <w:sz w:val="18"/>
+          <w:szCs w:val="18"/>
+        </w:rPr>
+        <w:t xml:space="preserve">Note:  </w:t>
+      </w:r>
+      <w:r>
+        <w:rPr>
+          <w:rFonts w:ascii="Tahoma" w:cs="Tahoma" w:eastAsia="Tahoma" w:hAnsi="Tahoma"/>
+          <w:color w:val="444444"/>
+          <w:sz w:val="18"/>
+          <w:szCs w:val="18"/>
+        </w:rPr>
+        <w:t xml:space="preserve">The phased Saudi-national compliance dates apply by headcount band (e.g. 500+ and 200–499 employers at 30% from 1 Apr 2020, 50% from 1 Jan 2021 and 70% from 1 Jan 2022; 100–199 and 50–99 employers phased from 2020). Where local legislation introduces more stringent requirements, those take precedence.</w:t>
+      </w:r>
+    </w:p>
+    <w:p>
+      <w:pPr>
+        <w:spacing w:after="120" w:line="276"/>
+        <w:jc w:val="both"/>
+      </w:pPr>
+      <w:r>
+        <w:rPr>
+          <w:rFonts w:ascii="Tahoma" w:cs="Tahoma" w:eastAsia="Tahoma" w:hAnsi="Tahoma"/>
+          <w:sz w:val="20"/>
+          <w:szCs w:val="20"/>
+        </w:rPr>
+        <w:t xml:space="preserve">HSE personnel hold qualifications, certification and professional membership appropriate to their level, as a minimum:</w:t>
+      </w:r>
+    </w:p>
+    <w:tbl>
+      <w:tblPr>
+        <w:tblW w:type="dxa" w:w="9360"/>
+        <w:tblBorders>
+          <w:top w:val="single" w:color="auto" w:sz="4"/>
+          <w:left w:val="single" w:color="auto" w:sz="4"/>
+          <w:bottom w:val="single" w:color="auto" w:sz="4"/>
+          <w:right w:val="single" w:color="auto" w:sz="4"/>
+          <w:insideH w:val="single" w:color="auto" w:sz="4"/>
+          <w:insideV w:val="single" w:color="auto" w:sz="4"/>
+        </w:tblBorders>
+      </w:tblPr>
+      <w:tblGrid>
+        <w:gridCol w:w="2400"/>
+        <w:gridCol w:w="3360"/>
+        <w:gridCol w:w="1800"/>
+        <w:gridCol w:w="1800"/>
+      </w:tblGrid>
+      <w:tr>
+        <w:trPr>
+          <w:tblHeader/>
+        </w:trPr>
+        <w:tc>
+          <w:tcPr>
+            <w:tcW w:type="dxa" w:w="2400"/>
+            <w:tcBorders>
+              <w:top w:val="single" w:color="BFB3AA" w:sz="4"/>
+              <w:left w:val="single" w:color="BFB3AA" w:sz="4"/>
+              <w:bottom w:val="single" w:color="BFB3AA" w:sz="4"/>
+              <w:right w:val="single" w:color="BFB3AA" w:sz="4"/>
+            </w:tcBorders>
+            <w:shd w:fill="542A12" w:color="auto" w:val="clear"/>
+            <w:tcMar>
+              <w:top w:type="dxa" w:w="60"/>
+              <w:left w:type="dxa" w:w="120"/>
+              <w:bottom w:type="dxa" w:w="60"/>
+              <w:right w:type="dxa" w:w="120"/>
+            </w:tcMar>
+            <w:vAlign w:val="center"/>
+          </w:tcPr>
+          <w:p>
+            <w:r>
+              <w:rPr>
+                <w:rFonts w:ascii="Tahoma" w:cs="Tahoma" w:eastAsia="Tahoma" w:hAnsi="Tahoma"/>
+                <w:b/>
+                <w:bCs/>
+                <w:color w:val="FFFFFF"/>
+                <w:sz w:val="18"/>
+                <w:szCs w:val="18"/>
+              </w:rPr>
+              <w:t xml:space="preserve">Position</w:t>
+            </w:r>
+          </w:p>
+        </w:tc>
+        <w:tc>
+          <w:tcPr>
+            <w:tcW w:type="dxa" w:w="3360"/>
+            <w:tcBorders>
+              <w:top w:val="single" w:color="BFB3AA" w:sz="4"/>
+              <w:left w:val="single" w:color="BFB3AA" w:sz="4"/>
+              <w:bottom w:val="single" w:color="BFB3AA" w:sz="4"/>
+              <w:right w:val="single" w:color="BFB3AA" w:sz="4"/>
+            </w:tcBorders>
+            <w:shd w:fill="542A12" w:color="auto" w:val="clear"/>
+            <w:tcMar>
+              <w:top w:type="dxa" w:w="60"/>
+              <w:left w:type="dxa" w:w="120"/>
+              <w:bottom w:type="dxa" w:w="60"/>
+              <w:right w:type="dxa" w:w="120"/>
+            </w:tcMar>
+            <w:vAlign w:val="center"/>
+          </w:tcPr>
+          <w:p>
+            <w:r>
+              <w:rPr>
+                <w:rFonts w:ascii="Tahoma" w:cs="Tahoma" w:eastAsia="Tahoma" w:hAnsi="Tahoma"/>
+                <w:b/>
+                <w:bCs/>
+                <w:color w:val="FFFFFF"/>
+                <w:sz w:val="18"/>
+                <w:szCs w:val="18"/>
+              </w:rPr>
+              <w:t xml:space="preserve">Qualification / certification</w:t>
+            </w:r>
+          </w:p>
+        </w:tc>
+        <w:tc>
+          <w:tcPr>
+            <w:tcW w:type="dxa" w:w="1800"/>
+            <w:tcBorders>
+              <w:top w:val="single" w:color="BFB3AA" w:sz="4"/>
+              <w:left w:val="single" w:color="BFB3AA" w:sz="4"/>
+              <w:bottom w:val="single" w:color="BFB3AA" w:sz="4"/>
+              <w:right w:val="single" w:color="BFB3AA" w:sz="4"/>
+            </w:tcBorders>
+            <w:shd w:fill="542A12" w:color="auto" w:val="clear"/>
+            <w:tcMar>
+              <w:top w:type="dxa" w:w="60"/>
+              <w:left w:type="dxa" w:w="120"/>
+              <w:bottom w:type="dxa" w:w="60"/>
+              <w:right w:type="dxa" w:w="120"/>
+            </w:tcMar>
+            <w:vAlign w:val="center"/>
+          </w:tcPr>
+          <w:p>
+            <w:r>
+              <w:rPr>
+                <w:rFonts w:ascii="Tahoma" w:cs="Tahoma" w:eastAsia="Tahoma" w:hAnsi="Tahoma"/>
+                <w:b/>
+                <w:bCs/>
+                <w:color w:val="FFFFFF"/>
+                <w:sz w:val="18"/>
+                <w:szCs w:val="18"/>
+              </w:rPr>
+              <w:t xml:space="preserve">Professional membership</w:t>
+            </w:r>
+          </w:p>
+        </w:tc>
+        <w:tc>
+          <w:tcPr>
+            <w:tcW w:type="dxa" w:w="1800"/>
+            <w:tcBorders>
+              <w:top w:val="single" w:color="BFB3AA" w:sz="4"/>
+              <w:left w:val="single" w:color="BFB3AA" w:sz="4"/>
+              <w:bottom w:val="single" w:color="BFB3AA" w:sz="4"/>
+              <w:right w:val="single" w:color="BFB3AA" w:sz="4"/>
+            </w:tcBorders>
+            <w:shd w:fill="542A12" w:color="auto" w:val="clear"/>
+            <w:tcMar>
+              <w:top w:type="dxa" w:w="60"/>
+              <w:left w:type="dxa" w:w="120"/>
+              <w:bottom w:type="dxa" w:w="60"/>
+              <w:right w:type="dxa" w:w="120"/>
+            </w:tcMar>
+            <w:vAlign w:val="center"/>
+          </w:tcPr>
+          <w:p>
+            <w:r>
+              <w:rPr>
+                <w:rFonts w:ascii="Tahoma" w:cs="Tahoma" w:eastAsia="Tahoma" w:hAnsi="Tahoma"/>
+                <w:b/>
+                <w:bCs/>
+                <w:color w:val="FFFFFF"/>
+                <w:sz w:val="18"/>
+                <w:szCs w:val="18"/>
+              </w:rPr>
+              <w:t xml:space="preserve">Min. experience (years)</w:t>
+            </w:r>
+          </w:p>
+        </w:tc>
+      </w:tr>
+      <w:tr>
+        <w:tc>
+          <w:tcPr>
+            <w:tcW w:type="dxa" w:w="2400"/>
+            <w:tcBorders>
+              <w:top w:val="single" w:color="BFB3AA" w:sz="4"/>
+              <w:left w:val="single" w:color="BFB3AA" w:sz="4"/>
+              <w:bottom w:val="single" w:color="BFB3AA" w:sz="4"/>
+              <w:right w:val="single" w:color="BFB3AA" w:sz="4"/>
+            </w:tcBorders>
+            <w:tcMar>
+              <w:top w:type="dxa" w:w="60"/>
+              <w:left w:type="dxa" w:w="120"/>
+              <w:bottom w:type="dxa" w:w="60"/>
+              <w:right w:type="dxa" w:w="120"/>
+            </w:tcMar>
+            <w:vAlign w:val="center"/>
+          </w:tcPr>
+          <w:p>
+            <w:r>
+              <w:rPr>
+                <w:rFonts w:ascii="Tahoma" w:cs="Tahoma" w:eastAsia="Tahoma" w:hAnsi="Tahoma"/>
+                <w:color w:val="222222"/>
+                <w:sz w:val="18"/>
+                <w:szCs w:val="18"/>
+              </w:rPr>
+              <w:t xml:space="preserve">HSE Director</w:t>
+            </w:r>
+          </w:p>
+        </w:tc>
+        <w:tc>
+          <w:tcPr>
+            <w:tcW w:type="dxa" w:w="3360"/>
+            <w:tcBorders>
+              <w:top w:val="single" w:color="BFB3AA" w:sz="4"/>
+              <w:left w:val="single" w:color="BFB3AA" w:sz="4"/>
+              <w:bottom w:val="single" w:color="BFB3AA" w:sz="4"/>
+              <w:right w:val="single" w:color="BFB3AA" w:sz="4"/>
+            </w:tcBorders>
+            <w:tcMar>
+              <w:top w:type="dxa" w:w="60"/>
+              <w:left w:type="dxa" w:w="120"/>
+              <w:bottom w:type="dxa" w:w="60"/>
+              <w:right w:type="dxa" w:w="120"/>
+            </w:tcMar>
+            <w:vAlign w:val="center"/>
+          </w:tcPr>
+          <w:p>
+            <w:r>
+              <w:rPr>
+                <w:rFonts w:ascii="Tahoma" w:cs="Tahoma" w:eastAsia="Tahoma" w:hAnsi="Tahoma"/>
+                <w:color w:val="222222"/>
+                <w:sz w:val="18"/>
+                <w:szCs w:val="18"/>
+              </w:rPr>
+              <w:t xml:space="preserve">BSc Engineering / equivalent; NEBOSH Diploma or equivalent</w:t>
+            </w:r>
+          </w:p>
+        </w:tc>
+        <w:tc>
+          <w:tcPr>
+            <w:tcW w:type="dxa" w:w="1800"/>
+            <w:tcBorders>
+              <w:top w:val="single" w:color="BFB3AA" w:sz="4"/>
+              <w:left w:val="single" w:color="BFB3AA" w:sz="4"/>
+              <w:bottom w:val="single" w:color="BFB3AA" w:sz="4"/>
+              <w:right w:val="single" w:color="BFB3AA" w:sz="4"/>
+            </w:tcBorders>
+            <w:tcMar>
+              <w:top w:type="dxa" w:w="60"/>
+              <w:left w:type="dxa" w:w="120"/>
+              <w:bottom w:type="dxa" w:w="60"/>
+              <w:right w:type="dxa" w:w="120"/>
+            </w:tcMar>
+            <w:vAlign w:val="center"/>
+          </w:tcPr>
+          <w:p>
+            <w:r>
+              <w:rPr>
+                <w:rFonts w:ascii="Tahoma" w:cs="Tahoma" w:eastAsia="Tahoma" w:hAnsi="Tahoma"/>
+                <w:color w:val="222222"/>
+                <w:sz w:val="18"/>
+                <w:szCs w:val="18"/>
+              </w:rPr>
+              <w:t xml:space="preserve">Essential (e.g. IOSH/IIRSM)</w:t>
+            </w:r>
+          </w:p>
+        </w:tc>
+        <w:tc>
+          <w:tcPr>
+            <w:tcW w:type="dxa" w:w="1800"/>
+            <w:tcBorders>
+              <w:top w:val="single" w:color="BFB3AA" w:sz="4"/>
+              <w:left w:val="single" w:color="BFB3AA" w:sz="4"/>
+              <w:bottom w:val="single" w:color="BFB3AA" w:sz="4"/>
+              <w:right w:val="single" w:color="BFB3AA" w:sz="4"/>
+            </w:tcBorders>
+            <w:tcMar>
+              <w:top w:type="dxa" w:w="60"/>
+              <w:left w:type="dxa" w:w="120"/>
+              <w:bottom w:type="dxa" w:w="60"/>
+              <w:right w:type="dxa" w:w="120"/>
+            </w:tcMar>
+            <w:vAlign w:val="center"/>
+          </w:tcPr>
+          <w:p>
+            <w:r>
+              <w:rPr>
+                <w:rFonts w:ascii="Tahoma" w:cs="Tahoma" w:eastAsia="Tahoma" w:hAnsi="Tahoma"/>
+                <w:color w:val="222222"/>
+                <w:sz w:val="18"/>
+                <w:szCs w:val="18"/>
+              </w:rPr>
+              <w:t xml:space="preserve">15–20 (8+ at Sr Manager)</w:t>
+            </w:r>
+          </w:p>
+        </w:tc>
+      </w:tr>
+      <w:tr>
+        <w:tc>
+          <w:tcPr>
+            <w:tcW w:type="dxa" w:w="2400"/>
+            <w:tcBorders>
+              <w:top w:val="single" w:color="BFB3AA" w:sz="4"/>
+              <w:left w:val="single" w:color="BFB3AA" w:sz="4"/>
+              <w:bottom w:val="single" w:color="BFB3AA" w:sz="4"/>
+              <w:right w:val="single" w:color="BFB3AA" w:sz="4"/>
+            </w:tcBorders>
+            <w:tcMar>
+              <w:top w:type="dxa" w:w="60"/>
+              <w:left w:type="dxa" w:w="120"/>
+              <w:bottom w:type="dxa" w:w="60"/>
+              <w:right w:type="dxa" w:w="120"/>
+            </w:tcMar>
+            <w:vAlign w:val="center"/>
+          </w:tcPr>
+          <w:p>
+            <w:r>
+              <w:rPr>
+                <w:rFonts w:ascii="Tahoma" w:cs="Tahoma" w:eastAsia="Tahoma" w:hAnsi="Tahoma"/>
+                <w:color w:val="222222"/>
+                <w:sz w:val="18"/>
+                <w:szCs w:val="18"/>
+              </w:rPr>
+              <w:t xml:space="preserve">Senior HSE Manager</w:t>
+            </w:r>
+          </w:p>
+        </w:tc>
+        <w:tc>
+          <w:tcPr>
+            <w:tcW w:type="dxa" w:w="3360"/>
+            <w:tcBorders>
+              <w:top w:val="single" w:color="BFB3AA" w:sz="4"/>
+              <w:left w:val="single" w:color="BFB3AA" w:sz="4"/>
+              <w:bottom w:val="single" w:color="BFB3AA" w:sz="4"/>
+              <w:right w:val="single" w:color="BFB3AA" w:sz="4"/>
+            </w:tcBorders>
+            <w:tcMar>
+              <w:top w:type="dxa" w:w="60"/>
+              <w:left w:type="dxa" w:w="120"/>
+              <w:bottom w:type="dxa" w:w="60"/>
+              <w:right w:type="dxa" w:w="120"/>
+            </w:tcMar>
+            <w:vAlign w:val="center"/>
+          </w:tcPr>
+          <w:p>
+            <w:r>
+              <w:rPr>
+                <w:rFonts w:ascii="Tahoma" w:cs="Tahoma" w:eastAsia="Tahoma" w:hAnsi="Tahoma"/>
+                <w:color w:val="222222"/>
+                <w:sz w:val="18"/>
+                <w:szCs w:val="18"/>
+              </w:rPr>
+              <w:t xml:space="preserve">BSc / equivalent; NEBOSH Diploma or equivalent</w:t>
+            </w:r>
+          </w:p>
+        </w:tc>
+        <w:tc>
+          <w:tcPr>
+            <w:tcW w:type="dxa" w:w="1800"/>
+            <w:tcBorders>
+              <w:top w:val="single" w:color="BFB3AA" w:sz="4"/>
+              <w:left w:val="single" w:color="BFB3AA" w:sz="4"/>
+              <w:bottom w:val="single" w:color="BFB3AA" w:sz="4"/>
+              <w:right w:val="single" w:color="BFB3AA" w:sz="4"/>
+            </w:tcBorders>
+            <w:tcMar>
+              <w:top w:type="dxa" w:w="60"/>
+              <w:left w:type="dxa" w:w="120"/>
+              <w:bottom w:type="dxa" w:w="60"/>
+              <w:right w:type="dxa" w:w="120"/>
+            </w:tcMar>
+            <w:vAlign w:val="center"/>
+          </w:tcPr>
+          <w:p>
+            <w:r>
+              <w:rPr>
+                <w:rFonts w:ascii="Tahoma" w:cs="Tahoma" w:eastAsia="Tahoma" w:hAnsi="Tahoma"/>
+                <w:color w:val="222222"/>
+                <w:sz w:val="18"/>
+                <w:szCs w:val="18"/>
+              </w:rPr>
+              <w:t xml:space="preserve">Essential</w:t>
+            </w:r>
+          </w:p>
+        </w:tc>
+        <w:tc>
+          <w:tcPr>
+            <w:tcW w:type="dxa" w:w="1800"/>
+            <w:tcBorders>
+              <w:top w:val="single" w:color="BFB3AA" w:sz="4"/>
+              <w:left w:val="single" w:color="BFB3AA" w:sz="4"/>
+              <w:bottom w:val="single" w:color="BFB3AA" w:sz="4"/>
+              <w:right w:val="single" w:color="BFB3AA" w:sz="4"/>
+            </w:tcBorders>
+            <w:tcMar>
+              <w:top w:type="dxa" w:w="60"/>
+              <w:left w:type="dxa" w:w="120"/>
+              <w:bottom w:type="dxa" w:w="60"/>
+              <w:right w:type="dxa" w:w="120"/>
+            </w:tcMar>
+            <w:vAlign w:val="center"/>
+          </w:tcPr>
+          <w:p>
+            <w:r>
+              <w:rPr>
+                <w:rFonts w:ascii="Tahoma" w:cs="Tahoma" w:eastAsia="Tahoma" w:hAnsi="Tahoma"/>
+                <w:color w:val="222222"/>
+                <w:sz w:val="18"/>
+                <w:szCs w:val="18"/>
+              </w:rPr>
+              <w:t xml:space="preserve">10–15 (5+ at Manager)</w:t>
+            </w:r>
+          </w:p>
+        </w:tc>
+      </w:tr>
+      <w:tr>
+        <w:tc>
+          <w:tcPr>
+            <w:tcW w:type="dxa" w:w="2400"/>
+            <w:tcBorders>
+              <w:top w:val="single" w:color="BFB3AA" w:sz="4"/>
+              <w:left w:val="single" w:color="BFB3AA" w:sz="4"/>
+              <w:bottom w:val="single" w:color="BFB3AA" w:sz="4"/>
+              <w:right w:val="single" w:color="BFB3AA" w:sz="4"/>
+            </w:tcBorders>
+            <w:tcMar>
+              <w:top w:type="dxa" w:w="60"/>
+              <w:left w:type="dxa" w:w="120"/>
+              <w:bottom w:type="dxa" w:w="60"/>
+              <w:right w:type="dxa" w:w="120"/>
+            </w:tcMar>
+            <w:vAlign w:val="center"/>
+          </w:tcPr>
+          <w:p>
+            <w:r>
+              <w:rPr>
+                <w:rFonts w:ascii="Tahoma" w:cs="Tahoma" w:eastAsia="Tahoma" w:hAnsi="Tahoma"/>
+                <w:color w:val="222222"/>
+                <w:sz w:val="18"/>
+                <w:szCs w:val="18"/>
+              </w:rPr>
+              <w:t xml:space="preserve">HSE Manager</w:t>
+            </w:r>
+          </w:p>
+        </w:tc>
+        <w:tc>
+          <w:tcPr>
+            <w:tcW w:type="dxa" w:w="3360"/>
+            <w:tcBorders>
+              <w:top w:val="single" w:color="BFB3AA" w:sz="4"/>
+              <w:left w:val="single" w:color="BFB3AA" w:sz="4"/>
+              <w:bottom w:val="single" w:color="BFB3AA" w:sz="4"/>
+              <w:right w:val="single" w:color="BFB3AA" w:sz="4"/>
+            </w:tcBorders>
+            <w:tcMar>
+              <w:top w:type="dxa" w:w="60"/>
+              <w:left w:type="dxa" w:w="120"/>
+              <w:bottom w:type="dxa" w:w="60"/>
+              <w:right w:type="dxa" w:w="120"/>
+            </w:tcMar>
+            <w:vAlign w:val="center"/>
+          </w:tcPr>
+          <w:p>
+            <w:r>
+              <w:rPr>
+                <w:rFonts w:ascii="Tahoma" w:cs="Tahoma" w:eastAsia="Tahoma" w:hAnsi="Tahoma"/>
+                <w:color w:val="222222"/>
+                <w:sz w:val="18"/>
+                <w:szCs w:val="18"/>
+              </w:rPr>
+              <w:t xml:space="preserve">NEBOSH IGC + Construction certificate</w:t>
+            </w:r>
+          </w:p>
+        </w:tc>
+        <w:tc>
+          <w:tcPr>
+            <w:tcW w:type="dxa" w:w="1800"/>
+            <w:tcBorders>
+              <w:top w:val="single" w:color="BFB3AA" w:sz="4"/>
+              <w:left w:val="single" w:color="BFB3AA" w:sz="4"/>
+              <w:bottom w:val="single" w:color="BFB3AA" w:sz="4"/>
+              <w:right w:val="single" w:color="BFB3AA" w:sz="4"/>
+            </w:tcBorders>
+            <w:tcMar>
+              <w:top w:type="dxa" w:w="60"/>
+              <w:left w:type="dxa" w:w="120"/>
+              <w:bottom w:type="dxa" w:w="60"/>
+              <w:right w:type="dxa" w:w="120"/>
+            </w:tcMar>
+            <w:vAlign w:val="center"/>
+          </w:tcPr>
+          <w:p>
+            <w:r>
+              <w:rPr>
+                <w:rFonts w:ascii="Tahoma" w:cs="Tahoma" w:eastAsia="Tahoma" w:hAnsi="Tahoma"/>
+                <w:color w:val="222222"/>
+                <w:sz w:val="18"/>
+                <w:szCs w:val="18"/>
+              </w:rPr>
+              <w:t xml:space="preserve">Preferred</w:t>
+            </w:r>
+          </w:p>
+        </w:tc>
+        <w:tc>
+          <w:tcPr>
+            <w:tcW w:type="dxa" w:w="1800"/>
+            <w:tcBorders>
+              <w:top w:val="single" w:color="BFB3AA" w:sz="4"/>
+              <w:left w:val="single" w:color="BFB3AA" w:sz="4"/>
+              <w:bottom w:val="single" w:color="BFB3AA" w:sz="4"/>
+              <w:right w:val="single" w:color="BFB3AA" w:sz="4"/>
+            </w:tcBorders>
+            <w:tcMar>
+              <w:top w:type="dxa" w:w="60"/>
+              <w:left w:type="dxa" w:w="120"/>
+              <w:bottom w:type="dxa" w:w="60"/>
+              <w:right w:type="dxa" w:w="120"/>
+            </w:tcMar>
+            <w:vAlign w:val="center"/>
+          </w:tcPr>
+          <w:p>
+            <w:r>
+              <w:rPr>
+                <w:rFonts w:ascii="Tahoma" w:cs="Tahoma" w:eastAsia="Tahoma" w:hAnsi="Tahoma"/>
+                <w:color w:val="222222"/>
+                <w:sz w:val="18"/>
+                <w:szCs w:val="18"/>
+              </w:rPr>
+              <w:t xml:space="preserve">8–10</w:t>
+            </w:r>
+          </w:p>
+        </w:tc>
+      </w:tr>
+      <w:tr>
+        <w:tc>
+          <w:tcPr>
+            <w:tcW w:type="dxa" w:w="2400"/>
+            <w:tcBorders>
+              <w:top w:val="single" w:color="BFB3AA" w:sz="4"/>
+              <w:left w:val="single" w:color="BFB3AA" w:sz="4"/>
+              <w:bottom w:val="single" w:color="BFB3AA" w:sz="4"/>
+              <w:right w:val="single" w:color="BFB3AA" w:sz="4"/>
+            </w:tcBorders>
+            <w:tcMar>
+              <w:top w:type="dxa" w:w="60"/>
+              <w:left w:type="dxa" w:w="120"/>
+              <w:bottom w:type="dxa" w:w="60"/>
+              <w:right w:type="dxa" w:w="120"/>
+            </w:tcMar>
+            <w:vAlign w:val="center"/>
+          </w:tcPr>
+          <w:p>
+            <w:r>
+              <w:rPr>
+                <w:rFonts w:ascii="Tahoma" w:cs="Tahoma" w:eastAsia="Tahoma" w:hAnsi="Tahoma"/>
+                <w:color w:val="222222"/>
+                <w:sz w:val="18"/>
+                <w:szCs w:val="18"/>
+              </w:rPr>
+              <w:t xml:space="preserve">HSE Engineer / Supervisor</w:t>
+            </w:r>
+          </w:p>
+        </w:tc>
+        <w:tc>
+          <w:tcPr>
+            <w:tcW w:type="dxa" w:w="3360"/>
+            <w:tcBorders>
+              <w:top w:val="single" w:color="BFB3AA" w:sz="4"/>
+              <w:left w:val="single" w:color="BFB3AA" w:sz="4"/>
+              <w:bottom w:val="single" w:color="BFB3AA" w:sz="4"/>
+              <w:right w:val="single" w:color="BFB3AA" w:sz="4"/>
+            </w:tcBorders>
+            <w:tcMar>
+              <w:top w:type="dxa" w:w="60"/>
+              <w:left w:type="dxa" w:w="120"/>
+              <w:bottom w:type="dxa" w:w="60"/>
+              <w:right w:type="dxa" w:w="120"/>
+            </w:tcMar>
+            <w:vAlign w:val="center"/>
+          </w:tcPr>
+          <w:p>
+            <w:r>
+              <w:rPr>
+                <w:rFonts w:ascii="Tahoma" w:cs="Tahoma" w:eastAsia="Tahoma" w:hAnsi="Tahoma"/>
+                <w:color w:val="222222"/>
+                <w:sz w:val="18"/>
+                <w:szCs w:val="18"/>
+              </w:rPr>
+              <w:t xml:space="preserve">NEBOSH IGC or equivalent</w:t>
+            </w:r>
+          </w:p>
+        </w:tc>
+        <w:tc>
+          <w:tcPr>
+            <w:tcW w:type="dxa" w:w="1800"/>
+            <w:tcBorders>
+              <w:top w:val="single" w:color="BFB3AA" w:sz="4"/>
+              <w:left w:val="single" w:color="BFB3AA" w:sz="4"/>
+              <w:bottom w:val="single" w:color="BFB3AA" w:sz="4"/>
+              <w:right w:val="single" w:color="BFB3AA" w:sz="4"/>
+            </w:tcBorders>
+            <w:tcMar>
+              <w:top w:type="dxa" w:w="60"/>
+              <w:left w:type="dxa" w:w="120"/>
+              <w:bottom w:type="dxa" w:w="60"/>
+              <w:right w:type="dxa" w:w="120"/>
+            </w:tcMar>
+            <w:vAlign w:val="center"/>
+          </w:tcPr>
+          <w:p>
+            <w:r>
+              <w:rPr>
+                <w:rFonts w:ascii="Tahoma" w:cs="Tahoma" w:eastAsia="Tahoma" w:hAnsi="Tahoma"/>
+                <w:color w:val="222222"/>
+                <w:sz w:val="18"/>
+                <w:szCs w:val="18"/>
+              </w:rPr>
+              <w:t xml:space="preserve">Optional</w:t>
+            </w:r>
+          </w:p>
+        </w:tc>
+        <w:tc>
+          <w:tcPr>
+            <w:tcW w:type="dxa" w:w="1800"/>
+            <w:tcBorders>
+              <w:top w:val="single" w:color="BFB3AA" w:sz="4"/>
+              <w:left w:val="single" w:color="BFB3AA" w:sz="4"/>
+              <w:bottom w:val="single" w:color="BFB3AA" w:sz="4"/>
+              <w:right w:val="single" w:color="BFB3AA" w:sz="4"/>
+            </w:tcBorders>
+            <w:tcMar>
+              <w:top w:type="dxa" w:w="60"/>
+              <w:left w:type="dxa" w:w="120"/>
+              <w:bottom w:type="dxa" w:w="60"/>
+              <w:right w:type="dxa" w:w="120"/>
+            </w:tcMar>
+            <w:vAlign w:val="center"/>
+          </w:tcPr>
+          <w:p>
+            <w:r>
+              <w:rPr>
+                <w:rFonts w:ascii="Tahoma" w:cs="Tahoma" w:eastAsia="Tahoma" w:hAnsi="Tahoma"/>
+                <w:color w:val="222222"/>
+                <w:sz w:val="18"/>
+                <w:szCs w:val="18"/>
+              </w:rPr>
+              <w:t xml:space="preserve">5–8</w:t>
+            </w:r>
+          </w:p>
+        </w:tc>
+      </w:tr>
+      <w:tr>
+        <w:tc>
+          <w:tcPr>
+            <w:tcW w:type="dxa" w:w="2400"/>
+            <w:tcBorders>
+              <w:top w:val="single" w:color="BFB3AA" w:sz="4"/>
+              <w:left w:val="single" w:color="BFB3AA" w:sz="4"/>
+              <w:bottom w:val="single" w:color="BFB3AA" w:sz="4"/>
+              <w:right w:val="single" w:color="BFB3AA" w:sz="4"/>
+            </w:tcBorders>
+            <w:tcMar>
+              <w:top w:type="dxa" w:w="60"/>
+              <w:left w:type="dxa" w:w="120"/>
+              <w:bottom w:type="dxa" w:w="60"/>
+              <w:right w:type="dxa" w:w="120"/>
+            </w:tcMar>
+            <w:vAlign w:val="center"/>
+          </w:tcPr>
+          <w:p>
+            <w:r>
+              <w:rPr>
+                <w:rFonts w:ascii="Tahoma" w:cs="Tahoma" w:eastAsia="Tahoma" w:hAnsi="Tahoma"/>
+                <w:color w:val="222222"/>
+                <w:sz w:val="18"/>
+                <w:szCs w:val="18"/>
+              </w:rPr>
+              <w:t xml:space="preserve">HSE Officer</w:t>
+            </w:r>
+          </w:p>
+        </w:tc>
+        <w:tc>
+          <w:tcPr>
+            <w:tcW w:type="dxa" w:w="3360"/>
+            <w:tcBorders>
+              <w:top w:val="single" w:color="BFB3AA" w:sz="4"/>
+              <w:left w:val="single" w:color="BFB3AA" w:sz="4"/>
+              <w:bottom w:val="single" w:color="BFB3AA" w:sz="4"/>
+              <w:right w:val="single" w:color="BFB3AA" w:sz="4"/>
+            </w:tcBorders>
+            <w:tcMar>
+              <w:top w:type="dxa" w:w="60"/>
+              <w:left w:type="dxa" w:w="120"/>
+              <w:bottom w:type="dxa" w:w="60"/>
+              <w:right w:type="dxa" w:w="120"/>
+            </w:tcMar>
+            <w:vAlign w:val="center"/>
+          </w:tcPr>
+          <w:p>
+            <w:r>
+              <w:rPr>
+                <w:rFonts w:ascii="Tahoma" w:cs="Tahoma" w:eastAsia="Tahoma" w:hAnsi="Tahoma"/>
+                <w:color w:val="222222"/>
+                <w:sz w:val="18"/>
+                <w:szCs w:val="18"/>
+              </w:rPr>
+              <w:t xml:space="preserve">NEBOSH IGC or equivalent (preferred)</w:t>
+            </w:r>
+          </w:p>
+        </w:tc>
+        <w:tc>
+          <w:tcPr>
+            <w:tcW w:type="dxa" w:w="1800"/>
+            <w:tcBorders>
+              <w:top w:val="single" w:color="BFB3AA" w:sz="4"/>
+              <w:left w:val="single" w:color="BFB3AA" w:sz="4"/>
+              <w:bottom w:val="single" w:color="BFB3AA" w:sz="4"/>
+              <w:right w:val="single" w:color="BFB3AA" w:sz="4"/>
+            </w:tcBorders>
+            <w:tcMar>
+              <w:top w:type="dxa" w:w="60"/>
+              <w:left w:type="dxa" w:w="120"/>
+              <w:bottom w:type="dxa" w:w="60"/>
+              <w:right w:type="dxa" w:w="120"/>
+            </w:tcMar>
+            <w:vAlign w:val="center"/>
+          </w:tcPr>
+          <w:p>
+            <w:r>
+              <w:rPr>
+                <w:rFonts w:ascii="Tahoma" w:cs="Tahoma" w:eastAsia="Tahoma" w:hAnsi="Tahoma"/>
+                <w:color w:val="222222"/>
+                <w:sz w:val="18"/>
+                <w:szCs w:val="18"/>
+              </w:rPr>
+              <w:t xml:space="preserve">Optional</w:t>
+            </w:r>
+          </w:p>
+        </w:tc>
+        <w:tc>
+          <w:tcPr>
+            <w:tcW w:type="dxa" w:w="1800"/>
+            <w:tcBorders>
+              <w:top w:val="single" w:color="BFB3AA" w:sz="4"/>
+              <w:left w:val="single" w:color="BFB3AA" w:sz="4"/>
+              <w:bottom w:val="single" w:color="BFB3AA" w:sz="4"/>
+              <w:right w:val="single" w:color="BFB3AA" w:sz="4"/>
+            </w:tcBorders>
+            <w:tcMar>
+              <w:top w:type="dxa" w:w="60"/>
+              <w:left w:type="dxa" w:w="120"/>
+              <w:bottom w:type="dxa" w:w="60"/>
+              <w:right w:type="dxa" w:w="120"/>
+            </w:tcMar>
+            <w:vAlign w:val="center"/>
+          </w:tcPr>
+          <w:p>
+            <w:r>
+              <w:rPr>
+                <w:rFonts w:ascii="Tahoma" w:cs="Tahoma" w:eastAsia="Tahoma" w:hAnsi="Tahoma"/>
+                <w:color w:val="222222"/>
+                <w:sz w:val="18"/>
+                <w:szCs w:val="18"/>
+              </w:rPr>
+              <w:t xml:space="preserve">2–5</w:t>
+            </w:r>
+          </w:p>
+        </w:tc>
+      </w:tr>
+    </w:tbl>
+    <w:p>
+      <w:pPr>
+        <w:spacing w:after="120" w:line="276"/>
+        <w:jc w:val="both"/>
+      </w:pPr>
+      <w:r>
+        <w:rPr>
+          <w:rFonts w:ascii="Tahoma" w:cs="Tahoma" w:eastAsia="Tahoma" w:hAnsi="Tahoma"/>
+          <w:sz w:val="20"/>
+          <w:szCs w:val="20"/>
+        </w:rPr>
+        <w:t xml:space="preserve">Any change to HSE key personnel shall be notified in writing to DAN / the PMC within 48 hours.</w:t>
       </w:r>
     </w:p>
     <w:p>
@@ -5918,7 +9360,7 @@
           <w:sz w:val="20"/>
           <w:szCs w:val="20"/>
         </w:rPr>
-        <w:t xml:space="preserve">The HSE Management System is supported by documented information comprising the Manual, procedures, plans, forms, registers and records. Documented information is identified and described (title, date, reference, revision), reviewed and approved before issue, and controlled so that it is available and suitable for use, protected, distributed to the relevant functions, version-controlled, retained for defined periods, and that documents of external origin are identified and controlled, through DAN's document-control arrangements (e.g. the project document-control platform).</w:t>
+        <w:t xml:space="preserve">The HSE Management System is supported by documented information comprising the Manual, procedures, plans, forms, registers and records. Documented information is identified and described (title, date, reference, revision), reviewed and approved before issue, and controlled so that it is available and suitable for use, protected, distributed to the relevant functions, version-controlled, retained for defined periods, and that documents of external origin are identified and controlled, through DAN's document-control arrangements.</w:t>
       </w:r>
     </w:p>
     <w:p>
@@ -7041,7 +10483,7 @@
           <w:sz w:val="20"/>
           <w:szCs w:val="20"/>
         </w:rPr>
-        <w:t xml:space="preserve">DAN plans and conducts periodic internal audits to provide assurance and drive improvement, verifying that the approved plans and procedures are implemented and that the system conforms to DAN's requirements and to ISO 45001/14001 and applicable legal requirements. Auditors are trained, competent and independent of the area audited; an audit programme defines the frequency, methods, responsibilities, scope and reporting, and results are reported to relevant management with corrective actions tracked to closure.</w:t>
+        <w:t xml:space="preserve">DAN plans and conducts periodic internal audits to provide assurance and drive improvement, verifying that the approved plans and procedures are implemented and that the system conforms to DAN's requirements and applicable legal requirements. Auditors are trained, competent and independent of the area audited; an audit programme defines the frequency, methods, responsibilities, scope and reporting, and results are reported to relevant management with corrective actions tracked to closure.</w:t>
       </w:r>
     </w:p>
     <w:p>
@@ -7202,7 +10644,7 @@
           <w:sz w:val="20"/>
           <w:szCs w:val="20"/>
         </w:rPr>
-        <w:t xml:space="preserve">ISO 45001:2018 — Occupational Health and Safety Management Systems; ISO 14001:2015 — Environmental Management Systems</w:t>
+        <w:t xml:space="preserve">KSA Labor Law (Royal Decree M/51 and amendments) and HRSD Occupational Health &amp; Safety regulations; Civil Defence requirements; Saudi Building Code (SBC) and Saudi Fire Code (SBC 801); GOSI; SASO standards</w:t>
       </w:r>
     </w:p>
     <w:p>
@@ -7221,7 +10663,7 @@
           <w:sz w:val="20"/>
           <w:szCs w:val="20"/>
         </w:rPr>
-        <w:t xml:space="preserve">KSA Labor Law (Royal Decree M/51 and amendments) and HRSD Occupational Health &amp; Safety regulations; Civil Defence requirements; Saudi Building Code (SBC) and Saudi Fire Code (SBC 801); GOSI; SASO standards</w:t>
+        <w:t xml:space="preserve">Applicable KSA environmental regulations and the recognised high-level frameworks for occupational health &amp; safety and environmental management</w:t>
       </w:r>
     </w:p>
     <w:p>

</xml_diff>